<commit_message>
Cr 4.4 Stockage du code fait
</commit_message>
<xml_diff>
--- a/Mini_projet/CR_youssef/Rapport_FPGA.docx
+++ b/Mini_projet/CR_youssef/Rapport_FPGA.docx
@@ -929,7 +929,15 @@
     </w:p>
     <w:p>
       <w:r>
-        <w:t>Je tiens tout d’abord à remercier chaleureusement Monsieur François Pecheux, Monsieur Yan Douze ainsi que Monsieur David Martin, qui nous ont encadrés tout au long du semestre 5. Leur accompagnement, leurs conseils et leurs enseignements nous ont permis de mener à bien ce projet, tout en nous apportant le socle de connaissances nécessaires en électronique numérique.</w:t>
+        <w:t xml:space="preserve">Je tiens tout d’abord à remercier chaleureusement Monsieur François </w:t>
+      </w:r>
+      <w:proofErr w:type="spellStart"/>
+      <w:r>
+        <w:t>Pecheux</w:t>
+      </w:r>
+      <w:proofErr w:type="spellEnd"/>
+      <w:r>
+        <w:t>, Monsieur Yan Douze ainsi que Monsieur David Martin, qui nous ont encadrés tout au long du semestre 5. Leur accompagnement, leurs conseils et leurs enseignements nous ont permis de mener à bien ce projet, tout en nous apportant le socle de connaissances nécessaires en électronique numérique.</w:t>
       </w:r>
       <w:r>
         <w:t xml:space="preserve"> </w:t>
@@ -1247,7 +1255,23 @@
     </w:p>
     <w:p>
       <w:r>
-        <w:t>La méthode de projet adoptée a consisté à organiser clairement les fichiers afin d’éviter toute confusion. Pour cela, j’ai créé deux dossiers : un dossier Modelsim, regroupant toute la partie relative à la modélisation et à la simulation du code VHDL, et un dossier Quartus Prime, permettant l’upload du code fonctionnel sur la carte DE10-Lite ainsi que sa synthèse sur le FPGA. Par ailleurs, afin de conserver une trace complète de l’évolution du projet, j’ai créé un dépôt GitHub, permettant de suivre l’historique des modifications et de gérer efficacement les différentes versions du projet.</w:t>
+        <w:t xml:space="preserve">La méthode de projet adoptée a consisté à organiser clairement les fichiers afin d’éviter toute confusion. Pour cela, j’ai créé deux dossiers : un dossier </w:t>
+      </w:r>
+      <w:proofErr w:type="spellStart"/>
+      <w:r>
+        <w:t>Modelsim</w:t>
+      </w:r>
+      <w:proofErr w:type="spellEnd"/>
+      <w:r>
+        <w:t>, regroupant toute la partie relative à la modélisation et à la simulation du code VHDL, et un dossier Quartus Prime, permettant l’</w:t>
+      </w:r>
+      <w:proofErr w:type="spellStart"/>
+      <w:r>
+        <w:t>upload</w:t>
+      </w:r>
+      <w:proofErr w:type="spellEnd"/>
+      <w:r>
+        <w:t xml:space="preserve"> du code fonctionnel sur la carte DE10-Lite ainsi que sa synthèse sur le FPGA. Par ailleurs, afin de conserver une trace complète de l’évolution du projet, j’ai créé un dépôt GitHub, permettant de suivre l’historique des modifications et de gérer efficacement les différentes versions du projet.</w:t>
       </w:r>
     </w:p>
     <w:p>
@@ -1262,7 +1286,15 @@
     </w:p>
     <w:p>
       <w:r>
-        <w:t>Dans la partie 4.1 du TP, il nous a été demandé de concevoir un détecteur de front montant. Dans un premier temps, cette implémentation fonctionnait correctement en simulation sous ModelSim. Cependant, lors des tests pratiques sur la carte DE10-Lite, un comportement inattendu a été observé : le système ne validait pas la saisie lors de l’appui sur le bouton poussoir, mais uniquement lors de son relâchement.</w:t>
+        <w:t xml:space="preserve">Dans la partie 4.1 du TP, il nous a été demandé de concevoir un détecteur de front montant. Dans un premier temps, cette implémentation fonctionnait correctement en simulation sous </w:t>
+      </w:r>
+      <w:proofErr w:type="spellStart"/>
+      <w:r>
+        <w:t>ModelSim</w:t>
+      </w:r>
+      <w:proofErr w:type="spellEnd"/>
+      <w:r>
+        <w:t>. Cependant, lors des tests pratiques sur la carte DE10-Lite, un comportement inattendu a été observé : le système ne validait pas la saisie lors de l’appui sur le bouton poussoir, mais uniquement lors de son relâchement.</w:t>
       </w:r>
     </w:p>
     <w:p>
@@ -1278,17 +1310,73 @@
     <w:p>
       <w:r>
         <w:lastRenderedPageBreak/>
-        <w:t>Détection du front descendant : le signal Detectar passe à ‘1’ uniquement lorsque KEY0 effectue une transition de ‘1’ vers ‘0’.</w:t>
+        <w:t xml:space="preserve">Détection du front descendant : le signal </w:t>
+      </w:r>
+      <w:proofErr w:type="spellStart"/>
+      <w:r>
+        <w:t>Detectar</w:t>
+      </w:r>
+      <w:proofErr w:type="spellEnd"/>
+      <w:r>
+        <w:t xml:space="preserve"> passe à ‘1’ uniquement lorsque KEY0 effectue une transition de ‘1’ vers ‘0’.</w:t>
       </w:r>
     </w:p>
     <w:p>
       <w:r>
-        <w:t>Comportement séquentiel : Detectar ne change pas d’état instantanément lors de la transition de KEY0, mais uniquement au front montant de l’horloge (clk) suivant, ce qui correspond au comportement attendu d’un circuit synchrone utilisant rising_edge(clk).</w:t>
+        <w:t xml:space="preserve">Comportement séquentiel : </w:t>
+      </w:r>
+      <w:proofErr w:type="spellStart"/>
+      <w:r>
+        <w:t>Detectar</w:t>
+      </w:r>
+      <w:proofErr w:type="spellEnd"/>
+      <w:r>
+        <w:t xml:space="preserve"> ne change pas d’état instantanément lors de la transition de KEY0, mais uniquement au front montant de l’horloge (</w:t>
+      </w:r>
+      <w:proofErr w:type="spellStart"/>
+      <w:r>
+        <w:t>clk</w:t>
+      </w:r>
+      <w:proofErr w:type="spellEnd"/>
+      <w:r>
+        <w:t xml:space="preserve">) suivant, ce qui correspond au comportement attendu d’un circuit synchrone utilisant </w:t>
+      </w:r>
+      <w:proofErr w:type="spellStart"/>
+      <w:r>
+        <w:t>rising_edge</w:t>
+      </w:r>
+      <w:proofErr w:type="spellEnd"/>
+      <w:r>
+        <w:t>(</w:t>
+      </w:r>
+      <w:proofErr w:type="spellStart"/>
+      <w:r>
+        <w:t>clk</w:t>
+      </w:r>
+      <w:proofErr w:type="spellEnd"/>
+      <w:r>
+        <w:t>).</w:t>
       </w:r>
     </w:p>
     <w:p>
       <w:r>
-        <w:t>Durée de l’impulsion : l’impulsion sur Detectar dure exactement une période d’horloge (10 ps), puis revient à ‘0’ car la condition de détection n’est plus satisfaite au cyc</w:t>
+        <w:t xml:space="preserve">Durée de l’impulsion : l’impulsion sur </w:t>
+      </w:r>
+      <w:proofErr w:type="spellStart"/>
+      <w:r>
+        <w:t>Detectar</w:t>
+      </w:r>
+      <w:proofErr w:type="spellEnd"/>
+      <w:r>
+        <w:t xml:space="preserve"> dure exactement une période d’horloge (10 </w:t>
+      </w:r>
+      <w:proofErr w:type="spellStart"/>
+      <w:r>
+        <w:t>ps</w:t>
+      </w:r>
+      <w:proofErr w:type="spellEnd"/>
+      <w:r>
+        <w:t>), puis revient à ‘0’ car la condition de détection n’est plus satisfaite au cyc</w:t>
       </w:r>
       <w:r>
         <w:t>l</w:t>
@@ -1299,7 +1387,15 @@
     </w:p>
     <w:p>
       <w:r>
-        <w:t>Initialisation (Reset) : au début de la simulation, lorsque rst_n est à ‘0’, tous les signaux sont correctement initialisés, évitant ainsi l’apparition de valeurs indéfinies.</w:t>
+        <w:t xml:space="preserve">Initialisation (Reset) : au début de la simulation, lorsque </w:t>
+      </w:r>
+      <w:proofErr w:type="spellStart"/>
+      <w:r>
+        <w:t>rst_n</w:t>
+      </w:r>
+      <w:proofErr w:type="spellEnd"/>
+      <w:r>
+        <w:t xml:space="preserve"> est à ‘0’, tous les signaux sont correctement initialisés, évitant ainsi l’apparition de valeurs indéfinies.</w:t>
       </w:r>
     </w:p>
     <w:p>
@@ -1309,12 +1405,60 @@
     </w:p>
     <w:p>
       <w:r>
-        <w:t>Premier front descendant : KEY0 passe à ‘0’ vers 35 ps ; au front d’horloge suivant, à 45 ps, le signal Detectar passe à ‘1’.</w:t>
+        <w:t xml:space="preserve">Premier front descendant : KEY0 passe à ‘0’ vers 35 </w:t>
+      </w:r>
+      <w:proofErr w:type="spellStart"/>
+      <w:r>
+        <w:t>ps</w:t>
+      </w:r>
+      <w:proofErr w:type="spellEnd"/>
+      <w:r>
+        <w:t xml:space="preserve"> ; au front d’horloge suivant, à 45 </w:t>
+      </w:r>
+      <w:proofErr w:type="spellStart"/>
+      <w:r>
+        <w:t>ps</w:t>
+      </w:r>
+      <w:proofErr w:type="spellEnd"/>
+      <w:r>
+        <w:t xml:space="preserve">, le signal </w:t>
+      </w:r>
+      <w:proofErr w:type="spellStart"/>
+      <w:r>
+        <w:t>Detectar</w:t>
+      </w:r>
+      <w:proofErr w:type="spellEnd"/>
+      <w:r>
+        <w:t xml:space="preserve"> passe à ‘1’.</w:t>
       </w:r>
     </w:p>
     <w:p>
       <w:r>
-        <w:t>Second front descendant : KEY0 passe à ‘0’ vers 75 ps ; au front d’horloge de 85 ps, Detectar est de nouveau activé.</w:t>
+        <w:t xml:space="preserve">Second front descendant : KEY0 passe à ‘0’ vers 75 </w:t>
+      </w:r>
+      <w:proofErr w:type="spellStart"/>
+      <w:r>
+        <w:t>ps</w:t>
+      </w:r>
+      <w:proofErr w:type="spellEnd"/>
+      <w:r>
+        <w:t xml:space="preserve"> ; au front d’horloge de 85 </w:t>
+      </w:r>
+      <w:proofErr w:type="spellStart"/>
+      <w:r>
+        <w:t>ps</w:t>
+      </w:r>
+      <w:proofErr w:type="spellEnd"/>
+      <w:r>
+        <w:t xml:space="preserve">, </w:t>
+      </w:r>
+      <w:proofErr w:type="spellStart"/>
+      <w:r>
+        <w:t>Detectar</w:t>
+      </w:r>
+      <w:proofErr w:type="spellEnd"/>
+      <w:r>
+        <w:t xml:space="preserve"> est de nouveau activé.</w:t>
       </w:r>
     </w:p>
     <w:p>
@@ -1437,12 +1581,68 @@
     </w:p>
     <w:p>
       <w:r>
-        <w:t>L’observation du chronogramme issu de la simulation permet de valider le bon fonctionnement de la bascule D. Durant la phase de reset, comprise entre 0 et 15 ps, le signal rst_n est maintenu à ‘0’, ce qui force la sortie Q à l’état bas indépendamment de l’horloge et des variations du signal D. Lorsque rst_n repasse à ‘1’, la bascule reprend un fonctionnement normal. Entre 15 et 25 ps, bien que D passe à ‘1’, la sortie Q reste inchangée car le signal enable est à ‘0’. Par la suite, lorsque enable devient actif, la valeur de D est prise en compte au front montant de l’horloge suivant, ce qui provoque le passage de Q à ‘1’. Une nouvelle variation de D à ‘0’ est ensuite correctement répercutée sur la sortie au front d’horloge suivant, tant que enable reste actif. Enfin, lorsque enable repasse à ‘0’, la sortie Q conserve sa valeur, confirmant le bon comportement de mémorisation de la bascule.</w:t>
+        <w:t xml:space="preserve">L’observation du chronogramme issu de la simulation permet de valider le bon fonctionnement de la bascule D. Durant la phase de reset, comprise entre 0 et 15 </w:t>
+      </w:r>
+      <w:proofErr w:type="spellStart"/>
+      <w:r>
+        <w:t>ps</w:t>
+      </w:r>
+      <w:proofErr w:type="spellEnd"/>
+      <w:r>
+        <w:t xml:space="preserve">, le signal </w:t>
+      </w:r>
+      <w:proofErr w:type="spellStart"/>
+      <w:r>
+        <w:t>rst_n</w:t>
+      </w:r>
+      <w:proofErr w:type="spellEnd"/>
+      <w:r>
+        <w:t xml:space="preserve"> est maintenu à ‘0’, ce qui force la sortie Q à l’état bas indépendamment de l’horloge et des variations du signal D. Lorsque </w:t>
+      </w:r>
+      <w:proofErr w:type="spellStart"/>
+      <w:r>
+        <w:t>rst_n</w:t>
+      </w:r>
+      <w:proofErr w:type="spellEnd"/>
+      <w:r>
+        <w:t xml:space="preserve"> repasse à ‘1’, la bascule reprend un fonctionnement normal. Entre 15 et 25 </w:t>
+      </w:r>
+      <w:proofErr w:type="spellStart"/>
+      <w:r>
+        <w:t>ps</w:t>
+      </w:r>
+      <w:proofErr w:type="spellEnd"/>
+      <w:r>
+        <w:t>, bien que D passe à ‘1’, la sortie Q reste inchangée car le signal enable est à ‘0’. Par la suite, lorsque enable devient actif, la valeur de D est prise en compte au front montant de l’horloge suivant, ce qui provoque le passage de Q à ‘1’. Une nouvelle variation de D à ‘0’ est ensuite correctement répercutée sur la sortie au front d’horloge suivant, tant que enable reste actif. Enfin, lorsque enable repasse à ‘0’, la sortie Q conserve sa valeur, confirmant le bon comportement de mémorisation de la bascule.</w:t>
       </w:r>
     </w:p>
     <w:p>
       <w:r>
-        <w:t>Le code VHDL développé respecte les règles de conception d’une bascule D synchrone avec remise à zéro asynchrone. La priorité donnée au signal rst_n en dehors de la condition de détection du front montant de l’horloge garantit une remise à zéro immédiate et fiable. La gestion de l’entrée enable à l’intérieur du rising_edge(clk) permet d’implémenter précisément le mécanisme de mémorisation conditionnelle attendu. Enfin, l’utilisation d’un signal intermédiaire pour stocker l’état interne de la bascule améliore la lisibilité du code et constitue une bonne pratique en conception VHDL, tout en facilitant la compréhension et la maintenance du module.</w:t>
+        <w:t xml:space="preserve">Le code VHDL développé respecte les règles de conception d’une bascule D synchrone avec remise à zéro asynchrone. La priorité donnée au signal </w:t>
+      </w:r>
+      <w:proofErr w:type="spellStart"/>
+      <w:r>
+        <w:t>rst_n</w:t>
+      </w:r>
+      <w:proofErr w:type="spellEnd"/>
+      <w:r>
+        <w:t xml:space="preserve"> en dehors de la condition de détection du front montant de l’horloge garantit une remise à zéro immédiate et fiable. La gestion de l’entrée enable à l’intérieur du </w:t>
+      </w:r>
+      <w:proofErr w:type="spellStart"/>
+      <w:r>
+        <w:t>rising_edge</w:t>
+      </w:r>
+      <w:proofErr w:type="spellEnd"/>
+      <w:r>
+        <w:t>(</w:t>
+      </w:r>
+      <w:proofErr w:type="spellStart"/>
+      <w:r>
+        <w:t>clk</w:t>
+      </w:r>
+      <w:proofErr w:type="spellEnd"/>
+      <w:r>
+        <w:t>) permet d’implémenter précisément le mécanisme de mémorisation conditionnelle attendu. Enfin, l’utilisation d’un signal intermédiaire pour stocker l’état interne de la bascule améliore la lisibilité du code et constitue une bonne pratique en conception VHDL, tout en facilitant la compréhension et la maintenance du module.</w:t>
       </w:r>
     </w:p>
     <w:p>
@@ -1508,6 +1708,9 @@
         <w:fldChar w:fldCharType="separate"/>
       </w:r>
       <w:r>
+        <w:rPr>
+          <w:noProof/>
+        </w:rPr>
         <w:t>3</w:t>
       </w:r>
       <w:r>
@@ -1532,6 +1735,7 @@
       <w:r>
         <w:t xml:space="preserve">L’entité </w:t>
       </w:r>
+      <w:proofErr w:type="spellStart"/>
       <w:r>
         <w:rPr>
           <w:i/>
@@ -1539,9 +1743,11 @@
         </w:rPr>
         <w:t>registre_changement_parallele</w:t>
       </w:r>
+      <w:proofErr w:type="spellEnd"/>
       <w:r>
         <w:t xml:space="preserve"> définit les entrées et sorties du module : une horloge (</w:t>
       </w:r>
+      <w:proofErr w:type="spellStart"/>
       <w:r>
         <w:rPr>
           <w:i/>
@@ -1549,9 +1755,11 @@
         </w:rPr>
         <w:t>clk</w:t>
       </w:r>
+      <w:proofErr w:type="spellEnd"/>
       <w:r>
         <w:t>), un signal de remise à zéro asynchrone actif à l’état bas (</w:t>
       </w:r>
+      <w:proofErr w:type="spellStart"/>
       <w:r>
         <w:rPr>
           <w:i/>
@@ -1559,6 +1767,7 @@
         </w:rPr>
         <w:t>rst_n</w:t>
       </w:r>
+      <w:proofErr w:type="spellEnd"/>
       <w:r>
         <w:t>), un signal d’activation (</w:t>
       </w:r>
@@ -1617,6 +1826,7 @@
       <w:r>
         <w:t xml:space="preserve">, nous avons choisi d’instancier manuellement quatre bascules D, correspondant chacune à un bit du registre. Chaque instance de la bascule </w:t>
       </w:r>
+      <w:proofErr w:type="spellStart"/>
       <w:r>
         <w:rPr>
           <w:i/>
@@ -1624,6 +1834,7 @@
         </w:rPr>
         <w:t>bascule_D</w:t>
       </w:r>
+      <w:proofErr w:type="spellEnd"/>
       <w:r>
         <w:t xml:space="preserve"> est connectée au même signal d’horloge, au même reset asynchrone et au même signal </w:t>
       </w:r>
@@ -1647,12 +1858,21 @@
       <w:r>
         <w:t xml:space="preserve"> (de </w:t>
       </w:r>
+      <w:proofErr w:type="gramStart"/>
       <w:r>
         <w:rPr>
           <w:i/>
           <w:iCs/>
         </w:rPr>
-        <w:t>D(0)</w:t>
+        <w:t>D(</w:t>
+      </w:r>
+      <w:proofErr w:type="gramEnd"/>
+      <w:r>
+        <w:rPr>
+          <w:i/>
+          <w:iCs/>
+        </w:rPr>
+        <w:t>0)</w:t>
       </w:r>
       <w:r>
         <w:t xml:space="preserve"> à </w:t>
@@ -1692,14 +1912,61 @@
       <w:r>
         <w:t>Afin de vérifier le bon fonctionnement de notre registre, nous avons développé un banc de test (</w:t>
       </w:r>
+      <w:proofErr w:type="spellStart"/>
       <w:r>
         <w:rPr>
           <w:iCs/>
         </w:rPr>
         <w:t>tb_registre</w:t>
       </w:r>
-      <w:r>
-        <w:t>) permettant de simuler le comportement du composant dans des conditions réelles. L’horloge est générée de manière autonome avec une période de 10 ps via l’instruction clk &lt;= not clk after 5 ps;. Le registre précédemment conçu est instancié dans le banc de test comme unité à stimuler (</w:t>
+      <w:proofErr w:type="spellEnd"/>
+      <w:r>
+        <w:t xml:space="preserve">) permettant de simuler le comportement du composant dans des conditions réelles. L’horloge est générée de manière autonome avec une période de 10 </w:t>
+      </w:r>
+      <w:proofErr w:type="spellStart"/>
+      <w:r>
+        <w:t>ps</w:t>
+      </w:r>
+      <w:proofErr w:type="spellEnd"/>
+      <w:r>
+        <w:t xml:space="preserve"> via l’instruction </w:t>
+      </w:r>
+      <w:proofErr w:type="spellStart"/>
+      <w:r>
+        <w:t>clk</w:t>
+      </w:r>
+      <w:proofErr w:type="spellEnd"/>
+      <w:r>
+        <w:t xml:space="preserve"> &lt;= not </w:t>
+      </w:r>
+      <w:proofErr w:type="spellStart"/>
+      <w:r>
+        <w:t>clk</w:t>
+      </w:r>
+      <w:proofErr w:type="spellEnd"/>
+      <w:r>
+        <w:t xml:space="preserve"> </w:t>
+      </w:r>
+      <w:proofErr w:type="spellStart"/>
+      <w:r>
+        <w:t>after</w:t>
+      </w:r>
+      <w:proofErr w:type="spellEnd"/>
+      <w:r>
+        <w:t xml:space="preserve"> 5 </w:t>
+      </w:r>
+      <w:proofErr w:type="spellStart"/>
+      <w:proofErr w:type="gramStart"/>
+      <w:r>
+        <w:t>ps</w:t>
+      </w:r>
+      <w:proofErr w:type="spellEnd"/>
+      <w:r>
+        <w:t>;.</w:t>
+      </w:r>
+      <w:proofErr w:type="gramEnd"/>
+      <w:r>
+        <w:t xml:space="preserve"> Le registre précédemment conçu est instancié dans le banc de test comme unité à stimuler (</w:t>
       </w:r>
       <w:r>
         <w:rPr>
@@ -1708,11 +1975,24 @@
         <w:t>Unit Under Test</w:t>
       </w:r>
       <w:r>
-        <w:t xml:space="preserve">). Le processus de simulation suit une séquence chronologique précise pour valider chaque fonctionnalité : l’initialisation est réalisée en activant le reset (rst_n &lt;= '0') afin de s’assurer que le registre démarre dans un état connu, généralement « 0000 ». Ensuite, le </w:t>
-      </w:r>
+        <w:t>). Le processus de simulation suit une séquence chronologique précise pour valider chaque fonctionnalité : l’initialisation est réalisée en activant le reset (</w:t>
+      </w:r>
+      <w:proofErr w:type="spellStart"/>
+      <w:r>
+        <w:t>rst_n</w:t>
+      </w:r>
+      <w:proofErr w:type="spellEnd"/>
+      <w:r>
+        <w:t xml:space="preserve"> &lt;= '0') afin de s’assurer que le registre démarre dans un état connu, généralement « 0000 ». Ensuite, le </w:t>
+      </w:r>
+      <w:proofErr w:type="spellStart"/>
       <w:r>
         <w:lastRenderedPageBreak/>
-        <w:t xml:space="preserve">reset est levé, la donnée « 1010 » est appliquée sur l’entrée </w:t>
+        <w:t>reset</w:t>
+      </w:r>
+      <w:proofErr w:type="spellEnd"/>
+      <w:r>
+        <w:t xml:space="preserve"> est levé, la donnée « 1010 » est appliquée sur l’entrée </w:t>
       </w:r>
       <w:r>
         <w:rPr>
@@ -1771,13 +2051,9 @@
     </w:p>
     <w:p>
       <w:pPr>
+        <w:keepNext/>
         <w:spacing w:line="278" w:lineRule="auto"/>
         <w:jc w:val="center"/>
-        <w:rPr>
-          <w:rFonts w:eastAsiaTheme="majorEastAsia" w:cstheme="majorBidi"/>
-          <w:i/>
-          <w:szCs w:val="28"/>
-        </w:rPr>
       </w:pPr>
       <w:r>
         <w:rPr>
@@ -1823,6 +2099,435 @@
         </w:drawing>
       </w:r>
     </w:p>
+    <w:p>
+      <w:pPr>
+        <w:pStyle w:val="Lgende"/>
+      </w:pPr>
+      <w:r>
+        <w:t xml:space="preserve">Figure </w:t>
+      </w:r>
+      <w:r>
+        <w:fldChar w:fldCharType="begin"/>
+      </w:r>
+      <w:r>
+        <w:instrText xml:space="preserve"> SEQ Figure \* ARABIC </w:instrText>
+      </w:r>
+      <w:r>
+        <w:fldChar w:fldCharType="separate"/>
+      </w:r>
+      <w:r>
+        <w:rPr>
+          <w:noProof/>
+        </w:rPr>
+        <w:t>4</w:t>
+      </w:r>
+      <w:r>
+        <w:fldChar w:fldCharType="end"/>
+      </w:r>
+      <w:r>
+        <w:t xml:space="preserve"> : Simulation registre à changement parallèle</w:t>
+      </w:r>
+    </w:p>
+    <w:p>
+      <w:pPr>
+        <w:pStyle w:val="Titre2"/>
+      </w:pPr>
+      <w:r>
+        <w:t>Stockage du code</w:t>
+      </w:r>
+    </w:p>
+    <w:p>
+      <w:r>
+        <w:t>Pour</w:t>
+      </w:r>
+      <w:r>
+        <w:t xml:space="preserve"> réaliser une structure de stockage sur 16 bits en </w:t>
+      </w:r>
+      <w:r>
+        <w:t xml:space="preserve">va </w:t>
+      </w:r>
+      <w:proofErr w:type="gramStart"/>
+      <w:r>
+        <w:t>chaîn</w:t>
+      </w:r>
+      <w:r>
+        <w:t>é</w:t>
+      </w:r>
+      <w:proofErr w:type="gramEnd"/>
+      <w:r>
+        <w:t xml:space="preserve"> quatre registres de 4 bits. Chaque registre mémorise un chiffre saisi successivement, ce qui conduit à la constitution progressive d’un mot de 16 bits représentant l’ensemble du code utilisateur. </w:t>
+      </w:r>
+    </w:p>
+    <w:p>
+      <w:r>
+        <w:t xml:space="preserve">Le décalage des données est assuré de manière synchrone. </w:t>
+      </w:r>
+      <w:r>
+        <w:t>L</w:t>
+      </w:r>
+      <w:r>
+        <w:t>’ensemble des registres partage le même signal d’horloge ainsi que le même signal d’activation, issu du détecteur de front. Ainsi, à chaque front montant de l’horloge, le premier registre charge la nouvelle valeur présente sur le bus intermédiaire (</w:t>
+      </w:r>
+      <w:proofErr w:type="spellStart"/>
+      <w:r>
+        <w:rPr>
+          <w:i/>
+          <w:iCs/>
+        </w:rPr>
+        <w:t>Busint</w:t>
+      </w:r>
+      <w:proofErr w:type="spellEnd"/>
+      <w:r>
+        <w:t>), tandis que les registres suivants récupèrent simultanément la valeur précédemment stockée dans le registre qui les précède. Ce</w:t>
+      </w:r>
+      <w:r>
+        <w:t>la permet</w:t>
+      </w:r>
+      <w:r>
+        <w:t xml:space="preserve"> un décalage simultané des données dans toute la chaîne de registres.</w:t>
+      </w:r>
+    </w:p>
+    <w:p>
+      <w:r>
+        <w:t xml:space="preserve">L’organisation des bits au sein du bus final </w:t>
+      </w:r>
+      <w:proofErr w:type="spellStart"/>
+      <w:r>
+        <w:rPr>
+          <w:i/>
+          <w:iCs/>
+        </w:rPr>
+        <w:t>Buscode</w:t>
+      </w:r>
+      <w:proofErr w:type="spellEnd"/>
+      <w:r>
+        <w:t xml:space="preserve"> respecte correctement l’ordre des poids. La concaténation des sorties </w:t>
+      </w:r>
+      <w:r>
+        <w:rPr>
+          <w:i/>
+          <w:iCs/>
+        </w:rPr>
+        <w:t>q4</w:t>
+      </w:r>
+      <w:r>
+        <w:t xml:space="preserve">, </w:t>
+      </w:r>
+      <w:r>
+        <w:rPr>
+          <w:i/>
+          <w:iCs/>
+        </w:rPr>
+        <w:t>q3</w:t>
+      </w:r>
+      <w:r>
+        <w:t xml:space="preserve">, </w:t>
+      </w:r>
+      <w:r>
+        <w:rPr>
+          <w:i/>
+          <w:iCs/>
+        </w:rPr>
+        <w:t>q2</w:t>
+      </w:r>
+      <w:r>
+        <w:t xml:space="preserve"> et </w:t>
+      </w:r>
+      <w:r>
+        <w:rPr>
+          <w:i/>
+          <w:iCs/>
+        </w:rPr>
+        <w:t>q1</w:t>
+      </w:r>
+      <w:r>
+        <w:t xml:space="preserve"> place le dernier chiffre saisi (</w:t>
+      </w:r>
+      <w:r>
+        <w:rPr>
+          <w:i/>
+          <w:iCs/>
+        </w:rPr>
+        <w:t>q1</w:t>
+      </w:r>
+      <w:r>
+        <w:t xml:space="preserve">) sur les bits de poids </w:t>
+      </w:r>
+      <w:r>
+        <w:lastRenderedPageBreak/>
+        <w:t>faible (bits 0 à 3), tandis que le premier chiffre saisi (</w:t>
+      </w:r>
+      <w:r>
+        <w:rPr>
+          <w:i/>
+          <w:iCs/>
+        </w:rPr>
+        <w:t>q4</w:t>
+      </w:r>
+      <w:r>
+        <w:t xml:space="preserve">) est positionné sur les bits de poids fort (bits 12 à 15). </w:t>
+      </w:r>
+    </w:p>
+    <w:p>
+      <w:r>
+        <w:t xml:space="preserve">Enfin, le cheminement des données est clairement défini : le bus intermédiaire </w:t>
+      </w:r>
+      <w:proofErr w:type="spellStart"/>
+      <w:r>
+        <w:rPr>
+          <w:i/>
+          <w:iCs/>
+        </w:rPr>
+        <w:t>Busint</w:t>
+      </w:r>
+      <w:proofErr w:type="spellEnd"/>
+      <w:r>
+        <w:t xml:space="preserve"> alimente l’entrée du premier registre, la sortie </w:t>
+      </w:r>
+      <w:r>
+        <w:rPr>
+          <w:i/>
+          <w:iCs/>
+        </w:rPr>
+        <w:t>q1</w:t>
+      </w:r>
+      <w:r>
+        <w:t xml:space="preserve"> de ce registre est connectée à l’entrée du second, puis </w:t>
+      </w:r>
+      <w:r>
+        <w:rPr>
+          <w:i/>
+          <w:iCs/>
+        </w:rPr>
+        <w:t>q2</w:t>
+      </w:r>
+      <w:r>
+        <w:t xml:space="preserve"> alimente le troisième registre et </w:t>
+      </w:r>
+      <w:r>
+        <w:rPr>
+          <w:i/>
+          <w:iCs/>
+        </w:rPr>
+        <w:t>q3</w:t>
+      </w:r>
+      <w:r>
+        <w:t xml:space="preserve"> le quatrième. Les quatre sorties sont ensuite regroupées pour former un bus de 16 bits unique, </w:t>
+      </w:r>
+      <w:proofErr w:type="spellStart"/>
+      <w:r>
+        <w:rPr>
+          <w:i/>
+          <w:iCs/>
+        </w:rPr>
+        <w:t>Buscode</w:t>
+      </w:r>
+      <w:proofErr w:type="spellEnd"/>
+      <w:r>
+        <w:t>, représentant l’état complet du code mémorisé par le système.</w:t>
+      </w:r>
+    </w:p>
+    <w:p>
+      <w:r>
+        <w:t xml:space="preserve">Voici le schéma du circuit : </w:t>
+      </w:r>
+    </w:p>
+    <w:p>
+      <w:pPr>
+        <w:keepNext/>
+      </w:pPr>
+      <w:r>
+        <w:drawing>
+          <wp:inline distT="0" distB="0" distL="0" distR="0" wp14:anchorId="0EBDE698" wp14:editId="6CB45890">
+            <wp:extent cx="5760720" cy="4149725"/>
+            <wp:effectExtent l="0" t="0" r="1905" b="3175"/>
+            <wp:docPr id="4" name="Image 4"/>
+            <wp:cNvGraphicFramePr>
+              <a:graphicFrameLocks xmlns:a="http://schemas.openxmlformats.org/drawingml/2006/main" noChangeAspect="1"/>
+            </wp:cNvGraphicFramePr>
+            <a:graphic xmlns:a="http://schemas.openxmlformats.org/drawingml/2006/main">
+              <a:graphicData uri="http://schemas.openxmlformats.org/drawingml/2006/picture">
+                <pic:pic xmlns:pic="http://schemas.openxmlformats.org/drawingml/2006/picture">
+                  <pic:nvPicPr>
+                    <pic:cNvPr id="0" name="Picture 7"/>
+                    <pic:cNvPicPr>
+                      <a:picLocks noChangeAspect="1" noChangeArrowheads="1"/>
+                    </pic:cNvPicPr>
+                  </pic:nvPicPr>
+                  <pic:blipFill>
+                    <a:blip r:embed="rId13">
+                      <a:extLst>
+                        <a:ext uri="{28A0092B-C50C-407E-A947-70E740481C1C}">
+                          <a14:useLocalDpi xmlns:a14="http://schemas.microsoft.com/office/drawing/2010/main" val="0"/>
+                        </a:ext>
+                      </a:extLst>
+                    </a:blip>
+                    <a:srcRect/>
+                    <a:stretch>
+                      <a:fillRect/>
+                    </a:stretch>
+                  </pic:blipFill>
+                  <pic:spPr bwMode="auto">
+                    <a:xfrm>
+                      <a:off x="0" y="0"/>
+                      <a:ext cx="5760720" cy="4149725"/>
+                    </a:xfrm>
+                    <a:prstGeom prst="rect">
+                      <a:avLst/>
+                    </a:prstGeom>
+                    <a:noFill/>
+                    <a:ln>
+                      <a:noFill/>
+                    </a:ln>
+                  </pic:spPr>
+                </pic:pic>
+              </a:graphicData>
+            </a:graphic>
+          </wp:inline>
+        </w:drawing>
+      </w:r>
+    </w:p>
+    <w:p>
+      <w:pPr>
+        <w:pStyle w:val="Lgende"/>
+      </w:pPr>
+      <w:r>
+        <w:t xml:space="preserve">Figure </w:t>
+      </w:r>
+      <w:r>
+        <w:fldChar w:fldCharType="begin"/>
+      </w:r>
+      <w:r>
+        <w:instrText xml:space="preserve"> SEQ Figure \* ARABIC </w:instrText>
+      </w:r>
+      <w:r>
+        <w:fldChar w:fldCharType="separate"/>
+      </w:r>
+      <w:r>
+        <w:rPr>
+          <w:noProof/>
+        </w:rPr>
+        <w:t>5</w:t>
+      </w:r>
+      <w:r>
+        <w:fldChar w:fldCharType="end"/>
+      </w:r>
+      <w:r>
+        <w:t xml:space="preserve"> : Logigramme du stockage code</w:t>
+      </w:r>
+    </w:p>
+    <w:p>
+      <w:r>
+        <w:t>A</w:t>
+      </w:r>
+      <w:r>
+        <w:t xml:space="preserve">ucun module </w:t>
+      </w:r>
+      <w:r>
+        <w:t xml:space="preserve">code </w:t>
+      </w:r>
+      <w:r>
+        <w:t xml:space="preserve">VHDL </w:t>
+      </w:r>
+      <w:r>
+        <w:t>propre,</w:t>
+      </w:r>
+      <w:r>
+        <w:t xml:space="preserve"> ni simulation n’</w:t>
+      </w:r>
+      <w:r>
+        <w:t>a</w:t>
+      </w:r>
+      <w:r>
+        <w:t xml:space="preserve"> été réalisé</w:t>
+      </w:r>
+      <w:r>
+        <w:t>, c</w:t>
+      </w:r>
+      <w:r>
+        <w:t>ette fonction</w:t>
+      </w:r>
+      <w:r>
+        <w:t xml:space="preserve"> a</w:t>
+      </w:r>
+      <w:r>
+        <w:t xml:space="preserve"> été intégrée directement au sein du module principal (top module), en s’appuyant sur les registres précédemment conçus et validés. Le stockage du code a fonctionné correctement dès la première implémentation, sans nécessiter de modifications supplémentaires. Quatre registres à chargement parallèle sont instanciés en cascade afin de réaliser le décalage successif des données : le premier registre reçoit la valeur d’entrée, tandis que chaque registre suivant récupère la sortie du précédent à chaque activation du signal issu du détecteur de front. Les quatre sorties </w:t>
+      </w:r>
+      <w:r>
+        <w:lastRenderedPageBreak/>
+        <w:t>sont ensuite concaténées pour former un bus interne de 16 bits représentant le code complet mémorisé. Ce bus est enfin utilisé comme entrée du comparateur 16 bits, permettant la validation du code saisi par l’utilisateur.</w:t>
+      </w:r>
+    </w:p>
+    <w:p>
+      <w:pPr>
+        <w:keepNext/>
+      </w:pPr>
+      <w:r>
+        <w:drawing>
+          <wp:inline distT="0" distB="0" distL="0" distR="0" wp14:anchorId="1BE7C6A2" wp14:editId="1001A88B">
+            <wp:extent cx="5760720" cy="2923540"/>
+            <wp:effectExtent l="0" t="0" r="0" b="0"/>
+            <wp:docPr id="9" name="Image 9"/>
+            <wp:cNvGraphicFramePr>
+              <a:graphicFrameLocks xmlns:a="http://schemas.openxmlformats.org/drawingml/2006/main" noChangeAspect="1"/>
+            </wp:cNvGraphicFramePr>
+            <a:graphic xmlns:a="http://schemas.openxmlformats.org/drawingml/2006/main">
+              <a:graphicData uri="http://schemas.openxmlformats.org/drawingml/2006/picture">
+                <pic:pic xmlns:pic="http://schemas.openxmlformats.org/drawingml/2006/picture">
+                  <pic:nvPicPr>
+                    <pic:cNvPr id="1" name=""/>
+                    <pic:cNvPicPr/>
+                  </pic:nvPicPr>
+                  <pic:blipFill>
+                    <a:blip r:embed="rId14"/>
+                    <a:stretch>
+                      <a:fillRect/>
+                    </a:stretch>
+                  </pic:blipFill>
+                  <pic:spPr>
+                    <a:xfrm>
+                      <a:off x="0" y="0"/>
+                      <a:ext cx="5760720" cy="2923540"/>
+                    </a:xfrm>
+                    <a:prstGeom prst="rect">
+                      <a:avLst/>
+                    </a:prstGeom>
+                  </pic:spPr>
+                </pic:pic>
+              </a:graphicData>
+            </a:graphic>
+          </wp:inline>
+        </w:drawing>
+      </w:r>
+    </w:p>
+    <w:p>
+      <w:pPr>
+        <w:pStyle w:val="Lgende"/>
+      </w:pPr>
+      <w:r>
+        <w:t xml:space="preserve">Figure </w:t>
+      </w:r>
+      <w:r>
+        <w:fldChar w:fldCharType="begin"/>
+      </w:r>
+      <w:r>
+        <w:instrText xml:space="preserve"> SEQ Figure \* ARABIC </w:instrText>
+      </w:r>
+      <w:r>
+        <w:fldChar w:fldCharType="separate"/>
+      </w:r>
+      <w:r>
+        <w:t>6</w:t>
+      </w:r>
+      <w:r>
+        <w:fldChar w:fldCharType="end"/>
+      </w:r>
+      <w:r>
+        <w:t xml:space="preserve"> : Code extrait top module permettant le stockage du code</w:t>
+      </w:r>
+    </w:p>
+    <w:p/>
+    <w:p/>
     <w:p/>
     <w:p>
       <w:pPr>
@@ -2057,9 +2762,9 @@
       </w:r>
     </w:p>
     <w:sectPr>
-      <w:headerReference w:type="default" r:id="rId13"/>
-      <w:footerReference w:type="default" r:id="rId14"/>
-      <w:headerReference w:type="first" r:id="rId15"/>
+      <w:headerReference w:type="default" r:id="rId15"/>
+      <w:footerReference w:type="default" r:id="rId16"/>
+      <w:headerReference w:type="first" r:id="rId17"/>
       <w:pgSz w:w="11906" w:h="16838"/>
       <w:pgMar w:top="1417" w:right="1417" w:bottom="1417" w:left="1417" w:header="708" w:footer="708" w:gutter="0"/>
       <w:cols w:space="708"/>
@@ -2298,7 +3003,7 @@
         <v:path o:extrusionok="f" gradientshapeok="t" o:connecttype="rect"/>
         <o:lock v:ext="edit" aspectratio="t"/>
       </v:shapetype>
-      <v:shape id="_x0000_i1036" type="#_x0000_t75" style="width:11.25pt;height:11.25pt" o:bullet="t">
+      <v:shape id="_x0000_i1068" type="#_x0000_t75" style="width:11.25pt;height:11.25pt" o:bullet="t">
         <v:imagedata r:id="rId1" o:title="msoEA91"/>
       </v:shape>
     </w:pict>
@@ -9019,7 +9724,6 @@
   <w:style w:type="character" w:default="1" w:styleId="Policepardfaut">
     <w:name w:val="Default Paragraph Font"/>
     <w:uiPriority w:val="1"/>
-    <w:semiHidden/>
     <w:unhideWhenUsed/>
   </w:style>
   <w:style w:type="table" w:default="1" w:styleId="TableauNormal">

</xml_diff>

<commit_message>
ajout stockage code word
</commit_message>
<xml_diff>
--- a/Mini_projet/CR_youssef/Rapport_FPGA.docx
+++ b/Mini_projet/CR_youssef/Rapport_FPGA.docx
@@ -1089,7 +1089,7 @@
       <w:pPr>
         <w:pStyle w:val="Lgende"/>
       </w:pPr>
-      <w:bookmarkStart w:id="3" w:name="_Toc219739472"/>
+      <w:bookmarkStart w:id="3" w:name="_Toc220178366"/>
       <w:r>
         <w:t xml:space="preserve">Figure </w:t>
       </w:r>
@@ -1507,7 +1507,7 @@
       <w:pPr>
         <w:pStyle w:val="Lgende"/>
       </w:pPr>
-      <w:bookmarkStart w:id="6" w:name="_Toc219739473"/>
+      <w:bookmarkStart w:id="6" w:name="_Toc220178367"/>
       <w:r>
         <w:t xml:space="preserve">Figure </w:t>
       </w:r>
@@ -1695,6 +1695,7 @@
       <w:pPr>
         <w:pStyle w:val="Lgende"/>
       </w:pPr>
+      <w:bookmarkStart w:id="8" w:name="_Toc220178368"/>
       <w:r>
         <w:t xml:space="preserve">Figure </w:t>
       </w:r>
@@ -1719,17 +1720,18 @@
       <w:r>
         <w:t xml:space="preserve"> : Simulation bascule D</w:t>
       </w:r>
+      <w:bookmarkEnd w:id="8"/>
     </w:p>
     <w:p/>
     <w:p>
       <w:pPr>
         <w:pStyle w:val="Titre2"/>
       </w:pPr>
-      <w:bookmarkStart w:id="8" w:name="_Toc219740219"/>
+      <w:bookmarkStart w:id="9" w:name="_Toc219740219"/>
       <w:r>
         <w:t>Registre à changement parallèle (4bits)</w:t>
       </w:r>
-      <w:bookmarkEnd w:id="8"/>
+      <w:bookmarkEnd w:id="9"/>
     </w:p>
     <w:p>
       <w:r>
@@ -2103,6 +2105,7 @@
       <w:pPr>
         <w:pStyle w:val="Lgende"/>
       </w:pPr>
+      <w:bookmarkStart w:id="10" w:name="_Toc220178369"/>
       <w:r>
         <w:t xml:space="preserve">Figure </w:t>
       </w:r>
@@ -2127,6 +2130,7 @@
       <w:r>
         <w:t xml:space="preserve"> : Simulation registre à changement parallèle</w:t>
       </w:r>
+      <w:bookmarkEnd w:id="10"/>
     </w:p>
     <w:p>
       <w:pPr>
@@ -2337,6 +2341,9 @@
         <w:keepNext/>
       </w:pPr>
       <w:r>
+        <w:rPr>
+          <w:noProof/>
+        </w:rPr>
         <w:drawing>
           <wp:inline distT="0" distB="0" distL="0" distR="0" wp14:anchorId="0EBDE698" wp14:editId="6CB45890">
             <wp:extent cx="5760720" cy="4149725"/>
@@ -2391,6 +2398,7 @@
       <w:pPr>
         <w:pStyle w:val="Lgende"/>
       </w:pPr>
+      <w:bookmarkStart w:id="11" w:name="_Toc220178370"/>
       <w:r>
         <w:t xml:space="preserve">Figure </w:t>
       </w:r>
@@ -2415,43 +2423,11 @@
       <w:r>
         <w:t xml:space="preserve"> : Logigramme du stockage code</w:t>
       </w:r>
+      <w:bookmarkEnd w:id="11"/>
     </w:p>
     <w:p>
       <w:r>
-        <w:t>A</w:t>
-      </w:r>
-      <w:r>
-        <w:t xml:space="preserve">ucun module </w:t>
-      </w:r>
-      <w:r>
-        <w:t xml:space="preserve">code </w:t>
-      </w:r>
-      <w:r>
-        <w:t xml:space="preserve">VHDL </w:t>
-      </w:r>
-      <w:r>
-        <w:t>propre,</w:t>
-      </w:r>
-      <w:r>
-        <w:t xml:space="preserve"> ni simulation n’</w:t>
-      </w:r>
-      <w:r>
-        <w:t>a</w:t>
-      </w:r>
-      <w:r>
-        <w:t xml:space="preserve"> été réalisé</w:t>
-      </w:r>
-      <w:r>
-        <w:t>, c</w:t>
-      </w:r>
-      <w:r>
-        <w:t>ette fonction</w:t>
-      </w:r>
-      <w:r>
-        <w:t xml:space="preserve"> a</w:t>
-      </w:r>
-      <w:r>
-        <w:t xml:space="preserve"> été intégrée directement au sein du module principal (top module), en s’appuyant sur les registres précédemment conçus et validés. Le stockage du code a fonctionné correctement dès la première implémentation, sans nécessiter de modifications supplémentaires. Quatre registres à chargement parallèle sont instanciés en cascade afin de réaliser le décalage successif des données : le premier registre reçoit la valeur d’entrée, tandis que chaque registre suivant récupère la sortie du précédent à chaque activation du signal issu du détecteur de front. Les quatre sorties </w:t>
+        <w:t xml:space="preserve">Aucun module code VHDL propre, ni simulation n’a été réalisé, cette fonction a été intégrée directement au sein du module principal (top module), en s’appuyant sur les registres précédemment conçus et validés. Le stockage du code a fonctionné correctement dès la première implémentation, sans nécessiter de modifications supplémentaires. Quatre registres à chargement parallèle sont instanciés en cascade afin de réaliser le décalage successif des données : le premier registre reçoit la valeur d’entrée, tandis que chaque registre suivant récupère la sortie du précédent à chaque activation du signal issu du détecteur de front. Les quatre sorties </w:t>
       </w:r>
       <w:r>
         <w:lastRenderedPageBreak/>
@@ -2463,6 +2439,9 @@
         <w:keepNext/>
       </w:pPr>
       <w:r>
+        <w:rPr>
+          <w:noProof/>
+        </w:rPr>
         <w:drawing>
           <wp:inline distT="0" distB="0" distL="0" distR="0" wp14:anchorId="1BE7C6A2" wp14:editId="1001A88B">
             <wp:extent cx="5760720" cy="2923540"/>
@@ -2504,6 +2483,7 @@
       <w:pPr>
         <w:pStyle w:val="Lgende"/>
       </w:pPr>
+      <w:bookmarkStart w:id="12" w:name="_Toc220178371"/>
       <w:r>
         <w:t xml:space="preserve">Figure </w:t>
       </w:r>
@@ -2517,6 +2497,9 @@
         <w:fldChar w:fldCharType="separate"/>
       </w:r>
       <w:r>
+        <w:rPr>
+          <w:noProof/>
+        </w:rPr>
         <w:t>6</w:t>
       </w:r>
       <w:r>
@@ -2524,11 +2507,778 @@
       </w:r>
       <w:r>
         <w:t xml:space="preserve"> : Code extrait top module permettant le stockage du code</w:t>
+      </w:r>
+      <w:bookmarkEnd w:id="12"/>
+    </w:p>
+    <w:p/>
+    <w:p>
+      <w:pPr>
+        <w:pStyle w:val="Titre2"/>
+      </w:pPr>
+      <w:r>
+        <w:t>Affichage 7 segments</w:t>
+      </w:r>
+    </w:p>
+    <w:p>
+      <w:pPr>
+        <w:numPr>
+          <w:ilvl w:val="0"/>
+          <w:numId w:val="50"/>
+        </w:numPr>
+        <w:spacing w:before="100" w:beforeAutospacing="1" w:after="100" w:afterAutospacing="1" w:line="240" w:lineRule="auto"/>
+        <w:jc w:val="left"/>
+        <w:rPr>
+          <w:rFonts w:ascii="Times New Roman" w:eastAsia="Times New Roman" w:hAnsi="Times New Roman" w:cs="Times New Roman"/>
+          <w:kern w:val="0"/>
+          <w:sz w:val="24"/>
+          <w14:ligatures w14:val="none"/>
+        </w:rPr>
+      </w:pPr>
+      <w:r>
+        <w:rPr>
+          <w:rFonts w:ascii="Times New Roman" w:eastAsia="Times New Roman" w:hAnsi="Times New Roman" w:cs="Times New Roman"/>
+          <w:b/>
+          <w:bCs/>
+          <w:kern w:val="0"/>
+          <w:sz w:val="24"/>
+          <w14:ligatures w14:val="none"/>
+        </w:rPr>
+        <w:t>Logique Inversée</w:t>
+      </w:r>
+      <w:r>
+        <w:rPr>
+          <w:rFonts w:ascii="Times New Roman" w:eastAsia="Times New Roman" w:hAnsi="Times New Roman" w:cs="Times New Roman"/>
+          <w:kern w:val="0"/>
+          <w:sz w:val="24"/>
+          <w14:ligatures w14:val="none"/>
+        </w:rPr>
+        <w:t xml:space="preserve"> : Vous avez bien pris en compte que sur la carte DE10-Lite, les segments sont actifs à l'état bas (</w:t>
+      </w:r>
+      <w:r>
+        <w:rPr>
+          <w:rFonts w:ascii="Times New Roman" w:eastAsia="Times New Roman" w:hAnsi="Times New Roman" w:cs="Times New Roman"/>
+          <w:b/>
+          <w:bCs/>
+          <w:kern w:val="0"/>
+          <w:sz w:val="24"/>
+          <w14:ligatures w14:val="none"/>
+        </w:rPr>
+        <w:t>'0' pour allumer</w:t>
+      </w:r>
+      <w:r>
+        <w:rPr>
+          <w:rFonts w:ascii="Times New Roman" w:eastAsia="Times New Roman" w:hAnsi="Times New Roman" w:cs="Times New Roman"/>
+          <w:kern w:val="0"/>
+          <w:sz w:val="24"/>
+          <w14:ligatures w14:val="none"/>
+        </w:rPr>
+        <w:t xml:space="preserve">, </w:t>
+      </w:r>
+      <w:r>
+        <w:rPr>
+          <w:rFonts w:ascii="Times New Roman" w:eastAsia="Times New Roman" w:hAnsi="Times New Roman" w:cs="Times New Roman"/>
+          <w:b/>
+          <w:bCs/>
+          <w:kern w:val="0"/>
+          <w:sz w:val="24"/>
+          <w14:ligatures w14:val="none"/>
+        </w:rPr>
+        <w:t>'1' pour éteindre</w:t>
+      </w:r>
+      <w:r>
+        <w:rPr>
+          <w:rFonts w:ascii="Times New Roman" w:eastAsia="Times New Roman" w:hAnsi="Times New Roman" w:cs="Times New Roman"/>
+          <w:kern w:val="0"/>
+          <w:sz w:val="24"/>
+          <w14:ligatures w14:val="none"/>
+        </w:rPr>
+        <w:t>).</w:t>
+      </w:r>
+    </w:p>
+    <w:p>
+      <w:pPr>
+        <w:numPr>
+          <w:ilvl w:val="0"/>
+          <w:numId w:val="50"/>
+        </w:numPr>
+        <w:spacing w:before="100" w:beforeAutospacing="1" w:after="100" w:afterAutospacing="1" w:line="240" w:lineRule="auto"/>
+        <w:jc w:val="left"/>
+        <w:rPr>
+          <w:rFonts w:ascii="Times New Roman" w:eastAsia="Times New Roman" w:hAnsi="Times New Roman" w:cs="Times New Roman"/>
+          <w:kern w:val="0"/>
+          <w:sz w:val="24"/>
+          <w14:ligatures w14:val="none"/>
+        </w:rPr>
+      </w:pPr>
+      <w:r>
+        <w:rPr>
+          <w:rFonts w:ascii="Times New Roman" w:eastAsia="Times New Roman" w:hAnsi="Times New Roman" w:cs="Times New Roman"/>
+          <w:b/>
+          <w:bCs/>
+          <w:kern w:val="0"/>
+          <w:sz w:val="24"/>
+          <w14:ligatures w14:val="none"/>
+        </w:rPr>
+        <w:t>Vérification des motifs</w:t>
+      </w:r>
+      <w:r>
+        <w:rPr>
+          <w:rFonts w:ascii="Times New Roman" w:eastAsia="Times New Roman" w:hAnsi="Times New Roman" w:cs="Times New Roman"/>
+          <w:kern w:val="0"/>
+          <w:sz w:val="24"/>
+          <w14:ligatures w14:val="none"/>
+        </w:rPr>
+        <w:t xml:space="preserve"> :</w:t>
+      </w:r>
+    </w:p>
+    <w:p>
+      <w:pPr>
+        <w:numPr>
+          <w:ilvl w:val="1"/>
+          <w:numId w:val="50"/>
+        </w:numPr>
+        <w:spacing w:before="100" w:beforeAutospacing="1" w:after="100" w:afterAutospacing="1" w:line="240" w:lineRule="auto"/>
+        <w:jc w:val="left"/>
+        <w:rPr>
+          <w:rFonts w:ascii="Times New Roman" w:eastAsia="Times New Roman" w:hAnsi="Times New Roman" w:cs="Times New Roman"/>
+          <w:kern w:val="0"/>
+          <w:sz w:val="24"/>
+          <w14:ligatures w14:val="none"/>
+        </w:rPr>
+      </w:pPr>
+      <w:r>
+        <w:rPr>
+          <w:rFonts w:ascii="Times New Roman" w:eastAsia="Times New Roman" w:hAnsi="Times New Roman" w:cs="Times New Roman"/>
+          <w:kern w:val="0"/>
+          <w:sz w:val="24"/>
+          <w14:ligatures w14:val="none"/>
+        </w:rPr>
+        <w:t xml:space="preserve">Pour </w:t>
+      </w:r>
+      <w:r>
+        <w:rPr>
+          <w:rFonts w:ascii="Times New Roman" w:eastAsia="Times New Roman" w:hAnsi="Times New Roman" w:cs="Times New Roman"/>
+          <w:b/>
+          <w:bCs/>
+          <w:kern w:val="0"/>
+          <w:sz w:val="24"/>
+          <w14:ligatures w14:val="none"/>
+        </w:rPr>
+        <w:t>"0000" (0)</w:t>
+      </w:r>
+      <w:r>
+        <w:rPr>
+          <w:rFonts w:ascii="Times New Roman" w:eastAsia="Times New Roman" w:hAnsi="Times New Roman" w:cs="Times New Roman"/>
+          <w:kern w:val="0"/>
+          <w:sz w:val="24"/>
+          <w14:ligatures w14:val="none"/>
+        </w:rPr>
+        <w:t xml:space="preserve">, la sortie est </w:t>
+      </w:r>
+      <w:r>
+        <w:rPr>
+          <w:rFonts w:ascii="Courier New" w:eastAsia="Times New Roman" w:hAnsi="Courier New" w:cs="Courier New"/>
+          <w:kern w:val="0"/>
+          <w:sz w:val="20"/>
+          <w:szCs w:val="20"/>
+          <w14:ligatures w14:val="none"/>
+        </w:rPr>
+        <w:t>1000000</w:t>
+      </w:r>
+      <w:r>
+        <w:rPr>
+          <w:rFonts w:ascii="Times New Roman" w:eastAsia="Times New Roman" w:hAnsi="Times New Roman" w:cs="Times New Roman"/>
+          <w:kern w:val="0"/>
+          <w:sz w:val="24"/>
+          <w14:ligatures w14:val="none"/>
+        </w:rPr>
+        <w:t xml:space="preserve">. Seul le segment </w:t>
+      </w:r>
+      <w:r>
+        <w:rPr>
+          <w:rFonts w:ascii="Courier New" w:eastAsia="Times New Roman" w:hAnsi="Courier New" w:cs="Courier New"/>
+          <w:kern w:val="0"/>
+          <w:sz w:val="20"/>
+          <w:szCs w:val="20"/>
+          <w14:ligatures w14:val="none"/>
+        </w:rPr>
+        <w:t>g</w:t>
+      </w:r>
+      <w:r>
+        <w:rPr>
+          <w:rFonts w:ascii="Times New Roman" w:eastAsia="Times New Roman" w:hAnsi="Times New Roman" w:cs="Times New Roman"/>
+          <w:kern w:val="0"/>
+          <w:sz w:val="24"/>
+          <w14:ligatures w14:val="none"/>
+        </w:rPr>
+        <w:t xml:space="preserve"> (poids fort) est à '1', donc éteint. Les segments </w:t>
+      </w:r>
+      <w:proofErr w:type="spellStart"/>
+      <w:proofErr w:type="gramStart"/>
+      <w:r>
+        <w:rPr>
+          <w:rFonts w:ascii="Courier New" w:eastAsia="Times New Roman" w:hAnsi="Courier New" w:cs="Courier New"/>
+          <w:kern w:val="0"/>
+          <w:sz w:val="20"/>
+          <w:szCs w:val="20"/>
+          <w14:ligatures w14:val="none"/>
+        </w:rPr>
+        <w:t>a,b</w:t>
+      </w:r>
+      <w:proofErr w:type="gramEnd"/>
+      <w:r>
+        <w:rPr>
+          <w:rFonts w:ascii="Courier New" w:eastAsia="Times New Roman" w:hAnsi="Courier New" w:cs="Courier New"/>
+          <w:kern w:val="0"/>
+          <w:sz w:val="20"/>
+          <w:szCs w:val="20"/>
+          <w14:ligatures w14:val="none"/>
+        </w:rPr>
+        <w:t>,c,d,e,f</w:t>
+      </w:r>
+      <w:proofErr w:type="spellEnd"/>
+      <w:r>
+        <w:rPr>
+          <w:rFonts w:ascii="Times New Roman" w:eastAsia="Times New Roman" w:hAnsi="Times New Roman" w:cs="Times New Roman"/>
+          <w:kern w:val="0"/>
+          <w:sz w:val="24"/>
+          <w14:ligatures w14:val="none"/>
+        </w:rPr>
+        <w:t xml:space="preserve"> forment bien un "0".</w:t>
+      </w:r>
+    </w:p>
+    <w:p>
+      <w:pPr>
+        <w:numPr>
+          <w:ilvl w:val="1"/>
+          <w:numId w:val="50"/>
+        </w:numPr>
+        <w:spacing w:before="100" w:beforeAutospacing="1" w:after="100" w:afterAutospacing="1" w:line="240" w:lineRule="auto"/>
+        <w:jc w:val="left"/>
+        <w:rPr>
+          <w:rFonts w:ascii="Times New Roman" w:eastAsia="Times New Roman" w:hAnsi="Times New Roman" w:cs="Times New Roman"/>
+          <w:kern w:val="0"/>
+          <w:sz w:val="24"/>
+          <w14:ligatures w14:val="none"/>
+        </w:rPr>
+      </w:pPr>
+      <w:r>
+        <w:rPr>
+          <w:rFonts w:ascii="Times New Roman" w:eastAsia="Times New Roman" w:hAnsi="Times New Roman" w:cs="Times New Roman"/>
+          <w:kern w:val="0"/>
+          <w:sz w:val="24"/>
+          <w14:ligatures w14:val="none"/>
+        </w:rPr>
+        <w:t xml:space="preserve">Pour </w:t>
+      </w:r>
+      <w:r>
+        <w:rPr>
+          <w:rFonts w:ascii="Times New Roman" w:eastAsia="Times New Roman" w:hAnsi="Times New Roman" w:cs="Times New Roman"/>
+          <w:b/>
+          <w:bCs/>
+          <w:kern w:val="0"/>
+          <w:sz w:val="24"/>
+          <w14:ligatures w14:val="none"/>
+        </w:rPr>
+        <w:t>"1010" (A)</w:t>
+      </w:r>
+      <w:r>
+        <w:rPr>
+          <w:rFonts w:ascii="Times New Roman" w:eastAsia="Times New Roman" w:hAnsi="Times New Roman" w:cs="Times New Roman"/>
+          <w:kern w:val="0"/>
+          <w:sz w:val="24"/>
+          <w14:ligatures w14:val="none"/>
+        </w:rPr>
+        <w:t xml:space="preserve">, la sortie est </w:t>
+      </w:r>
+      <w:r>
+        <w:rPr>
+          <w:rFonts w:ascii="Courier New" w:eastAsia="Times New Roman" w:hAnsi="Courier New" w:cs="Courier New"/>
+          <w:kern w:val="0"/>
+          <w:sz w:val="20"/>
+          <w:szCs w:val="20"/>
+          <w14:ligatures w14:val="none"/>
+        </w:rPr>
+        <w:t>0001000</w:t>
+      </w:r>
+      <w:r>
+        <w:rPr>
+          <w:rFonts w:ascii="Times New Roman" w:eastAsia="Times New Roman" w:hAnsi="Times New Roman" w:cs="Times New Roman"/>
+          <w:kern w:val="0"/>
+          <w:sz w:val="24"/>
+          <w14:ligatures w14:val="none"/>
+        </w:rPr>
+        <w:t xml:space="preserve">. Seul le segment </w:t>
+      </w:r>
+      <w:r>
+        <w:rPr>
+          <w:rFonts w:ascii="Courier New" w:eastAsia="Times New Roman" w:hAnsi="Courier New" w:cs="Courier New"/>
+          <w:kern w:val="0"/>
+          <w:sz w:val="20"/>
+          <w:szCs w:val="20"/>
+          <w14:ligatures w14:val="none"/>
+        </w:rPr>
+        <w:t>d</w:t>
+      </w:r>
+      <w:r>
+        <w:rPr>
+          <w:rFonts w:ascii="Times New Roman" w:eastAsia="Times New Roman" w:hAnsi="Times New Roman" w:cs="Times New Roman"/>
+          <w:kern w:val="0"/>
+          <w:sz w:val="24"/>
+          <w14:ligatures w14:val="none"/>
+        </w:rPr>
+        <w:t xml:space="preserve"> (milieu bas) est éteint. On obtient bien la forme de la lettre "A".</w:t>
+      </w:r>
+    </w:p>
+    <w:p>
+      <w:pPr>
+        <w:numPr>
+          <w:ilvl w:val="0"/>
+          <w:numId w:val="50"/>
+        </w:numPr>
+        <w:spacing w:before="100" w:beforeAutospacing="1" w:after="100" w:afterAutospacing="1" w:line="240" w:lineRule="auto"/>
+        <w:jc w:val="left"/>
+        <w:rPr>
+          <w:rFonts w:ascii="Times New Roman" w:eastAsia="Times New Roman" w:hAnsi="Times New Roman" w:cs="Times New Roman"/>
+          <w:kern w:val="0"/>
+          <w:sz w:val="24"/>
+          <w14:ligatures w14:val="none"/>
+        </w:rPr>
+      </w:pPr>
+      <w:r>
+        <w:rPr>
+          <w:rFonts w:ascii="Times New Roman" w:eastAsia="Times New Roman" w:hAnsi="Times New Roman" w:cs="Times New Roman"/>
+          <w:b/>
+          <w:bCs/>
+          <w:kern w:val="0"/>
+          <w:sz w:val="24"/>
+          <w14:ligatures w14:val="none"/>
+        </w:rPr>
+        <w:t>Concordance Simu</w:t>
+      </w:r>
+      <w:r>
+        <w:rPr>
+          <w:rFonts w:ascii="Times New Roman" w:eastAsia="Times New Roman" w:hAnsi="Times New Roman" w:cs="Times New Roman"/>
+          <w:kern w:val="0"/>
+          <w:sz w:val="24"/>
+          <w14:ligatures w14:val="none"/>
+        </w:rPr>
+        <w:t xml:space="preserve"> : Sur votre chronogramme (</w:t>
+      </w:r>
+      <w:r>
+        <w:rPr>
+          <w:rFonts w:ascii="Courier New" w:eastAsia="Times New Roman" w:hAnsi="Courier New" w:cs="Courier New"/>
+          <w:kern w:val="0"/>
+          <w:sz w:val="20"/>
+          <w:szCs w:val="20"/>
+          <w14:ligatures w14:val="none"/>
+        </w:rPr>
+        <w:t>image_fbdbec.png</w:t>
+      </w:r>
+      <w:r>
+        <w:rPr>
+          <w:rFonts w:ascii="Times New Roman" w:eastAsia="Times New Roman" w:hAnsi="Times New Roman" w:cs="Times New Roman"/>
+          <w:kern w:val="0"/>
+          <w:sz w:val="24"/>
+          <w14:ligatures w14:val="none"/>
+        </w:rPr>
+        <w:t xml:space="preserve">), on voit bien les transitions à 20 </w:t>
+      </w:r>
+      <w:proofErr w:type="spellStart"/>
+      <w:r>
+        <w:rPr>
+          <w:rFonts w:ascii="Times New Roman" w:eastAsia="Times New Roman" w:hAnsi="Times New Roman" w:cs="Times New Roman"/>
+          <w:kern w:val="0"/>
+          <w:sz w:val="24"/>
+          <w14:ligatures w14:val="none"/>
+        </w:rPr>
+        <w:t>ps</w:t>
+      </w:r>
+      <w:proofErr w:type="spellEnd"/>
+      <w:r>
+        <w:rPr>
+          <w:rFonts w:ascii="Times New Roman" w:eastAsia="Times New Roman" w:hAnsi="Times New Roman" w:cs="Times New Roman"/>
+          <w:kern w:val="0"/>
+          <w:sz w:val="24"/>
+          <w14:ligatures w14:val="none"/>
+        </w:rPr>
+        <w:t xml:space="preserve">, 40 </w:t>
+      </w:r>
+      <w:proofErr w:type="spellStart"/>
+      <w:r>
+        <w:rPr>
+          <w:rFonts w:ascii="Times New Roman" w:eastAsia="Times New Roman" w:hAnsi="Times New Roman" w:cs="Times New Roman"/>
+          <w:kern w:val="0"/>
+          <w:sz w:val="24"/>
+          <w14:ligatures w14:val="none"/>
+        </w:rPr>
+        <w:t>ps</w:t>
+      </w:r>
+      <w:proofErr w:type="spellEnd"/>
+      <w:r>
+        <w:rPr>
+          <w:rFonts w:ascii="Times New Roman" w:eastAsia="Times New Roman" w:hAnsi="Times New Roman" w:cs="Times New Roman"/>
+          <w:kern w:val="0"/>
+          <w:sz w:val="24"/>
+          <w14:ligatures w14:val="none"/>
+        </w:rPr>
+        <w:t xml:space="preserve">, etc., correspondant exactement aux stimuli de votre test </w:t>
+      </w:r>
+      <w:proofErr w:type="spellStart"/>
+      <w:r>
+        <w:rPr>
+          <w:rFonts w:ascii="Times New Roman" w:eastAsia="Times New Roman" w:hAnsi="Times New Roman" w:cs="Times New Roman"/>
+          <w:kern w:val="0"/>
+          <w:sz w:val="24"/>
+          <w14:ligatures w14:val="none"/>
+        </w:rPr>
+        <w:t>bench</w:t>
+      </w:r>
+      <w:proofErr w:type="spellEnd"/>
+      <w:r>
+        <w:rPr>
+          <w:rFonts w:ascii="Times New Roman" w:eastAsia="Times New Roman" w:hAnsi="Times New Roman" w:cs="Times New Roman"/>
+          <w:kern w:val="0"/>
+          <w:sz w:val="24"/>
+          <w14:ligatures w14:val="none"/>
+        </w:rPr>
+        <w:t>.</w:t>
+      </w:r>
+    </w:p>
+    <w:p>
+      <w:pPr>
+        <w:spacing w:line="278" w:lineRule="auto"/>
+        <w:jc w:val="left"/>
+      </w:pPr>
+      <w:r>
+        <w:br w:type="page"/>
+      </w:r>
+    </w:p>
+    <w:p>
+      <w:r>
+        <w:lastRenderedPageBreak/>
+        <w:t>Le code du décodeur 7 segments utilis</w:t>
+      </w:r>
+      <w:r>
+        <w:t>e</w:t>
+      </w:r>
+      <w:r>
+        <w:t xml:space="preserve"> l'instruction </w:t>
+      </w:r>
+      <w:r>
+        <w:t>« </w:t>
+      </w:r>
+      <w:proofErr w:type="spellStart"/>
+      <w:r>
+        <w:t>with</w:t>
+      </w:r>
+      <w:proofErr w:type="spellEnd"/>
+      <w:r>
+        <w:t>...select</w:t>
+      </w:r>
+      <w:r>
+        <w:t> ».</w:t>
+      </w:r>
+      <w:r>
+        <w:t xml:space="preserve"> </w:t>
+      </w:r>
+      <w:r>
+        <w:t xml:space="preserve">Grâce à cette </w:t>
+      </w:r>
+      <w:proofErr w:type="spellStart"/>
+      <w:r>
+        <w:t>intruction</w:t>
+      </w:r>
+      <w:proofErr w:type="spellEnd"/>
+      <w:r>
+        <w:t xml:space="preserve"> on</w:t>
+      </w:r>
+      <w:r>
+        <w:t xml:space="preserve"> convertit un signal d'entrée sur 4 bits en une combinaison de 7 bits, où chaque bit correspond à un segment physique (</w:t>
+      </w:r>
+      <w:proofErr w:type="gramStart"/>
+      <w:r>
+        <w:t>de a</w:t>
+      </w:r>
+      <w:proofErr w:type="gramEnd"/>
+      <w:r>
+        <w:t xml:space="preserve"> à g). </w:t>
+      </w:r>
+      <w:r>
+        <w:t>En regardant la CAO électronique de la carte DE10-Lite, l</w:t>
+      </w:r>
+      <w:r>
+        <w:t xml:space="preserve">a logique </w:t>
+      </w:r>
+      <w:r>
+        <w:t>celle ou</w:t>
+      </w:r>
+      <w:r>
+        <w:t xml:space="preserve"> active à l'état bas </w:t>
+      </w:r>
+      <w:r>
+        <w:t>ou le 0, la masse du circuit allume le segment visé. La</w:t>
+      </w:r>
+      <w:r>
+        <w:t xml:space="preserve"> table de correspondance</w:t>
+      </w:r>
+      <w:r>
+        <w:t xml:space="preserve"> traduit</w:t>
+      </w:r>
+      <w:r>
+        <w:t xml:space="preserve"> les valeurs binaires de 0000 à 1111 en caractères alphanumériques allant de 0 à 9 et de A à F.</w:t>
+      </w:r>
+    </w:p>
+    <w:p>
+      <w:r>
+        <w:t xml:space="preserve">Le test </w:t>
+      </w:r>
+      <w:proofErr w:type="spellStart"/>
+      <w:r>
+        <w:t>bench</w:t>
+      </w:r>
+      <w:proofErr w:type="spellEnd"/>
+      <w:r>
+        <w:t xml:space="preserve"> et la simulation associée valident cette table de conversion en appliquant </w:t>
+      </w:r>
+      <w:proofErr w:type="gramStart"/>
+      <w:r>
+        <w:t>des représentati</w:t>
+      </w:r>
+      <w:r>
+        <w:t>on</w:t>
+      </w:r>
+      <w:proofErr w:type="gramEnd"/>
+      <w:r>
+        <w:t xml:space="preserve"> sur l'entrée </w:t>
+      </w:r>
+      <w:proofErr w:type="spellStart"/>
+      <w:r>
+        <w:t>tb_entree</w:t>
+      </w:r>
+      <w:proofErr w:type="spellEnd"/>
+      <w:r>
+        <w:t>. Sur le chronogramme obtenu, on observe</w:t>
+      </w:r>
+      <w:r>
+        <w:t xml:space="preserve"> </w:t>
+      </w:r>
+      <w:r>
+        <w:t>la sortie</w:t>
+      </w:r>
+      <w:r>
+        <w:t xml:space="preserve"> </w:t>
+      </w:r>
+      <w:proofErr w:type="gramStart"/>
+      <w:r>
+        <w:t xml:space="preserve">des </w:t>
+      </w:r>
+      <w:r>
+        <w:t xml:space="preserve"> segments</w:t>
+      </w:r>
+      <w:proofErr w:type="gramEnd"/>
+      <w:r>
+        <w:t xml:space="preserve"> à chaque changement de valeur d'entrée</w:t>
+      </w:r>
+      <w:r>
+        <w:t>.</w:t>
+      </w:r>
+    </w:p>
+    <w:p>
+      <w:r>
+        <w:t xml:space="preserve">Ci-dessous le schéma du composant : </w:t>
+      </w:r>
+    </w:p>
+    <w:p>
+      <w:pPr>
+        <w:keepNext/>
+        <w:jc w:val="center"/>
+      </w:pPr>
+      <w:r>
+        <w:drawing>
+          <wp:inline distT="0" distB="0" distL="0" distR="0" wp14:anchorId="2DD41CA5" wp14:editId="06C0DEAA">
+            <wp:extent cx="5619750" cy="2876550"/>
+            <wp:effectExtent l="0" t="0" r="0" b="0"/>
+            <wp:docPr id="6" name="Image 6"/>
+            <wp:cNvGraphicFramePr>
+              <a:graphicFrameLocks xmlns:a="http://schemas.openxmlformats.org/drawingml/2006/main" noChangeAspect="1"/>
+            </wp:cNvGraphicFramePr>
+            <a:graphic xmlns:a="http://schemas.openxmlformats.org/drawingml/2006/main">
+              <a:graphicData uri="http://schemas.openxmlformats.org/drawingml/2006/picture">
+                <pic:pic xmlns:pic="http://schemas.openxmlformats.org/drawingml/2006/picture">
+                  <pic:nvPicPr>
+                    <pic:cNvPr id="0" name="Picture 7"/>
+                    <pic:cNvPicPr>
+                      <a:picLocks noChangeAspect="1" noChangeArrowheads="1"/>
+                    </pic:cNvPicPr>
+                  </pic:nvPicPr>
+                  <pic:blipFill>
+                    <a:blip r:embed="rId15">
+                      <a:extLst>
+                        <a:ext uri="{28A0092B-C50C-407E-A947-70E740481C1C}">
+                          <a14:useLocalDpi xmlns:a14="http://schemas.microsoft.com/office/drawing/2010/main" val="0"/>
+                        </a:ext>
+                      </a:extLst>
+                    </a:blip>
+                    <a:srcRect/>
+                    <a:stretch>
+                      <a:fillRect/>
+                    </a:stretch>
+                  </pic:blipFill>
+                  <pic:spPr bwMode="auto">
+                    <a:xfrm>
+                      <a:off x="0" y="0"/>
+                      <a:ext cx="5619750" cy="2876550"/>
+                    </a:xfrm>
+                    <a:prstGeom prst="rect">
+                      <a:avLst/>
+                    </a:prstGeom>
+                    <a:noFill/>
+                    <a:ln>
+                      <a:noFill/>
+                    </a:ln>
+                  </pic:spPr>
+                </pic:pic>
+              </a:graphicData>
+            </a:graphic>
+          </wp:inline>
+        </w:drawing>
+      </w:r>
+    </w:p>
+    <w:p>
+      <w:pPr>
+        <w:pStyle w:val="Lgende"/>
+      </w:pPr>
+      <w:r>
+        <w:t xml:space="preserve">Figure </w:t>
+      </w:r>
+      <w:r>
+        <w:fldChar w:fldCharType="begin"/>
+      </w:r>
+      <w:r>
+        <w:instrText xml:space="preserve"> SEQ Figure \* ARABIC </w:instrText>
+      </w:r>
+      <w:r>
+        <w:fldChar w:fldCharType="separate"/>
+      </w:r>
+      <w:r>
+        <w:rPr>
+          <w:noProof/>
+        </w:rPr>
+        <w:t>7</w:t>
+      </w:r>
+      <w:r>
+        <w:fldChar w:fldCharType="end"/>
+      </w:r>
+      <w:r>
+        <w:t xml:space="preserve"> : Schéma de ce composant</w:t>
+      </w:r>
+    </w:p>
+    <w:p/>
+    <w:p>
+      <w:r>
+        <w:t xml:space="preserve">Ci-joint la simulation : </w:t>
+      </w:r>
+    </w:p>
+    <w:p>
+      <w:pPr>
+        <w:keepNext/>
+        <w:jc w:val="center"/>
+      </w:pPr>
+      <w:r>
+        <w:lastRenderedPageBreak/>
+        <w:drawing>
+          <wp:inline distT="0" distB="0" distL="0" distR="0" wp14:anchorId="3B8AE4D5" wp14:editId="0F86B1F3">
+            <wp:extent cx="5760720" cy="3105150"/>
+            <wp:effectExtent l="0" t="0" r="0" b="0"/>
+            <wp:docPr id="12" name="Image 12"/>
+            <wp:cNvGraphicFramePr>
+              <a:graphicFrameLocks xmlns:a="http://schemas.openxmlformats.org/drawingml/2006/main" noChangeAspect="1"/>
+            </wp:cNvGraphicFramePr>
+            <a:graphic xmlns:a="http://schemas.openxmlformats.org/drawingml/2006/main">
+              <a:graphicData uri="http://schemas.openxmlformats.org/drawingml/2006/picture">
+                <pic:pic xmlns:pic="http://schemas.openxmlformats.org/drawingml/2006/picture">
+                  <pic:nvPicPr>
+                    <pic:cNvPr id="0" name="Picture 19"/>
+                    <pic:cNvPicPr>
+                      <a:picLocks noChangeAspect="1" noChangeArrowheads="1"/>
+                    </pic:cNvPicPr>
+                  </pic:nvPicPr>
+                  <pic:blipFill>
+                    <a:blip r:embed="rId16" cstate="print">
+                      <a:extLst>
+                        <a:ext uri="{28A0092B-C50C-407E-A947-70E740481C1C}">
+                          <a14:useLocalDpi xmlns:a14="http://schemas.microsoft.com/office/drawing/2010/main" val="0"/>
+                        </a:ext>
+                      </a:extLst>
+                    </a:blip>
+                    <a:srcRect/>
+                    <a:stretch>
+                      <a:fillRect/>
+                    </a:stretch>
+                  </pic:blipFill>
+                  <pic:spPr bwMode="auto">
+                    <a:xfrm>
+                      <a:off x="0" y="0"/>
+                      <a:ext cx="5760720" cy="3105150"/>
+                    </a:xfrm>
+                    <a:prstGeom prst="rect">
+                      <a:avLst/>
+                    </a:prstGeom>
+                    <a:noFill/>
+                    <a:ln>
+                      <a:noFill/>
+                    </a:ln>
+                  </pic:spPr>
+                </pic:pic>
+              </a:graphicData>
+            </a:graphic>
+          </wp:inline>
+        </w:drawing>
+      </w:r>
+    </w:p>
+    <w:p>
+      <w:pPr>
+        <w:pStyle w:val="Lgende"/>
+      </w:pPr>
+      <w:r>
+        <w:t xml:space="preserve">Figure </w:t>
+      </w:r>
+      <w:r>
+        <w:fldChar w:fldCharType="begin"/>
+      </w:r>
+      <w:r>
+        <w:instrText xml:space="preserve"> SEQ Figure \* ARABIC </w:instrText>
+      </w:r>
+      <w:r>
+        <w:fldChar w:fldCharType="separate"/>
+      </w:r>
+      <w:r>
+        <w:rPr>
+          <w:noProof/>
+        </w:rPr>
+        <w:t>8</w:t>
+      </w:r>
+      <w:r>
+        <w:fldChar w:fldCharType="end"/>
+      </w:r>
+      <w:r>
+        <w:t xml:space="preserve"> : Simulation décodeur 7 segment</w:t>
       </w:r>
     </w:p>
     <w:p/>
     <w:p/>
-    <w:p/>
+    <w:p>
+      <w:pPr>
+        <w:rPr>
+          <w:rFonts w:asciiTheme="majorHAnsi" w:eastAsia="Times New Roman" w:hAnsiTheme="majorHAnsi" w:cstheme="majorBidi"/>
+          <w:color w:val="000000" w:themeColor="text1"/>
+          <w:sz w:val="28"/>
+          <w:szCs w:val="40"/>
+          <w:u w:val="single"/>
+        </w:rPr>
+      </w:pPr>
+    </w:p>
     <w:p>
       <w:pPr>
         <w:spacing w:line="278" w:lineRule="auto"/>
@@ -2542,6 +3292,7 @@
           <w:u w:val="single"/>
         </w:rPr>
       </w:pPr>
+      <w:bookmarkStart w:id="13" w:name="_Toc219740220"/>
       <w:r>
         <w:rPr>
           <w:rFonts w:eastAsia="Times New Roman"/>
@@ -2560,7 +3311,6 @@
           <w:rFonts w:eastAsia="Times New Roman"/>
         </w:rPr>
       </w:pPr>
-      <w:bookmarkStart w:id="9" w:name="_Toc219740220"/>
       <w:r>
         <w:rPr>
           <w:rFonts w:eastAsia="Times New Roman"/>
@@ -2568,7 +3318,7 @@
         <w:lastRenderedPageBreak/>
         <w:t>Tables des figures</w:t>
       </w:r>
-      <w:bookmarkEnd w:id="9"/>
+      <w:bookmarkEnd w:id="13"/>
     </w:p>
     <w:p>
       <w:pPr>
@@ -2609,7 +3359,7 @@
         </w:rPr>
         <w:fldChar w:fldCharType="separate"/>
       </w:r>
-      <w:hyperlink w:anchor="_Toc219739472" w:history="1">
+      <w:hyperlink w:anchor="_Toc220178366" w:history="1">
         <w:r>
           <w:rPr>
             <w:rStyle w:val="Lienhypertexte"/>
@@ -2636,7 +3386,7 @@
             <w:noProof/>
             <w:webHidden/>
           </w:rPr>
-          <w:instrText xml:space="preserve"> PAGEREF _Toc219739472 \h </w:instrText>
+          <w:instrText xml:space="preserve"> PAGEREF _Toc220178366 \h </w:instrText>
         </w:r>
         <w:r>
           <w:rPr>
@@ -2656,7 +3406,7 @@
             <w:noProof/>
             <w:webHidden/>
           </w:rPr>
-          <w:t>7</w:t>
+          <w:t>6</w:t>
         </w:r>
         <w:r>
           <w:rPr>
@@ -2679,7 +3429,7 @@
           <w:sz w:val="24"/>
         </w:rPr>
       </w:pPr>
-      <w:hyperlink w:anchor="_Toc219739473" w:history="1">
+      <w:hyperlink w:anchor="_Toc220178367" w:history="1">
         <w:r>
           <w:rPr>
             <w:rStyle w:val="Lienhypertexte"/>
@@ -2706,7 +3456,7 @@
             <w:noProof/>
             <w:webHidden/>
           </w:rPr>
-          <w:instrText xml:space="preserve"> PAGEREF _Toc219739473 \h </w:instrText>
+          <w:instrText xml:space="preserve"> PAGEREF _Toc220178367 \h </w:instrText>
         </w:r>
         <w:r>
           <w:rPr>
@@ -2726,7 +3476,7 @@
             <w:noProof/>
             <w:webHidden/>
           </w:rPr>
-          <w:t>9</w:t>
+          <w:t>8</w:t>
         </w:r>
         <w:r>
           <w:rPr>
@@ -2739,6 +3489,286 @@
     </w:p>
     <w:p>
       <w:pPr>
+        <w:pStyle w:val="Tabledesillustrations"/>
+        <w:tabs>
+          <w:tab w:val="right" w:leader="dot" w:pos="9062"/>
+        </w:tabs>
+        <w:rPr>
+          <w:rFonts w:asciiTheme="minorHAnsi" w:eastAsiaTheme="minorEastAsia" w:hAnsiTheme="minorHAnsi"/>
+          <w:noProof/>
+          <w:sz w:val="24"/>
+        </w:rPr>
+      </w:pPr>
+      <w:hyperlink w:anchor="_Toc220178368" w:history="1">
+        <w:r>
+          <w:rPr>
+            <w:rStyle w:val="Lienhypertexte"/>
+            <w:noProof/>
+          </w:rPr>
+          <w:t>Figure 3 : Simulation bascule D</w:t>
+        </w:r>
+        <w:r>
+          <w:rPr>
+            <w:noProof/>
+            <w:webHidden/>
+          </w:rPr>
+          <w:tab/>
+        </w:r>
+        <w:r>
+          <w:rPr>
+            <w:noProof/>
+            <w:webHidden/>
+          </w:rPr>
+          <w:fldChar w:fldCharType="begin"/>
+        </w:r>
+        <w:r>
+          <w:rPr>
+            <w:noProof/>
+            <w:webHidden/>
+          </w:rPr>
+          <w:instrText xml:space="preserve"> PAGEREF _Toc220178368 \h </w:instrText>
+        </w:r>
+        <w:r>
+          <w:rPr>
+            <w:noProof/>
+            <w:webHidden/>
+          </w:rPr>
+        </w:r>
+        <w:r>
+          <w:rPr>
+            <w:noProof/>
+            <w:webHidden/>
+          </w:rPr>
+          <w:fldChar w:fldCharType="separate"/>
+        </w:r>
+        <w:r>
+          <w:rPr>
+            <w:noProof/>
+            <w:webHidden/>
+          </w:rPr>
+          <w:t>10</w:t>
+        </w:r>
+        <w:r>
+          <w:rPr>
+            <w:noProof/>
+            <w:webHidden/>
+          </w:rPr>
+          <w:fldChar w:fldCharType="end"/>
+        </w:r>
+      </w:hyperlink>
+    </w:p>
+    <w:p>
+      <w:pPr>
+        <w:pStyle w:val="Tabledesillustrations"/>
+        <w:tabs>
+          <w:tab w:val="right" w:leader="dot" w:pos="9062"/>
+        </w:tabs>
+        <w:rPr>
+          <w:rFonts w:asciiTheme="minorHAnsi" w:eastAsiaTheme="minorEastAsia" w:hAnsiTheme="minorHAnsi"/>
+          <w:noProof/>
+          <w:sz w:val="24"/>
+        </w:rPr>
+      </w:pPr>
+      <w:hyperlink w:anchor="_Toc220178369" w:history="1">
+        <w:r>
+          <w:rPr>
+            <w:rStyle w:val="Lienhypertexte"/>
+            <w:noProof/>
+          </w:rPr>
+          <w:t>Figure 4 : Simulation registre à changement parallèle</w:t>
+        </w:r>
+        <w:r>
+          <w:rPr>
+            <w:noProof/>
+            <w:webHidden/>
+          </w:rPr>
+          <w:tab/>
+        </w:r>
+        <w:r>
+          <w:rPr>
+            <w:noProof/>
+            <w:webHidden/>
+          </w:rPr>
+          <w:fldChar w:fldCharType="begin"/>
+        </w:r>
+        <w:r>
+          <w:rPr>
+            <w:noProof/>
+            <w:webHidden/>
+          </w:rPr>
+          <w:instrText xml:space="preserve"> PAGEREF _Toc220178369 \h </w:instrText>
+        </w:r>
+        <w:r>
+          <w:rPr>
+            <w:noProof/>
+            <w:webHidden/>
+          </w:rPr>
+        </w:r>
+        <w:r>
+          <w:rPr>
+            <w:noProof/>
+            <w:webHidden/>
+          </w:rPr>
+          <w:fldChar w:fldCharType="separate"/>
+        </w:r>
+        <w:r>
+          <w:rPr>
+            <w:noProof/>
+            <w:webHidden/>
+          </w:rPr>
+          <w:t>11</w:t>
+        </w:r>
+        <w:r>
+          <w:rPr>
+            <w:noProof/>
+            <w:webHidden/>
+          </w:rPr>
+          <w:fldChar w:fldCharType="end"/>
+        </w:r>
+      </w:hyperlink>
+    </w:p>
+    <w:p>
+      <w:pPr>
+        <w:pStyle w:val="Tabledesillustrations"/>
+        <w:tabs>
+          <w:tab w:val="right" w:leader="dot" w:pos="9062"/>
+        </w:tabs>
+        <w:rPr>
+          <w:rFonts w:asciiTheme="minorHAnsi" w:eastAsiaTheme="minorEastAsia" w:hAnsiTheme="minorHAnsi"/>
+          <w:noProof/>
+          <w:sz w:val="24"/>
+        </w:rPr>
+      </w:pPr>
+      <w:hyperlink w:anchor="_Toc220178370" w:history="1">
+        <w:r>
+          <w:rPr>
+            <w:rStyle w:val="Lienhypertexte"/>
+            <w:noProof/>
+          </w:rPr>
+          <w:t>Figure 5 : Logigramme du stockage code</w:t>
+        </w:r>
+        <w:r>
+          <w:rPr>
+            <w:noProof/>
+            <w:webHidden/>
+          </w:rPr>
+          <w:tab/>
+        </w:r>
+        <w:r>
+          <w:rPr>
+            <w:noProof/>
+            <w:webHidden/>
+          </w:rPr>
+          <w:fldChar w:fldCharType="begin"/>
+        </w:r>
+        <w:r>
+          <w:rPr>
+            <w:noProof/>
+            <w:webHidden/>
+          </w:rPr>
+          <w:instrText xml:space="preserve"> PAGEREF _Toc220178370 \h </w:instrText>
+        </w:r>
+        <w:r>
+          <w:rPr>
+            <w:noProof/>
+            <w:webHidden/>
+          </w:rPr>
+        </w:r>
+        <w:r>
+          <w:rPr>
+            <w:noProof/>
+            <w:webHidden/>
+          </w:rPr>
+          <w:fldChar w:fldCharType="separate"/>
+        </w:r>
+        <w:r>
+          <w:rPr>
+            <w:noProof/>
+            <w:webHidden/>
+          </w:rPr>
+          <w:t>12</w:t>
+        </w:r>
+        <w:r>
+          <w:rPr>
+            <w:noProof/>
+            <w:webHidden/>
+          </w:rPr>
+          <w:fldChar w:fldCharType="end"/>
+        </w:r>
+      </w:hyperlink>
+    </w:p>
+    <w:p>
+      <w:pPr>
+        <w:pStyle w:val="Tabledesillustrations"/>
+        <w:tabs>
+          <w:tab w:val="right" w:leader="dot" w:pos="9062"/>
+        </w:tabs>
+        <w:rPr>
+          <w:rFonts w:asciiTheme="minorHAnsi" w:eastAsiaTheme="minorEastAsia" w:hAnsiTheme="minorHAnsi"/>
+          <w:noProof/>
+          <w:sz w:val="24"/>
+        </w:rPr>
+      </w:pPr>
+      <w:hyperlink w:anchor="_Toc220178371" w:history="1">
+        <w:r>
+          <w:rPr>
+            <w:rStyle w:val="Lienhypertexte"/>
+            <w:noProof/>
+          </w:rPr>
+          <w:t>Figure 6 : Code extrait top module permettant le stockage du code</w:t>
+        </w:r>
+        <w:r>
+          <w:rPr>
+            <w:noProof/>
+            <w:webHidden/>
+          </w:rPr>
+          <w:tab/>
+        </w:r>
+        <w:r>
+          <w:rPr>
+            <w:noProof/>
+            <w:webHidden/>
+          </w:rPr>
+          <w:fldChar w:fldCharType="begin"/>
+        </w:r>
+        <w:r>
+          <w:rPr>
+            <w:noProof/>
+            <w:webHidden/>
+          </w:rPr>
+          <w:instrText xml:space="preserve"> PAGEREF _Toc220178371 \h </w:instrText>
+        </w:r>
+        <w:r>
+          <w:rPr>
+            <w:noProof/>
+            <w:webHidden/>
+          </w:rPr>
+        </w:r>
+        <w:r>
+          <w:rPr>
+            <w:noProof/>
+            <w:webHidden/>
+          </w:rPr>
+          <w:fldChar w:fldCharType="separate"/>
+        </w:r>
+        <w:r>
+          <w:rPr>
+            <w:noProof/>
+            <w:webHidden/>
+          </w:rPr>
+          <w:t>13</w:t>
+        </w:r>
+        <w:r>
+          <w:rPr>
+            <w:noProof/>
+            <w:webHidden/>
+          </w:rPr>
+          <w:fldChar w:fldCharType="end"/>
+        </w:r>
+      </w:hyperlink>
+    </w:p>
+    <w:p>
+      <w:pPr>
         <w:rPr>
           <w:rFonts w:ascii="Times New Roman" w:eastAsia="Times New Roman" w:hAnsi="Times New Roman" w:cs="Times New Roman"/>
           <w:kern w:val="0"/>
@@ -2762,9 +3792,9 @@
       </w:r>
     </w:p>
     <w:sectPr>
-      <w:headerReference w:type="default" r:id="rId15"/>
-      <w:footerReference w:type="default" r:id="rId16"/>
-      <w:headerReference w:type="first" r:id="rId17"/>
+      <w:headerReference w:type="default" r:id="rId17"/>
+      <w:footerReference w:type="default" r:id="rId18"/>
+      <w:headerReference w:type="first" r:id="rId19"/>
       <w:pgSz w:w="11906" w:h="16838"/>
       <w:pgMar w:top="1417" w:right="1417" w:bottom="1417" w:left="1417" w:header="708" w:footer="708" w:gutter="0"/>
       <w:cols w:space="708"/>
@@ -3003,7 +4033,7 @@
         <v:path o:extrusionok="f" gradientshapeok="t" o:connecttype="rect"/>
         <o:lock v:ext="edit" aspectratio="t"/>
       </v:shapetype>
-      <v:shape id="_x0000_i1068" type="#_x0000_t75" style="width:11.25pt;height:11.25pt" o:bullet="t">
+      <v:shape id="_x0000_i1054" type="#_x0000_t75" style="width:11.2pt;height:11.2pt" o:bullet="t">
         <v:imagedata r:id="rId1" o:title="msoEA91"/>
       </v:shape>
     </w:pict>
@@ -3144,6 +4174,155 @@
     </w:lvl>
   </w:abstractNum>
   <w:abstractNum w:abstractNumId="2" w15:restartNumberingAfterBreak="0">
+    <w:nsid w:val="043D57FE"/>
+    <w:multiLevelType w:val="multilevel"/>
+    <w:tmpl w:val="EBACBBBA"/>
+    <w:lvl w:ilvl="0">
+      <w:start w:val="1"/>
+      <w:numFmt w:val="bullet"/>
+      <w:lvlText w:val=""/>
+      <w:lvlJc w:val="left"/>
+      <w:pPr>
+        <w:tabs>
+          <w:tab w:val="num" w:pos="720"/>
+        </w:tabs>
+        <w:ind w:left="720" w:hanging="360"/>
+      </w:pPr>
+      <w:rPr>
+        <w:rFonts w:ascii="Symbol" w:hAnsi="Symbol" w:hint="default"/>
+        <w:sz w:val="20"/>
+      </w:rPr>
+    </w:lvl>
+    <w:lvl w:ilvl="1">
+      <w:start w:val="1"/>
+      <w:numFmt w:val="bullet"/>
+      <w:lvlText w:val="o"/>
+      <w:lvlJc w:val="left"/>
+      <w:pPr>
+        <w:tabs>
+          <w:tab w:val="num" w:pos="1440"/>
+        </w:tabs>
+        <w:ind w:left="1440" w:hanging="360"/>
+      </w:pPr>
+      <w:rPr>
+        <w:rFonts w:ascii="Courier New" w:hAnsi="Courier New" w:hint="default"/>
+        <w:sz w:val="20"/>
+      </w:rPr>
+    </w:lvl>
+    <w:lvl w:ilvl="2" w:tentative="1">
+      <w:start w:val="1"/>
+      <w:numFmt w:val="bullet"/>
+      <w:lvlText w:val=""/>
+      <w:lvlJc w:val="left"/>
+      <w:pPr>
+        <w:tabs>
+          <w:tab w:val="num" w:pos="2160"/>
+        </w:tabs>
+        <w:ind w:left="2160" w:hanging="360"/>
+      </w:pPr>
+      <w:rPr>
+        <w:rFonts w:ascii="Wingdings" w:hAnsi="Wingdings" w:hint="default"/>
+        <w:sz w:val="20"/>
+      </w:rPr>
+    </w:lvl>
+    <w:lvl w:ilvl="3" w:tentative="1">
+      <w:start w:val="1"/>
+      <w:numFmt w:val="bullet"/>
+      <w:lvlText w:val=""/>
+      <w:lvlJc w:val="left"/>
+      <w:pPr>
+        <w:tabs>
+          <w:tab w:val="num" w:pos="2880"/>
+        </w:tabs>
+        <w:ind w:left="2880" w:hanging="360"/>
+      </w:pPr>
+      <w:rPr>
+        <w:rFonts w:ascii="Wingdings" w:hAnsi="Wingdings" w:hint="default"/>
+        <w:sz w:val="20"/>
+      </w:rPr>
+    </w:lvl>
+    <w:lvl w:ilvl="4" w:tentative="1">
+      <w:start w:val="1"/>
+      <w:numFmt w:val="bullet"/>
+      <w:lvlText w:val=""/>
+      <w:lvlJc w:val="left"/>
+      <w:pPr>
+        <w:tabs>
+          <w:tab w:val="num" w:pos="3600"/>
+        </w:tabs>
+        <w:ind w:left="3600" w:hanging="360"/>
+      </w:pPr>
+      <w:rPr>
+        <w:rFonts w:ascii="Wingdings" w:hAnsi="Wingdings" w:hint="default"/>
+        <w:sz w:val="20"/>
+      </w:rPr>
+    </w:lvl>
+    <w:lvl w:ilvl="5" w:tentative="1">
+      <w:start w:val="1"/>
+      <w:numFmt w:val="bullet"/>
+      <w:lvlText w:val=""/>
+      <w:lvlJc w:val="left"/>
+      <w:pPr>
+        <w:tabs>
+          <w:tab w:val="num" w:pos="4320"/>
+        </w:tabs>
+        <w:ind w:left="4320" w:hanging="360"/>
+      </w:pPr>
+      <w:rPr>
+        <w:rFonts w:ascii="Wingdings" w:hAnsi="Wingdings" w:hint="default"/>
+        <w:sz w:val="20"/>
+      </w:rPr>
+    </w:lvl>
+    <w:lvl w:ilvl="6" w:tentative="1">
+      <w:start w:val="1"/>
+      <w:numFmt w:val="bullet"/>
+      <w:lvlText w:val=""/>
+      <w:lvlJc w:val="left"/>
+      <w:pPr>
+        <w:tabs>
+          <w:tab w:val="num" w:pos="5040"/>
+        </w:tabs>
+        <w:ind w:left="5040" w:hanging="360"/>
+      </w:pPr>
+      <w:rPr>
+        <w:rFonts w:ascii="Wingdings" w:hAnsi="Wingdings" w:hint="default"/>
+        <w:sz w:val="20"/>
+      </w:rPr>
+    </w:lvl>
+    <w:lvl w:ilvl="7" w:tentative="1">
+      <w:start w:val="1"/>
+      <w:numFmt w:val="bullet"/>
+      <w:lvlText w:val=""/>
+      <w:lvlJc w:val="left"/>
+      <w:pPr>
+        <w:tabs>
+          <w:tab w:val="num" w:pos="5760"/>
+        </w:tabs>
+        <w:ind w:left="5760" w:hanging="360"/>
+      </w:pPr>
+      <w:rPr>
+        <w:rFonts w:ascii="Wingdings" w:hAnsi="Wingdings" w:hint="default"/>
+        <w:sz w:val="20"/>
+      </w:rPr>
+    </w:lvl>
+    <w:lvl w:ilvl="8" w:tentative="1">
+      <w:start w:val="1"/>
+      <w:numFmt w:val="bullet"/>
+      <w:lvlText w:val=""/>
+      <w:lvlJc w:val="left"/>
+      <w:pPr>
+        <w:tabs>
+          <w:tab w:val="num" w:pos="6480"/>
+        </w:tabs>
+        <w:ind w:left="6480" w:hanging="360"/>
+      </w:pPr>
+      <w:rPr>
+        <w:rFonts w:ascii="Wingdings" w:hAnsi="Wingdings" w:hint="default"/>
+        <w:sz w:val="20"/>
+      </w:rPr>
+    </w:lvl>
+  </w:abstractNum>
+  <w:abstractNum w:abstractNumId="3" w15:restartNumberingAfterBreak="0">
     <w:nsid w:val="059A1DCD"/>
     <w:multiLevelType w:val="hybridMultilevel"/>
     <w:tmpl w:val="04A21C8C"/>
@@ -3256,7 +4435,7 @@
       </w:rPr>
     </w:lvl>
   </w:abstractNum>
-  <w:abstractNum w:abstractNumId="3" w15:restartNumberingAfterBreak="0">
+  <w:abstractNum w:abstractNumId="4" w15:restartNumberingAfterBreak="0">
     <w:nsid w:val="065810FD"/>
     <w:multiLevelType w:val="multilevel"/>
     <w:tmpl w:val="F5627CE8"/>
@@ -3405,7 +4584,7 @@
       </w:rPr>
     </w:lvl>
   </w:abstractNum>
-  <w:abstractNum w:abstractNumId="4" w15:restartNumberingAfterBreak="0">
+  <w:abstractNum w:abstractNumId="5" w15:restartNumberingAfterBreak="0">
     <w:nsid w:val="06837FCC"/>
     <w:multiLevelType w:val="hybridMultilevel"/>
     <w:tmpl w:val="1A769A0E"/>
@@ -3545,7 +4724,7 @@
       </w:rPr>
     </w:lvl>
   </w:abstractNum>
-  <w:abstractNum w:abstractNumId="5" w15:restartNumberingAfterBreak="0">
+  <w:abstractNum w:abstractNumId="6" w15:restartNumberingAfterBreak="0">
     <w:nsid w:val="06F35879"/>
     <w:multiLevelType w:val="hybridMultilevel"/>
     <w:tmpl w:val="2BA4A198"/>
@@ -3658,7 +4837,7 @@
       </w:rPr>
     </w:lvl>
   </w:abstractNum>
-  <w:abstractNum w:abstractNumId="6" w15:restartNumberingAfterBreak="0">
+  <w:abstractNum w:abstractNumId="7" w15:restartNumberingAfterBreak="0">
     <w:nsid w:val="0DB32D03"/>
     <w:multiLevelType w:val="hybridMultilevel"/>
     <w:tmpl w:val="926CAEEA"/>
@@ -3771,7 +4950,7 @@
       </w:rPr>
     </w:lvl>
   </w:abstractNum>
-  <w:abstractNum w:abstractNumId="7" w15:restartNumberingAfterBreak="0">
+  <w:abstractNum w:abstractNumId="8" w15:restartNumberingAfterBreak="0">
     <w:nsid w:val="14077FB6"/>
     <w:multiLevelType w:val="multilevel"/>
     <w:tmpl w:val="96E2D7A6"/>
@@ -3920,7 +5099,7 @@
       </w:rPr>
     </w:lvl>
   </w:abstractNum>
-  <w:abstractNum w:abstractNumId="8" w15:restartNumberingAfterBreak="0">
+  <w:abstractNum w:abstractNumId="9" w15:restartNumberingAfterBreak="0">
     <w:nsid w:val="15297312"/>
     <w:multiLevelType w:val="hybridMultilevel"/>
     <w:tmpl w:val="B2C0FEC8"/>
@@ -4032,7 +5211,7 @@
       </w:rPr>
     </w:lvl>
   </w:abstractNum>
-  <w:abstractNum w:abstractNumId="9" w15:restartNumberingAfterBreak="0">
+  <w:abstractNum w:abstractNumId="10" w15:restartNumberingAfterBreak="0">
     <w:nsid w:val="1D255796"/>
     <w:multiLevelType w:val="hybridMultilevel"/>
     <w:tmpl w:val="32BE23A6"/>
@@ -4121,7 +5300,7 @@
       </w:pPr>
     </w:lvl>
   </w:abstractNum>
-  <w:abstractNum w:abstractNumId="10" w15:restartNumberingAfterBreak="0">
+  <w:abstractNum w:abstractNumId="11" w15:restartNumberingAfterBreak="0">
     <w:nsid w:val="1DA8752B"/>
     <w:multiLevelType w:val="multilevel"/>
     <w:tmpl w:val="74DECD18"/>
@@ -4270,7 +5449,7 @@
       </w:rPr>
     </w:lvl>
   </w:abstractNum>
-  <w:abstractNum w:abstractNumId="11" w15:restartNumberingAfterBreak="0">
+  <w:abstractNum w:abstractNumId="12" w15:restartNumberingAfterBreak="0">
     <w:nsid w:val="2421397E"/>
     <w:multiLevelType w:val="hybridMultilevel"/>
     <w:tmpl w:val="A4BC29A4"/>
@@ -4356,7 +5535,7 @@
       </w:pPr>
     </w:lvl>
   </w:abstractNum>
-  <w:abstractNum w:abstractNumId="12" w15:restartNumberingAfterBreak="0">
+  <w:abstractNum w:abstractNumId="13" w15:restartNumberingAfterBreak="0">
     <w:nsid w:val="24F32536"/>
     <w:multiLevelType w:val="multilevel"/>
     <w:tmpl w:val="868E6BF8"/>
@@ -4505,7 +5684,7 @@
       </w:rPr>
     </w:lvl>
   </w:abstractNum>
-  <w:abstractNum w:abstractNumId="13" w15:restartNumberingAfterBreak="0">
+  <w:abstractNum w:abstractNumId="14" w15:restartNumberingAfterBreak="0">
     <w:nsid w:val="25020511"/>
     <w:multiLevelType w:val="multilevel"/>
     <w:tmpl w:val="25A0CDDA"/>
@@ -4654,7 +5833,7 @@
       </w:rPr>
     </w:lvl>
   </w:abstractNum>
-  <w:abstractNum w:abstractNumId="14" w15:restartNumberingAfterBreak="0">
+  <w:abstractNum w:abstractNumId="15" w15:restartNumberingAfterBreak="0">
     <w:nsid w:val="26565AAC"/>
     <w:multiLevelType w:val="multilevel"/>
     <w:tmpl w:val="903E4268"/>
@@ -4803,7 +5982,7 @@
       </w:rPr>
     </w:lvl>
   </w:abstractNum>
-  <w:abstractNum w:abstractNumId="15" w15:restartNumberingAfterBreak="0">
+  <w:abstractNum w:abstractNumId="16" w15:restartNumberingAfterBreak="0">
     <w:nsid w:val="27E24064"/>
     <w:multiLevelType w:val="hybridMultilevel"/>
     <w:tmpl w:val="FBD0065E"/>
@@ -4916,7 +6095,7 @@
       </w:rPr>
     </w:lvl>
   </w:abstractNum>
-  <w:abstractNum w:abstractNumId="16" w15:restartNumberingAfterBreak="0">
+  <w:abstractNum w:abstractNumId="17" w15:restartNumberingAfterBreak="0">
     <w:nsid w:val="2E693B5E"/>
     <w:multiLevelType w:val="multilevel"/>
     <w:tmpl w:val="82683E86"/>
@@ -5065,7 +6244,7 @@
       </w:rPr>
     </w:lvl>
   </w:abstractNum>
-  <w:abstractNum w:abstractNumId="17" w15:restartNumberingAfterBreak="0">
+  <w:abstractNum w:abstractNumId="18" w15:restartNumberingAfterBreak="0">
     <w:nsid w:val="32757B90"/>
     <w:multiLevelType w:val="multilevel"/>
     <w:tmpl w:val="4484D188"/>
@@ -5214,7 +6393,7 @@
       </w:rPr>
     </w:lvl>
   </w:abstractNum>
-  <w:abstractNum w:abstractNumId="18" w15:restartNumberingAfterBreak="0">
+  <w:abstractNum w:abstractNumId="19" w15:restartNumberingAfterBreak="0">
     <w:nsid w:val="3EDA6BA0"/>
     <w:multiLevelType w:val="multilevel"/>
     <w:tmpl w:val="62C810BE"/>
@@ -5363,7 +6542,7 @@
       </w:rPr>
     </w:lvl>
   </w:abstractNum>
-  <w:abstractNum w:abstractNumId="19" w15:restartNumberingAfterBreak="0">
+  <w:abstractNum w:abstractNumId="20" w15:restartNumberingAfterBreak="0">
     <w:nsid w:val="3F415D2E"/>
     <w:multiLevelType w:val="multilevel"/>
     <w:tmpl w:val="E8A46714"/>
@@ -5512,7 +6691,7 @@
       </w:rPr>
     </w:lvl>
   </w:abstractNum>
-  <w:abstractNum w:abstractNumId="20" w15:restartNumberingAfterBreak="0">
+  <w:abstractNum w:abstractNumId="21" w15:restartNumberingAfterBreak="0">
     <w:nsid w:val="3F71196F"/>
     <w:multiLevelType w:val="multilevel"/>
     <w:tmpl w:val="040C0027"/>
@@ -5607,7 +6786,7 @@
       </w:pPr>
     </w:lvl>
   </w:abstractNum>
-  <w:abstractNum w:abstractNumId="21" w15:restartNumberingAfterBreak="0">
+  <w:abstractNum w:abstractNumId="22" w15:restartNumberingAfterBreak="0">
     <w:nsid w:val="448F6C52"/>
     <w:multiLevelType w:val="hybridMultilevel"/>
     <w:tmpl w:val="C4E41AF8"/>
@@ -5696,7 +6875,7 @@
       </w:pPr>
     </w:lvl>
   </w:abstractNum>
-  <w:abstractNum w:abstractNumId="22" w15:restartNumberingAfterBreak="0">
+  <w:abstractNum w:abstractNumId="23" w15:restartNumberingAfterBreak="0">
     <w:nsid w:val="45034641"/>
     <w:multiLevelType w:val="multilevel"/>
     <w:tmpl w:val="022EDBF4"/>
@@ -5845,7 +7024,7 @@
       </w:rPr>
     </w:lvl>
   </w:abstractNum>
-  <w:abstractNum w:abstractNumId="23" w15:restartNumberingAfterBreak="0">
+  <w:abstractNum w:abstractNumId="24" w15:restartNumberingAfterBreak="0">
     <w:nsid w:val="48F47E7C"/>
     <w:multiLevelType w:val="multilevel"/>
     <w:tmpl w:val="7EA62C28"/>
@@ -5994,7 +7173,7 @@
       </w:rPr>
     </w:lvl>
   </w:abstractNum>
-  <w:abstractNum w:abstractNumId="24" w15:restartNumberingAfterBreak="0">
+  <w:abstractNum w:abstractNumId="25" w15:restartNumberingAfterBreak="0">
     <w:nsid w:val="495D2815"/>
     <w:multiLevelType w:val="multilevel"/>
     <w:tmpl w:val="DEB2050E"/>
@@ -6143,7 +7322,7 @@
       </w:rPr>
     </w:lvl>
   </w:abstractNum>
-  <w:abstractNum w:abstractNumId="25" w15:restartNumberingAfterBreak="0">
+  <w:abstractNum w:abstractNumId="26" w15:restartNumberingAfterBreak="0">
     <w:nsid w:val="498D7AC4"/>
     <w:multiLevelType w:val="hybridMultilevel"/>
     <w:tmpl w:val="F72CE202"/>
@@ -6256,7 +7435,7 @@
       </w:rPr>
     </w:lvl>
   </w:abstractNum>
-  <w:abstractNum w:abstractNumId="26" w15:restartNumberingAfterBreak="0">
+  <w:abstractNum w:abstractNumId="27" w15:restartNumberingAfterBreak="0">
     <w:nsid w:val="4F176738"/>
     <w:multiLevelType w:val="hybridMultilevel"/>
     <w:tmpl w:val="01C4F92E"/>
@@ -6369,7 +7548,7 @@
       </w:rPr>
     </w:lvl>
   </w:abstractNum>
-  <w:abstractNum w:abstractNumId="27" w15:restartNumberingAfterBreak="0">
+  <w:abstractNum w:abstractNumId="28" w15:restartNumberingAfterBreak="0">
     <w:nsid w:val="4F6517AF"/>
     <w:multiLevelType w:val="hybridMultilevel"/>
     <w:tmpl w:val="A5D2E87E"/>
@@ -6482,7 +7661,7 @@
       </w:rPr>
     </w:lvl>
   </w:abstractNum>
-  <w:abstractNum w:abstractNumId="28" w15:restartNumberingAfterBreak="0">
+  <w:abstractNum w:abstractNumId="29" w15:restartNumberingAfterBreak="0">
     <w:nsid w:val="55770E8E"/>
     <w:multiLevelType w:val="multilevel"/>
     <w:tmpl w:val="29E6AF88"/>
@@ -6631,7 +7810,7 @@
       </w:rPr>
     </w:lvl>
   </w:abstractNum>
-  <w:abstractNum w:abstractNumId="29" w15:restartNumberingAfterBreak="0">
+  <w:abstractNum w:abstractNumId="30" w15:restartNumberingAfterBreak="0">
     <w:nsid w:val="583658E1"/>
     <w:multiLevelType w:val="multilevel"/>
     <w:tmpl w:val="EF24C086"/>
@@ -6780,7 +7959,7 @@
       </w:rPr>
     </w:lvl>
   </w:abstractNum>
-  <w:abstractNum w:abstractNumId="30" w15:restartNumberingAfterBreak="0">
+  <w:abstractNum w:abstractNumId="31" w15:restartNumberingAfterBreak="0">
     <w:nsid w:val="588D641C"/>
     <w:multiLevelType w:val="multilevel"/>
     <w:tmpl w:val="A3F0D7D2"/>
@@ -6893,7 +8072,7 @@
       </w:pPr>
     </w:lvl>
   </w:abstractNum>
-  <w:abstractNum w:abstractNumId="31" w15:restartNumberingAfterBreak="0">
+  <w:abstractNum w:abstractNumId="32" w15:restartNumberingAfterBreak="0">
     <w:nsid w:val="5B0C248E"/>
     <w:multiLevelType w:val="multilevel"/>
     <w:tmpl w:val="0BE0D904"/>
@@ -7042,7 +8221,7 @@
       </w:rPr>
     </w:lvl>
   </w:abstractNum>
-  <w:abstractNum w:abstractNumId="32" w15:restartNumberingAfterBreak="0">
+  <w:abstractNum w:abstractNumId="33" w15:restartNumberingAfterBreak="0">
     <w:nsid w:val="60AB3F91"/>
     <w:multiLevelType w:val="multilevel"/>
     <w:tmpl w:val="C862CBC2"/>
@@ -7191,7 +8370,7 @@
       </w:rPr>
     </w:lvl>
   </w:abstractNum>
-  <w:abstractNum w:abstractNumId="33" w15:restartNumberingAfterBreak="0">
+  <w:abstractNum w:abstractNumId="34" w15:restartNumberingAfterBreak="0">
     <w:nsid w:val="62CE31C5"/>
     <w:multiLevelType w:val="hybridMultilevel"/>
     <w:tmpl w:val="EA04259C"/>
@@ -7304,7 +8483,7 @@
       </w:rPr>
     </w:lvl>
   </w:abstractNum>
-  <w:abstractNum w:abstractNumId="34" w15:restartNumberingAfterBreak="0">
+  <w:abstractNum w:abstractNumId="35" w15:restartNumberingAfterBreak="0">
     <w:nsid w:val="62EE0F79"/>
     <w:multiLevelType w:val="multilevel"/>
     <w:tmpl w:val="8C8E9A28"/>
@@ -7417,7 +8596,7 @@
       </w:pPr>
     </w:lvl>
   </w:abstractNum>
-  <w:abstractNum w:abstractNumId="35" w15:restartNumberingAfterBreak="0">
+  <w:abstractNum w:abstractNumId="36" w15:restartNumberingAfterBreak="0">
     <w:nsid w:val="64FE2C40"/>
     <w:multiLevelType w:val="multilevel"/>
     <w:tmpl w:val="BDB2FF54"/>
@@ -7566,7 +8745,7 @@
       </w:rPr>
     </w:lvl>
   </w:abstractNum>
-  <w:abstractNum w:abstractNumId="36" w15:restartNumberingAfterBreak="0">
+  <w:abstractNum w:abstractNumId="37" w15:restartNumberingAfterBreak="0">
     <w:nsid w:val="66B167E5"/>
     <w:multiLevelType w:val="multilevel"/>
     <w:tmpl w:val="F53A5A6A"/>
@@ -7715,7 +8894,7 @@
       </w:rPr>
     </w:lvl>
   </w:abstractNum>
-  <w:abstractNum w:abstractNumId="37" w15:restartNumberingAfterBreak="0">
+  <w:abstractNum w:abstractNumId="38" w15:restartNumberingAfterBreak="0">
     <w:nsid w:val="66C30DD5"/>
     <w:multiLevelType w:val="hybridMultilevel"/>
     <w:tmpl w:val="CFCA3096"/>
@@ -7829,7 +9008,7 @@
       </w:rPr>
     </w:lvl>
   </w:abstractNum>
-  <w:abstractNum w:abstractNumId="38" w15:restartNumberingAfterBreak="0">
+  <w:abstractNum w:abstractNumId="39" w15:restartNumberingAfterBreak="0">
     <w:nsid w:val="6A545759"/>
     <w:multiLevelType w:val="multilevel"/>
     <w:tmpl w:val="63704E74"/>
@@ -7978,7 +9157,7 @@
       </w:rPr>
     </w:lvl>
   </w:abstractNum>
-  <w:abstractNum w:abstractNumId="39" w15:restartNumberingAfterBreak="0">
+  <w:abstractNum w:abstractNumId="40" w15:restartNumberingAfterBreak="0">
     <w:nsid w:val="70682253"/>
     <w:multiLevelType w:val="multilevel"/>
     <w:tmpl w:val="E9DC6254"/>
@@ -8127,7 +9306,7 @@
       </w:rPr>
     </w:lvl>
   </w:abstractNum>
-  <w:abstractNum w:abstractNumId="40" w15:restartNumberingAfterBreak="0">
+  <w:abstractNum w:abstractNumId="41" w15:restartNumberingAfterBreak="0">
     <w:nsid w:val="742046EE"/>
     <w:multiLevelType w:val="multilevel"/>
     <w:tmpl w:val="AB00A058"/>
@@ -8240,7 +9419,7 @@
       </w:pPr>
     </w:lvl>
   </w:abstractNum>
-  <w:abstractNum w:abstractNumId="41" w15:restartNumberingAfterBreak="0">
+  <w:abstractNum w:abstractNumId="42" w15:restartNumberingAfterBreak="0">
     <w:nsid w:val="772E73E7"/>
     <w:multiLevelType w:val="hybridMultilevel"/>
     <w:tmpl w:val="6950BC4C"/>
@@ -8353,7 +9532,7 @@
       </w:rPr>
     </w:lvl>
   </w:abstractNum>
-  <w:abstractNum w:abstractNumId="42" w15:restartNumberingAfterBreak="0">
+  <w:abstractNum w:abstractNumId="43" w15:restartNumberingAfterBreak="0">
     <w:nsid w:val="784A0711"/>
     <w:multiLevelType w:val="multilevel"/>
     <w:tmpl w:val="9A1A4D30"/>
@@ -8502,7 +9681,7 @@
       </w:rPr>
     </w:lvl>
   </w:abstractNum>
-  <w:abstractNum w:abstractNumId="43" w15:restartNumberingAfterBreak="0">
+  <w:abstractNum w:abstractNumId="44" w15:restartNumberingAfterBreak="0">
     <w:nsid w:val="78F51405"/>
     <w:multiLevelType w:val="multilevel"/>
     <w:tmpl w:val="58867418"/>
@@ -8651,7 +9830,7 @@
       </w:rPr>
     </w:lvl>
   </w:abstractNum>
-  <w:abstractNum w:abstractNumId="44" w15:restartNumberingAfterBreak="0">
+  <w:abstractNum w:abstractNumId="45" w15:restartNumberingAfterBreak="0">
     <w:nsid w:val="7D920E44"/>
     <w:multiLevelType w:val="hybridMultilevel"/>
     <w:tmpl w:val="8A5A1EB0"/>
@@ -8763,7 +9942,7 @@
       </w:rPr>
     </w:lvl>
   </w:abstractNum>
-  <w:abstractNum w:abstractNumId="45" w15:restartNumberingAfterBreak="0">
+  <w:abstractNum w:abstractNumId="46" w15:restartNumberingAfterBreak="0">
     <w:nsid w:val="7FDF6C31"/>
     <w:multiLevelType w:val="hybridMultilevel"/>
     <w:tmpl w:val="B9662CAA"/>
@@ -8850,70 +10029,70 @@
     </w:lvl>
   </w:abstractNum>
   <w:num w:numId="1" w16cid:durableId="1768888654">
+    <w:abstractNumId w:val="46"/>
+  </w:num>
+  <w:num w:numId="2" w16cid:durableId="1549681109">
+    <w:abstractNumId w:val="21"/>
+  </w:num>
+  <w:num w:numId="3" w16cid:durableId="669791071">
+    <w:abstractNumId w:val="33"/>
+  </w:num>
+  <w:num w:numId="4" w16cid:durableId="253437074">
+    <w:abstractNumId w:val="44"/>
+  </w:num>
+  <w:num w:numId="5" w16cid:durableId="1690987492">
+    <w:abstractNumId w:val="7"/>
+  </w:num>
+  <w:num w:numId="6" w16cid:durableId="335348115">
+    <w:abstractNumId w:val="6"/>
+  </w:num>
+  <w:num w:numId="7" w16cid:durableId="1145318172">
+    <w:abstractNumId w:val="43"/>
+  </w:num>
+  <w:num w:numId="8" w16cid:durableId="1083919563">
+    <w:abstractNumId w:val="8"/>
+  </w:num>
+  <w:num w:numId="9" w16cid:durableId="1142580626">
+    <w:abstractNumId w:val="28"/>
+  </w:num>
+  <w:num w:numId="10" w16cid:durableId="2011517042">
+    <w:abstractNumId w:val="17"/>
+  </w:num>
+  <w:num w:numId="11" w16cid:durableId="365571510">
+    <w:abstractNumId w:val="9"/>
+  </w:num>
+  <w:num w:numId="12" w16cid:durableId="260720754">
+    <w:abstractNumId w:val="32"/>
+  </w:num>
+  <w:num w:numId="13" w16cid:durableId="1010445496">
+    <w:abstractNumId w:val="24"/>
+  </w:num>
+  <w:num w:numId="14" w16cid:durableId="895702316">
+    <w:abstractNumId w:val="35"/>
+  </w:num>
+  <w:num w:numId="15" w16cid:durableId="529995207">
+    <w:abstractNumId w:val="39"/>
+  </w:num>
+  <w:num w:numId="16" w16cid:durableId="302657475">
+    <w:abstractNumId w:val="5"/>
+  </w:num>
+  <w:num w:numId="17" w16cid:durableId="2032098678">
     <w:abstractNumId w:val="45"/>
   </w:num>
-  <w:num w:numId="2" w16cid:durableId="1549681109">
-    <w:abstractNumId w:val="20"/>
+  <w:num w:numId="18" w16cid:durableId="1369572188">
+    <w:abstractNumId w:val="29"/>
   </w:num>
-  <w:num w:numId="3" w16cid:durableId="669791071">
-    <w:abstractNumId w:val="32"/>
-  </w:num>
-  <w:num w:numId="4" w16cid:durableId="253437074">
-    <w:abstractNumId w:val="43"/>
-  </w:num>
-  <w:num w:numId="5" w16cid:durableId="1690987492">
-    <w:abstractNumId w:val="6"/>
-  </w:num>
-  <w:num w:numId="6" w16cid:durableId="335348115">
-    <w:abstractNumId w:val="5"/>
-  </w:num>
-  <w:num w:numId="7" w16cid:durableId="1145318172">
-    <w:abstractNumId w:val="42"/>
-  </w:num>
-  <w:num w:numId="8" w16cid:durableId="1083919563">
-    <w:abstractNumId w:val="7"/>
-  </w:num>
-  <w:num w:numId="9" w16cid:durableId="1142580626">
-    <w:abstractNumId w:val="27"/>
-  </w:num>
-  <w:num w:numId="10" w16cid:durableId="2011517042">
-    <w:abstractNumId w:val="16"/>
-  </w:num>
-  <w:num w:numId="11" w16cid:durableId="365571510">
-    <w:abstractNumId w:val="8"/>
-  </w:num>
-  <w:num w:numId="12" w16cid:durableId="260720754">
-    <w:abstractNumId w:val="31"/>
-  </w:num>
-  <w:num w:numId="13" w16cid:durableId="1010445496">
-    <w:abstractNumId w:val="23"/>
-  </w:num>
-  <w:num w:numId="14" w16cid:durableId="895702316">
+  <w:num w:numId="19" w16cid:durableId="1772623679">
     <w:abstractNumId w:val="34"/>
   </w:num>
-  <w:num w:numId="15" w16cid:durableId="529995207">
-    <w:abstractNumId w:val="38"/>
-  </w:num>
-  <w:num w:numId="16" w16cid:durableId="302657475">
-    <w:abstractNumId w:val="4"/>
-  </w:num>
-  <w:num w:numId="17" w16cid:durableId="2032098678">
-    <w:abstractNumId w:val="44"/>
-  </w:num>
-  <w:num w:numId="18" w16cid:durableId="1369572188">
-    <w:abstractNumId w:val="28"/>
-  </w:num>
-  <w:num w:numId="19" w16cid:durableId="1772623679">
-    <w:abstractNumId w:val="33"/>
-  </w:num>
   <w:num w:numId="20" w16cid:durableId="1738242168">
-    <w:abstractNumId w:val="10"/>
+    <w:abstractNumId w:val="11"/>
   </w:num>
   <w:num w:numId="21" w16cid:durableId="1524899639">
-    <w:abstractNumId w:val="39"/>
+    <w:abstractNumId w:val="40"/>
   </w:num>
   <w:num w:numId="22" w16cid:durableId="65538982">
-    <w:abstractNumId w:val="20"/>
+    <w:abstractNumId w:val="21"/>
     <w:lvlOverride w:ilvl="0">
       <w:startOverride w:val="1"/>
     </w:lvlOverride>
@@ -8943,31 +10122,31 @@
     </w:lvlOverride>
   </w:num>
   <w:num w:numId="23" w16cid:durableId="1862084504">
-    <w:abstractNumId w:val="9"/>
+    <w:abstractNumId w:val="10"/>
   </w:num>
   <w:num w:numId="24" w16cid:durableId="1552034483">
-    <w:abstractNumId w:val="21"/>
+    <w:abstractNumId w:val="22"/>
   </w:num>
   <w:num w:numId="25" w16cid:durableId="1839029432">
-    <w:abstractNumId w:val="17"/>
+    <w:abstractNumId w:val="18"/>
   </w:num>
   <w:num w:numId="26" w16cid:durableId="614601500">
     <w:abstractNumId w:val="1"/>
   </w:num>
   <w:num w:numId="27" w16cid:durableId="1105536325">
-    <w:abstractNumId w:val="11"/>
+    <w:abstractNumId w:val="12"/>
   </w:num>
   <w:num w:numId="28" w16cid:durableId="980428472">
-    <w:abstractNumId w:val="2"/>
+    <w:abstractNumId w:val="3"/>
   </w:num>
   <w:num w:numId="29" w16cid:durableId="1276056977">
-    <w:abstractNumId w:val="22"/>
+    <w:abstractNumId w:val="23"/>
   </w:num>
   <w:num w:numId="30" w16cid:durableId="229459380">
-    <w:abstractNumId w:val="30"/>
+    <w:abstractNumId w:val="31"/>
   </w:num>
   <w:num w:numId="31" w16cid:durableId="614602656">
-    <w:abstractNumId w:val="20"/>
+    <w:abstractNumId w:val="21"/>
     <w:lvlOverride w:ilvl="0">
       <w:startOverride w:val="1"/>
     </w:lvlOverride>
@@ -8997,10 +10176,10 @@
     </w:lvlOverride>
   </w:num>
   <w:num w:numId="32" w16cid:durableId="429007949">
-    <w:abstractNumId w:val="26"/>
+    <w:abstractNumId w:val="27"/>
   </w:num>
   <w:num w:numId="33" w16cid:durableId="1155999636">
-    <w:abstractNumId w:val="20"/>
+    <w:abstractNumId w:val="21"/>
     <w:lvlOverride w:ilvl="0">
       <w:startOverride w:val="1"/>
     </w:lvlOverride>
@@ -9030,52 +10209,55 @@
     </w:lvlOverride>
   </w:num>
   <w:num w:numId="34" w16cid:durableId="1418089546">
-    <w:abstractNumId w:val="18"/>
+    <w:abstractNumId w:val="19"/>
   </w:num>
   <w:num w:numId="35" w16cid:durableId="215166190">
-    <w:abstractNumId w:val="36"/>
+    <w:abstractNumId w:val="37"/>
   </w:num>
   <w:num w:numId="36" w16cid:durableId="1793399873">
-    <w:abstractNumId w:val="13"/>
+    <w:abstractNumId w:val="14"/>
   </w:num>
   <w:num w:numId="37" w16cid:durableId="246355222">
-    <w:abstractNumId w:val="15"/>
+    <w:abstractNumId w:val="16"/>
   </w:num>
   <w:num w:numId="38" w16cid:durableId="956566091">
-    <w:abstractNumId w:val="12"/>
+    <w:abstractNumId w:val="13"/>
   </w:num>
   <w:num w:numId="39" w16cid:durableId="191386405">
     <w:abstractNumId w:val="0"/>
   </w:num>
   <w:num w:numId="40" w16cid:durableId="1768503528">
+    <w:abstractNumId w:val="26"/>
+  </w:num>
+  <w:num w:numId="41" w16cid:durableId="1673532936">
+    <w:abstractNumId w:val="42"/>
+  </w:num>
+  <w:num w:numId="42" w16cid:durableId="738402004">
+    <w:abstractNumId w:val="38"/>
+  </w:num>
+  <w:num w:numId="43" w16cid:durableId="838737794">
+    <w:abstractNumId w:val="4"/>
+  </w:num>
+  <w:num w:numId="44" w16cid:durableId="2112427553">
+    <w:abstractNumId w:val="41"/>
+  </w:num>
+  <w:num w:numId="45" w16cid:durableId="793987159">
     <w:abstractNumId w:val="25"/>
   </w:num>
-  <w:num w:numId="41" w16cid:durableId="1673532936">
-    <w:abstractNumId w:val="41"/>
-  </w:num>
-  <w:num w:numId="42" w16cid:durableId="738402004">
-    <w:abstractNumId w:val="37"/>
-  </w:num>
-  <w:num w:numId="43" w16cid:durableId="838737794">
-    <w:abstractNumId w:val="3"/>
-  </w:num>
-  <w:num w:numId="44" w16cid:durableId="2112427553">
-    <w:abstractNumId w:val="40"/>
-  </w:num>
-  <w:num w:numId="45" w16cid:durableId="793987159">
-    <w:abstractNumId w:val="24"/>
-  </w:num>
   <w:num w:numId="46" w16cid:durableId="2042122719">
-    <w:abstractNumId w:val="35"/>
+    <w:abstractNumId w:val="36"/>
   </w:num>
   <w:num w:numId="47" w16cid:durableId="1104107096">
-    <w:abstractNumId w:val="29"/>
+    <w:abstractNumId w:val="30"/>
   </w:num>
   <w:num w:numId="48" w16cid:durableId="1952281649">
-    <w:abstractNumId w:val="14"/>
+    <w:abstractNumId w:val="15"/>
   </w:num>
   <w:num w:numId="49" w16cid:durableId="2145081110">
-    <w:abstractNumId w:val="19"/>
+    <w:abstractNumId w:val="20"/>
+  </w:num>
+  <w:num w:numId="50" w16cid:durableId="1032807882">
+    <w:abstractNumId w:val="2"/>
   </w:num>
 </w:numbering>
 </file>

</xml_diff>

<commit_message>
désajout draw.io installer + comparatuer 16bits
</commit_message>
<xml_diff>
--- a/Mini_projet/CR_youssef/Rapport_FPGA.docx
+++ b/Mini_projet/CR_youssef/Rapport_FPGA.docx
@@ -3095,6 +3095,9 @@
         <w:jc w:val="center"/>
       </w:pPr>
       <w:r>
+        <w:rPr>
+          <w:noProof/>
+        </w:rPr>
         <w:drawing>
           <wp:inline distT="0" distB="0" distL="0" distR="0" wp14:anchorId="2DD41CA5" wp14:editId="06C0DEAA">
             <wp:extent cx="5619750" cy="2876550"/>
@@ -3186,9 +3189,12 @@
         <w:jc w:val="center"/>
       </w:pPr>
       <w:r>
+        <w:rPr>
+          <w:noProof/>
+        </w:rPr>
         <w:lastRenderedPageBreak/>
         <w:drawing>
-          <wp:inline distT="0" distB="0" distL="0" distR="0" wp14:anchorId="3B8AE4D5" wp14:editId="0F86B1F3">
+          <wp:inline distT="0" distB="0" distL="0" distR="0" wp14:anchorId="3B8AE4D5" wp14:editId="209FB6EF">
             <wp:extent cx="5760720" cy="3105150"/>
             <wp:effectExtent l="0" t="0" r="0" b="0"/>
             <wp:docPr id="12" name="Image 12"/>
@@ -3266,12 +3272,660 @@
         <w:t xml:space="preserve"> : Simulation décodeur 7 segment</w:t>
       </w:r>
     </w:p>
-    <w:p/>
+    <w:p>
+      <w:pPr>
+        <w:pStyle w:val="Titre2"/>
+      </w:pPr>
+      <w:r>
+        <w:t>Comparateur 4bits</w:t>
+      </w:r>
+    </w:p>
+    <w:p>
+      <w:r>
+        <w:t xml:space="preserve">Dans ce comparateur 4 bits, il n’est pas nécessaire d’utiliser un signal de reset pour remettre la sortie à zéro. En effet, le module est entièrement combinatoire : la sortie </w:t>
+      </w:r>
+      <w:proofErr w:type="spellStart"/>
+      <w:r>
+        <w:rPr>
+          <w:rFonts w:ascii="Courier New" w:hAnsi="Courier New" w:cs="Courier New"/>
+          <w:sz w:val="20"/>
+          <w:szCs w:val="20"/>
+        </w:rPr>
+        <w:t>CompOK</w:t>
+      </w:r>
+      <w:proofErr w:type="spellEnd"/>
+      <w:r>
+        <w:t xml:space="preserve"> dépend uniquement des valeurs instantanées des entrées </w:t>
+      </w:r>
+      <w:proofErr w:type="spellStart"/>
+      <w:r>
+        <w:rPr>
+          <w:rFonts w:ascii="Courier New" w:hAnsi="Courier New" w:cs="Courier New"/>
+          <w:sz w:val="20"/>
+          <w:szCs w:val="20"/>
+        </w:rPr>
+        <w:t>Datautil</w:t>
+      </w:r>
+      <w:proofErr w:type="spellEnd"/>
+      <w:r>
+        <w:t xml:space="preserve"> et </w:t>
+      </w:r>
+      <w:proofErr w:type="spellStart"/>
+      <w:r>
+        <w:rPr>
+          <w:rFonts w:ascii="Courier New" w:hAnsi="Courier New" w:cs="Courier New"/>
+          <w:sz w:val="20"/>
+          <w:szCs w:val="20"/>
+        </w:rPr>
+        <w:t>Dataamd</w:t>
+      </w:r>
+      <w:proofErr w:type="spellEnd"/>
+      <w:r>
+        <w:t xml:space="preserve">. Dès que ces deux vecteurs sont différents, la sortie prend automatiquement la valeur </w:t>
+      </w:r>
+      <w:r>
+        <w:rPr>
+          <w:rFonts w:ascii="Courier New" w:hAnsi="Courier New" w:cs="Courier New"/>
+          <w:sz w:val="20"/>
+          <w:szCs w:val="20"/>
+        </w:rPr>
+        <w:t>'0'</w:t>
+      </w:r>
+      <w:r>
+        <w:t>, sans avoir besoin de mémoriser un état précédent. Un signal de reset est surtout utile dans les circuits séquentiels (bascules, registres, compteurs), ce qui n’est pas le cas ici.</w:t>
+      </w:r>
+    </w:p>
+    <w:p>
+      <w:r>
+        <w:t>Le module VHDL est décrit à l’aide d’une entité comparateur_4bits qui définit deux entrées sur 4 bits (</w:t>
+      </w:r>
+      <w:proofErr w:type="spellStart"/>
+      <w:r>
+        <w:t>Datautil</w:t>
+      </w:r>
+      <w:proofErr w:type="spellEnd"/>
+      <w:r>
+        <w:t xml:space="preserve"> et </w:t>
+      </w:r>
+      <w:proofErr w:type="spellStart"/>
+      <w:r>
+        <w:t>Dataamd</w:t>
+      </w:r>
+      <w:proofErr w:type="spellEnd"/>
+      <w:r>
+        <w:t>) ainsi qu’une sortie (</w:t>
+      </w:r>
+      <w:proofErr w:type="spellStart"/>
+      <w:r>
+        <w:t>CompOK</w:t>
+      </w:r>
+      <w:proofErr w:type="spellEnd"/>
+      <w:r>
+        <w:t xml:space="preserve">). L’architecture de type </w:t>
+      </w:r>
+      <w:proofErr w:type="spellStart"/>
+      <w:r>
+        <w:rPr>
+          <w:i/>
+          <w:iCs/>
+        </w:rPr>
+        <w:t>Behavioral</w:t>
+      </w:r>
+      <w:proofErr w:type="spellEnd"/>
+      <w:r>
+        <w:t xml:space="preserve"> implémente une affectation conditionnelle simple : la sortie </w:t>
+      </w:r>
+      <w:proofErr w:type="spellStart"/>
+      <w:r>
+        <w:t>CompOK</w:t>
+      </w:r>
+      <w:proofErr w:type="spellEnd"/>
+      <w:r>
+        <w:t xml:space="preserve"> vaut '1' lorsque les deux entrées sont strictement égales, et '0' dans tous les autres cas. Cette écriture est claire, synthétisable et bien adaptée à un comparateur combinatoire.</w:t>
+      </w:r>
+    </w:p>
+    <w:p>
+      <w:pPr>
+        <w:spacing w:line="278" w:lineRule="auto"/>
+        <w:jc w:val="left"/>
+      </w:pPr>
+      <w:r>
+        <w:br w:type="page"/>
+      </w:r>
+    </w:p>
+    <w:p>
+      <w:r>
+        <w:lastRenderedPageBreak/>
+        <w:t>Dans c</w:t>
+      </w:r>
+      <w:r>
+        <w:t>ette simulation</w:t>
+      </w:r>
+      <w:r>
+        <w:t xml:space="preserve">, deux signaux internes s_data1 et s_data2 sur 4 bits représentent respectivement les entrées </w:t>
+      </w:r>
+      <w:proofErr w:type="spellStart"/>
+      <w:r>
+        <w:t>Datautil</w:t>
+      </w:r>
+      <w:proofErr w:type="spellEnd"/>
+      <w:r>
+        <w:t xml:space="preserve"> et </w:t>
+      </w:r>
+      <w:proofErr w:type="spellStart"/>
+      <w:r>
+        <w:t>Dataamd</w:t>
+      </w:r>
+      <w:proofErr w:type="spellEnd"/>
+      <w:r>
+        <w:t xml:space="preserve">, tandis que le signal </w:t>
+      </w:r>
+      <w:proofErr w:type="spellStart"/>
+      <w:r>
+        <w:t>s_ok</w:t>
+      </w:r>
+      <w:proofErr w:type="spellEnd"/>
+      <w:r>
+        <w:t xml:space="preserve"> correspond à la sortie </w:t>
+      </w:r>
+      <w:proofErr w:type="spellStart"/>
+      <w:r>
+        <w:t>CompOK</w:t>
+      </w:r>
+      <w:proofErr w:type="spellEnd"/>
+      <w:r>
+        <w:t>. Le composant comparateur_4bits est instancié sous le nom UUT (Unit Under Test) et connecté à ces signaux.</w:t>
+      </w:r>
+    </w:p>
+    <w:p>
+      <w:r>
+        <w:t xml:space="preserve">Le processus de simulation applique ensuite plusieurs jeux de tests successifs. Dans un premier temps, s_data1 vaut "1010" et s_data2 vaut "0000" : les valeurs étant différentes, la sortie </w:t>
+      </w:r>
+      <w:proofErr w:type="spellStart"/>
+      <w:r>
+        <w:t>s_ok</w:t>
+      </w:r>
+      <w:proofErr w:type="spellEnd"/>
+      <w:r>
+        <w:t xml:space="preserve"> reste à '0'. Dans un second test, les deux entrées sont mises à "1100", ce qui provoque le passage de </w:t>
+      </w:r>
+      <w:proofErr w:type="spellStart"/>
+      <w:r>
+        <w:t>s_ok</w:t>
+      </w:r>
+      <w:proofErr w:type="spellEnd"/>
+      <w:r>
+        <w:t xml:space="preserve"> à '1', confirmant que le comparateur détecte correctement l’égalité. Enfin, un troisième test applique des valeurs différentes ("1100" et "1111"), et la sortie repasse à '0'. Ces résultats observés en simulation valident le bon fonctionnement du comparateur 4 bits conformément au cahier des charges.</w:t>
+      </w:r>
+    </w:p>
+    <w:p>
+      <w:r>
+        <w:t xml:space="preserve">Ci-joint </w:t>
+      </w:r>
+      <w:proofErr w:type="gramStart"/>
+      <w:r>
+        <w:t>la simulation réussi</w:t>
+      </w:r>
+      <w:proofErr w:type="gramEnd"/>
+      <w:r>
+        <w:t xml:space="preserve"> : </w:t>
+      </w:r>
+    </w:p>
+    <w:p>
+      <w:pPr>
+        <w:keepNext/>
+        <w:jc w:val="center"/>
+      </w:pPr>
+      <w:r>
+        <w:drawing>
+          <wp:inline distT="0" distB="0" distL="0" distR="0" wp14:anchorId="75640C17" wp14:editId="02F7B8E8">
+            <wp:extent cx="5760720" cy="1633855"/>
+            <wp:effectExtent l="0" t="0" r="0" b="4445"/>
+            <wp:docPr id="3" name="Image 3"/>
+            <wp:cNvGraphicFramePr>
+              <a:graphicFrameLocks xmlns:a="http://schemas.openxmlformats.org/drawingml/2006/main" noChangeAspect="1"/>
+            </wp:cNvGraphicFramePr>
+            <a:graphic xmlns:a="http://schemas.openxmlformats.org/drawingml/2006/main">
+              <a:graphicData uri="http://schemas.openxmlformats.org/drawingml/2006/picture">
+                <pic:pic xmlns:pic="http://schemas.openxmlformats.org/drawingml/2006/picture">
+                  <pic:nvPicPr>
+                    <pic:cNvPr id="1" name=""/>
+                    <pic:cNvPicPr/>
+                  </pic:nvPicPr>
+                  <pic:blipFill>
+                    <a:blip r:embed="rId17"/>
+                    <a:stretch>
+                      <a:fillRect/>
+                    </a:stretch>
+                  </pic:blipFill>
+                  <pic:spPr>
+                    <a:xfrm>
+                      <a:off x="0" y="0"/>
+                      <a:ext cx="5760720" cy="1633855"/>
+                    </a:xfrm>
+                    <a:prstGeom prst="rect">
+                      <a:avLst/>
+                    </a:prstGeom>
+                  </pic:spPr>
+                </pic:pic>
+              </a:graphicData>
+            </a:graphic>
+          </wp:inline>
+        </w:drawing>
+      </w:r>
+    </w:p>
+    <w:p>
+      <w:pPr>
+        <w:pStyle w:val="Lgende"/>
+      </w:pPr>
+      <w:r>
+        <w:t xml:space="preserve">Figure </w:t>
+      </w:r>
+      <w:r>
+        <w:fldChar w:fldCharType="begin"/>
+      </w:r>
+      <w:r>
+        <w:instrText xml:space="preserve"> SEQ Figure \* ARABIC </w:instrText>
+      </w:r>
+      <w:r>
+        <w:fldChar w:fldCharType="separate"/>
+      </w:r>
+      <w:r>
+        <w:rPr>
+          <w:noProof/>
+        </w:rPr>
+        <w:t>9</w:t>
+      </w:r>
+      <w:r>
+        <w:fldChar w:fldCharType="end"/>
+      </w:r>
+      <w:r>
+        <w:t xml:space="preserve"> : Simulation comparateur 4 bits</w:t>
+      </w:r>
+    </w:p>
     <w:p/>
     <w:p>
       <w:pPr>
-        <w:rPr>
-          <w:rFonts w:asciiTheme="majorHAnsi" w:eastAsia="Times New Roman" w:hAnsiTheme="majorHAnsi" w:cstheme="majorBidi"/>
+        <w:pStyle w:val="Titre2"/>
+        <w:rPr>
+          <w:rFonts w:eastAsia="Times New Roman"/>
+        </w:rPr>
+      </w:pPr>
+      <w:r>
+        <w:t>Comparateur 16 bits</w:t>
+      </w:r>
+    </w:p>
+    <w:p>
+      <w:r>
+        <w:t xml:space="preserve">Le comparateur 16 bits est décrit à l’aide d’une architecture de type </w:t>
+      </w:r>
+      <w:r>
+        <w:rPr>
+          <w:i/>
+          <w:iCs/>
+        </w:rPr>
+        <w:t>Structural</w:t>
+      </w:r>
+      <w:r>
+        <w:t xml:space="preserve">, ce qui permet de réutiliser directement le composant </w:t>
+      </w:r>
+      <w:r>
+        <w:rPr>
+          <w:rFonts w:ascii="Courier New" w:hAnsi="Courier New" w:cs="Courier New"/>
+          <w:sz w:val="20"/>
+          <w:szCs w:val="20"/>
+        </w:rPr>
+        <w:t>comparateur_4bits</w:t>
+      </w:r>
+      <w:r>
+        <w:t xml:space="preserve"> déjà conçu. L’entrée </w:t>
+      </w:r>
+      <w:proofErr w:type="spellStart"/>
+      <w:r>
+        <w:rPr>
+          <w:rFonts w:ascii="Courier New" w:hAnsi="Courier New" w:cs="Courier New"/>
+          <w:sz w:val="20"/>
+          <w:szCs w:val="20"/>
+        </w:rPr>
+        <w:t>Buscode</w:t>
+      </w:r>
+      <w:proofErr w:type="spellEnd"/>
+      <w:r>
+        <w:t xml:space="preserve"> est un vecteur de 16 bits découpé en quatre groupes de 4 bits, chacun correspondant à un chiffre du code saisi. Quatre instances du comparateur 4 bits sont alors utilisées : chaque instance compare une portion de </w:t>
+      </w:r>
+      <w:proofErr w:type="spellStart"/>
+      <w:r>
+        <w:rPr>
+          <w:rFonts w:ascii="Courier New" w:hAnsi="Courier New" w:cs="Courier New"/>
+          <w:sz w:val="20"/>
+          <w:szCs w:val="20"/>
+        </w:rPr>
+        <w:t>Buscode</w:t>
+      </w:r>
+      <w:proofErr w:type="spellEnd"/>
+      <w:r>
+        <w:t xml:space="preserve"> avec une valeur de référence fixe (0100 pour 4, 0011 pour 3, 0010 pour 2 et 0001 pour 1). Les sorties de ces comparateurs sont stockées dans les signaux internes </w:t>
+      </w:r>
+      <w:r>
+        <w:rPr>
+          <w:rFonts w:ascii="Courier New" w:hAnsi="Courier New" w:cs="Courier New"/>
+          <w:sz w:val="20"/>
+          <w:szCs w:val="20"/>
+        </w:rPr>
+        <w:t>ok0</w:t>
+      </w:r>
+      <w:r>
+        <w:t xml:space="preserve"> à </w:t>
+      </w:r>
+      <w:r>
+        <w:rPr>
+          <w:rFonts w:ascii="Courier New" w:hAnsi="Courier New" w:cs="Courier New"/>
+          <w:sz w:val="20"/>
+          <w:szCs w:val="20"/>
+        </w:rPr>
+        <w:t>ok3</w:t>
+      </w:r>
+      <w:r>
+        <w:t>.</w:t>
+      </w:r>
+    </w:p>
+    <w:p>
+      <w:r>
+        <w:t xml:space="preserve">Le fonctionnement du comparateur 16 bits repose sur une logique combinatoire. Chaque comparateur 4 bits vérifie si la partie du bus qui lui est associée correspond à la valeur attendue. La sortie finale </w:t>
+      </w:r>
+      <w:r>
+        <w:rPr>
+          <w:rFonts w:ascii="Courier New" w:hAnsi="Courier New" w:cs="Courier New"/>
+          <w:sz w:val="20"/>
+          <w:szCs w:val="20"/>
+        </w:rPr>
+        <w:t>ouverture</w:t>
+      </w:r>
+      <w:r>
+        <w:t xml:space="preserve"> est obtenue par une porte logique ET entre les signaux </w:t>
+      </w:r>
+      <w:r>
+        <w:rPr>
+          <w:rFonts w:ascii="Courier New" w:hAnsi="Courier New" w:cs="Courier New"/>
+          <w:sz w:val="20"/>
+          <w:szCs w:val="20"/>
+        </w:rPr>
+        <w:t>ok0</w:t>
+      </w:r>
+      <w:r>
+        <w:t xml:space="preserve">, </w:t>
+      </w:r>
+      <w:r>
+        <w:rPr>
+          <w:rFonts w:ascii="Courier New" w:hAnsi="Courier New" w:cs="Courier New"/>
+          <w:sz w:val="20"/>
+          <w:szCs w:val="20"/>
+        </w:rPr>
+        <w:t>ok1</w:t>
+      </w:r>
+      <w:r>
+        <w:t xml:space="preserve">, </w:t>
+      </w:r>
+      <w:r>
+        <w:rPr>
+          <w:rFonts w:ascii="Courier New" w:hAnsi="Courier New" w:cs="Courier New"/>
+          <w:sz w:val="20"/>
+          <w:szCs w:val="20"/>
+        </w:rPr>
+        <w:t>ok2</w:t>
+      </w:r>
+      <w:r>
+        <w:t xml:space="preserve"> </w:t>
+      </w:r>
+      <w:r>
+        <w:lastRenderedPageBreak/>
+        <w:t xml:space="preserve">et </w:t>
+      </w:r>
+      <w:r>
+        <w:rPr>
+          <w:rFonts w:ascii="Courier New" w:hAnsi="Courier New" w:cs="Courier New"/>
+          <w:sz w:val="20"/>
+          <w:szCs w:val="20"/>
+        </w:rPr>
+        <w:t>ok3</w:t>
+      </w:r>
+      <w:r>
+        <w:t xml:space="preserve">. Ainsi, </w:t>
+      </w:r>
+      <w:r>
+        <w:rPr>
+          <w:rFonts w:ascii="Courier New" w:hAnsi="Courier New" w:cs="Courier New"/>
+          <w:sz w:val="20"/>
+          <w:szCs w:val="20"/>
+        </w:rPr>
+        <w:t>ouverture</w:t>
+      </w:r>
+      <w:r>
+        <w:t xml:space="preserve"> prend la valeur </w:t>
+      </w:r>
+      <w:r>
+        <w:rPr>
+          <w:rFonts w:ascii="Courier New" w:hAnsi="Courier New" w:cs="Courier New"/>
+          <w:sz w:val="20"/>
+          <w:szCs w:val="20"/>
+        </w:rPr>
+        <w:t>'1'</w:t>
+      </w:r>
+      <w:r>
+        <w:t xml:space="preserve"> uniquement si les quatre comparaisons sont correctes simultanément, c’est-à-dire si le code complet saisi correspond exactement au code secret attendu. Dans tous les autres cas, la sortie reste à </w:t>
+      </w:r>
+      <w:r>
+        <w:rPr>
+          <w:rFonts w:ascii="Courier New" w:hAnsi="Courier New" w:cs="Courier New"/>
+          <w:sz w:val="20"/>
+          <w:szCs w:val="20"/>
+        </w:rPr>
+        <w:t>'0'</w:t>
+      </w:r>
+      <w:r>
+        <w:t>.</w:t>
+      </w:r>
+    </w:p>
+    <w:p>
+      <w:r>
+        <w:t xml:space="preserve">La simulation est réalisée à l’aide du banc de test </w:t>
+      </w:r>
+      <w:r>
+        <w:rPr>
+          <w:rFonts w:ascii="Courier New" w:hAnsi="Courier New" w:cs="Courier New"/>
+          <w:sz w:val="20"/>
+          <w:szCs w:val="20"/>
+        </w:rPr>
+        <w:t>tb_comparateur_16bits</w:t>
+      </w:r>
+      <w:r>
+        <w:t xml:space="preserve">. Celui-ci génère différentes valeurs sur le signal </w:t>
+      </w:r>
+      <w:proofErr w:type="spellStart"/>
+      <w:r>
+        <w:rPr>
+          <w:rFonts w:ascii="Courier New" w:hAnsi="Courier New" w:cs="Courier New"/>
+          <w:sz w:val="20"/>
+          <w:szCs w:val="20"/>
+        </w:rPr>
+        <w:t>tb_bus</w:t>
+      </w:r>
+      <w:proofErr w:type="spellEnd"/>
+      <w:r>
+        <w:t xml:space="preserve">, connecté à l’entrée </w:t>
+      </w:r>
+      <w:proofErr w:type="spellStart"/>
+      <w:r>
+        <w:rPr>
+          <w:rFonts w:ascii="Courier New" w:hAnsi="Courier New" w:cs="Courier New"/>
+          <w:sz w:val="20"/>
+          <w:szCs w:val="20"/>
+        </w:rPr>
+        <w:t>Buscode</w:t>
+      </w:r>
+      <w:proofErr w:type="spellEnd"/>
+      <w:r>
+        <w:t xml:space="preserve"> du comparateur 16 bits. Un premier test applique un code incorrect (</w:t>
+      </w:r>
+      <w:r>
+        <w:rPr>
+          <w:rFonts w:ascii="Courier New" w:hAnsi="Courier New" w:cs="Courier New"/>
+          <w:sz w:val="20"/>
+          <w:szCs w:val="20"/>
+        </w:rPr>
+        <w:t>"1000010000100001"</w:t>
+      </w:r>
+      <w:r>
+        <w:t xml:space="preserve">, correspondant à 8421), pour lequel au moins un des comparateurs 4 bits détecte une différence. La sortie </w:t>
+      </w:r>
+      <w:proofErr w:type="spellStart"/>
+      <w:r>
+        <w:rPr>
+          <w:rFonts w:ascii="Courier New" w:hAnsi="Courier New" w:cs="Courier New"/>
+          <w:sz w:val="20"/>
+          <w:szCs w:val="20"/>
+        </w:rPr>
+        <w:t>tb_ouverture</w:t>
+      </w:r>
+      <w:proofErr w:type="spellEnd"/>
+      <w:r>
+        <w:t xml:space="preserve"> reste alors à </w:t>
+      </w:r>
+      <w:r>
+        <w:rPr>
+          <w:rFonts w:ascii="Courier New" w:hAnsi="Courier New" w:cs="Courier New"/>
+          <w:sz w:val="20"/>
+          <w:szCs w:val="20"/>
+        </w:rPr>
+        <w:t>'0'</w:t>
+      </w:r>
+      <w:r>
+        <w:t>. Dans un second test, le code correct (</w:t>
+      </w:r>
+      <w:r>
+        <w:rPr>
+          <w:rFonts w:ascii="Courier New" w:hAnsi="Courier New" w:cs="Courier New"/>
+          <w:sz w:val="20"/>
+          <w:szCs w:val="20"/>
+        </w:rPr>
+        <w:t>"0001001000110100"</w:t>
+      </w:r>
+      <w:r>
+        <w:t xml:space="preserve">, correspondant à 1234) est appliqué : les quatre comparateurs 4 bits valident chacun leur portion du bus, ce qui entraîne le passage de </w:t>
+      </w:r>
+      <w:proofErr w:type="spellStart"/>
+      <w:r>
+        <w:rPr>
+          <w:rFonts w:ascii="Courier New" w:hAnsi="Courier New" w:cs="Courier New"/>
+          <w:sz w:val="20"/>
+          <w:szCs w:val="20"/>
+        </w:rPr>
+        <w:t>tb_ouverture</w:t>
+      </w:r>
+      <w:proofErr w:type="spellEnd"/>
+      <w:r>
+        <w:t xml:space="preserve"> à </w:t>
+      </w:r>
+      <w:r>
+        <w:rPr>
+          <w:rFonts w:ascii="Courier New" w:hAnsi="Courier New" w:cs="Courier New"/>
+          <w:sz w:val="20"/>
+          <w:szCs w:val="20"/>
+        </w:rPr>
+        <w:t>'1'</w:t>
+      </w:r>
+      <w:r>
+        <w:t>. Les résultats observés en simulation confirment donc le bon fonctionnement du comparateur 16 bits et la cohérence avec le cahier des charges.</w:t>
+      </w:r>
+    </w:p>
+    <w:p>
+      <w:r>
+        <w:t xml:space="preserve">Ci-joint simulation : </w:t>
+      </w:r>
+    </w:p>
+    <w:p>
+      <w:pPr>
+        <w:keepNext/>
+        <w:jc w:val="center"/>
+      </w:pPr>
+      <w:r>
+        <w:drawing>
+          <wp:inline distT="0" distB="0" distL="0" distR="0" wp14:anchorId="32C45C18" wp14:editId="72B9B80F">
+            <wp:extent cx="5760720" cy="1652270"/>
+            <wp:effectExtent l="0" t="0" r="0" b="5080"/>
+            <wp:docPr id="7" name="Image 7"/>
+            <wp:cNvGraphicFramePr>
+              <a:graphicFrameLocks xmlns:a="http://schemas.openxmlformats.org/drawingml/2006/main" noChangeAspect="1"/>
+            </wp:cNvGraphicFramePr>
+            <a:graphic xmlns:a="http://schemas.openxmlformats.org/drawingml/2006/main">
+              <a:graphicData uri="http://schemas.openxmlformats.org/drawingml/2006/picture">
+                <pic:pic xmlns:pic="http://schemas.openxmlformats.org/drawingml/2006/picture">
+                  <pic:nvPicPr>
+                    <pic:cNvPr id="1" name=""/>
+                    <pic:cNvPicPr/>
+                  </pic:nvPicPr>
+                  <pic:blipFill>
+                    <a:blip r:embed="rId18"/>
+                    <a:stretch>
+                      <a:fillRect/>
+                    </a:stretch>
+                  </pic:blipFill>
+                  <pic:spPr>
+                    <a:xfrm>
+                      <a:off x="0" y="0"/>
+                      <a:ext cx="5760720" cy="1652270"/>
+                    </a:xfrm>
+                    <a:prstGeom prst="rect">
+                      <a:avLst/>
+                    </a:prstGeom>
+                  </pic:spPr>
+                </pic:pic>
+              </a:graphicData>
+            </a:graphic>
+          </wp:inline>
+        </w:drawing>
+      </w:r>
+    </w:p>
+    <w:p>
+      <w:pPr>
+        <w:pStyle w:val="Lgende"/>
+      </w:pPr>
+      <w:r>
+        <w:t xml:space="preserve">Figure </w:t>
+      </w:r>
+      <w:r>
+        <w:fldChar w:fldCharType="begin"/>
+      </w:r>
+      <w:r>
+        <w:instrText xml:space="preserve"> SEQ Figure \* ARABIC </w:instrText>
+      </w:r>
+      <w:r>
+        <w:fldChar w:fldCharType="separate"/>
+      </w:r>
+      <w:r>
+        <w:rPr>
+          <w:noProof/>
+        </w:rPr>
+        <w:t>10</w:t>
+      </w:r>
+      <w:r>
+        <w:fldChar w:fldCharType="end"/>
+      </w:r>
+      <w:r>
+        <w:t xml:space="preserve"> : Simulation comparateur 16 bits</w:t>
+      </w:r>
+    </w:p>
+    <w:p/>
+    <w:p>
+      <w:pPr>
+        <w:jc w:val="center"/>
+      </w:pPr>
+    </w:p>
+    <w:p/>
+    <w:p>
+      <w:pPr>
+        <w:rPr>
+          <w:rFonts w:asciiTheme="majorHAnsi" w:hAnsiTheme="majorHAnsi" w:cstheme="majorBidi"/>
           <w:color w:val="000000" w:themeColor="text1"/>
           <w:sz w:val="28"/>
           <w:szCs w:val="40"/>
@@ -3281,10 +3935,8 @@
     </w:p>
     <w:p>
       <w:pPr>
-        <w:spacing w:line="278" w:lineRule="auto"/>
-        <w:jc w:val="left"/>
-        <w:rPr>
-          <w:rFonts w:asciiTheme="majorHAnsi" w:eastAsia="Times New Roman" w:hAnsiTheme="majorHAnsi" w:cstheme="majorBidi"/>
+        <w:rPr>
+          <w:rFonts w:asciiTheme="majorHAnsi" w:hAnsiTheme="majorHAnsi" w:cstheme="majorBidi"/>
           <w:b/>
           <w:color w:val="000000" w:themeColor="text1"/>
           <w:sz w:val="28"/>
@@ -3294,9 +3946,6 @@
       </w:pPr>
       <w:bookmarkStart w:id="13" w:name="_Toc219740220"/>
       <w:r>
-        <w:rPr>
-          <w:rFonts w:eastAsia="Times New Roman"/>
-        </w:rPr>
         <w:br w:type="page"/>
       </w:r>
     </w:p>
@@ -3792,9 +4441,9 @@
       </w:r>
     </w:p>
     <w:sectPr>
-      <w:headerReference w:type="default" r:id="rId17"/>
-      <w:footerReference w:type="default" r:id="rId18"/>
-      <w:headerReference w:type="first" r:id="rId19"/>
+      <w:headerReference w:type="default" r:id="rId19"/>
+      <w:footerReference w:type="default" r:id="rId20"/>
+      <w:headerReference w:type="first" r:id="rId21"/>
       <w:pgSz w:w="11906" w:h="16838"/>
       <w:pgMar w:top="1417" w:right="1417" w:bottom="1417" w:left="1417" w:header="708" w:footer="708" w:gutter="0"/>
       <w:cols w:space="708"/>
@@ -4033,7 +4682,7 @@
         <v:path o:extrusionok="f" gradientshapeok="t" o:connecttype="rect"/>
         <o:lock v:ext="edit" aspectratio="t"/>
       </v:shapetype>
-      <v:shape id="_x0000_i1054" type="#_x0000_t75" style="width:11.2pt;height:11.2pt" o:bullet="t">
+      <v:shape id="_x0000_i1064" type="#_x0000_t75" style="width:11.3pt;height:11.3pt" o:bullet="t">
         <v:imagedata r:id="rId1" o:title="msoEA91"/>
       </v:shape>
     </w:pict>

</xml_diff>

<commit_message>
Fichier zipper a rendre normalement finaliser + compte rendu mise au propre
</commit_message>
<xml_diff>
--- a/Mini_projet/CR_youssef/Rapport_FPGA.docx
+++ b/Mini_projet/CR_youssef/Rapport_FPGA.docx
@@ -29,7 +29,10 @@
         <w:jc w:val="center"/>
       </w:pPr>
       <w:r>
-        <w:t>Serrure électrique</w:t>
+        <w:t>Serrure él</w:t>
+      </w:r>
+      <w:r>
+        <w:t>ectronique</w:t>
       </w:r>
     </w:p>
     <w:p>
@@ -261,7 +264,7 @@
           <w:r>
             <w:fldChar w:fldCharType="separate"/>
           </w:r>
-          <w:hyperlink w:anchor="_Toc220194523" w:history="1">
+          <w:hyperlink w:anchor="_Toc220232034" w:history="1">
             <w:r>
               <w:rPr>
                 <w:rStyle w:val="Lienhypertexte"/>
@@ -288,7 +291,7 @@
                 <w:noProof/>
                 <w:webHidden/>
               </w:rPr>
-              <w:instrText xml:space="preserve"> PAGEREF _Toc220194523 \h </w:instrText>
+              <w:instrText xml:space="preserve"> PAGEREF _Toc220232034 \h </w:instrText>
             </w:r>
             <w:r>
               <w:rPr>
@@ -331,7 +334,7 @@
               <w:sz w:val="24"/>
             </w:rPr>
           </w:pPr>
-          <w:hyperlink w:anchor="_Toc220194524" w:history="1">
+          <w:hyperlink w:anchor="_Toc220232035" w:history="1">
             <w:r>
               <w:rPr>
                 <w:rStyle w:val="Lienhypertexte"/>
@@ -358,7 +361,7 @@
                 <w:noProof/>
                 <w:webHidden/>
               </w:rPr>
-              <w:instrText xml:space="preserve"> PAGEREF _Toc220194524 \h </w:instrText>
+              <w:instrText xml:space="preserve"> PAGEREF _Toc220232035 \h </w:instrText>
             </w:r>
             <w:r>
               <w:rPr>
@@ -402,7 +405,7 @@
               <w:sz w:val="24"/>
             </w:rPr>
           </w:pPr>
-          <w:hyperlink w:anchor="_Toc220194525" w:history="1">
+          <w:hyperlink w:anchor="_Toc220232036" w:history="1">
             <w:r>
               <w:rPr>
                 <w:rStyle w:val="Lienhypertexte"/>
@@ -444,7 +447,7 @@
                 <w:noProof/>
                 <w:webHidden/>
               </w:rPr>
-              <w:instrText xml:space="preserve"> PAGEREF _Toc220194525 \h </w:instrText>
+              <w:instrText xml:space="preserve"> PAGEREF _Toc220232036 \h </w:instrText>
             </w:r>
             <w:r>
               <w:rPr>
@@ -488,7 +491,7 @@
               <w:sz w:val="24"/>
             </w:rPr>
           </w:pPr>
-          <w:hyperlink w:anchor="_Toc220194526" w:history="1">
+          <w:hyperlink w:anchor="_Toc220232037" w:history="1">
             <w:r>
               <w:rPr>
                 <w:rStyle w:val="Lienhypertexte"/>
@@ -530,7 +533,7 @@
                 <w:noProof/>
                 <w:webHidden/>
               </w:rPr>
-              <w:instrText xml:space="preserve"> PAGEREF _Toc220194526 \h </w:instrText>
+              <w:instrText xml:space="preserve"> PAGEREF _Toc220232037 \h </w:instrText>
             </w:r>
             <w:r>
               <w:rPr>
@@ -574,7 +577,7 @@
               <w:sz w:val="24"/>
             </w:rPr>
           </w:pPr>
-          <w:hyperlink w:anchor="_Toc220194527" w:history="1">
+          <w:hyperlink w:anchor="_Toc220232038" w:history="1">
             <w:r>
               <w:rPr>
                 <w:rStyle w:val="Lienhypertexte"/>
@@ -616,7 +619,7 @@
                 <w:noProof/>
                 <w:webHidden/>
               </w:rPr>
-              <w:instrText xml:space="preserve"> PAGEREF _Toc220194527 \h </w:instrText>
+              <w:instrText xml:space="preserve"> PAGEREF _Toc220232038 \h </w:instrText>
             </w:r>
             <w:r>
               <w:rPr>
@@ -660,7 +663,7 @@
               <w:sz w:val="24"/>
             </w:rPr>
           </w:pPr>
-          <w:hyperlink w:anchor="_Toc220194528" w:history="1">
+          <w:hyperlink w:anchor="_Toc220232039" w:history="1">
             <w:r>
               <w:rPr>
                 <w:rStyle w:val="Lienhypertexte"/>
@@ -702,7 +705,7 @@
                 <w:noProof/>
                 <w:webHidden/>
               </w:rPr>
-              <w:instrText xml:space="preserve"> PAGEREF _Toc220194528 \h </w:instrText>
+              <w:instrText xml:space="preserve"> PAGEREF _Toc220232039 \h </w:instrText>
             </w:r>
             <w:r>
               <w:rPr>
@@ -746,7 +749,7 @@
               <w:sz w:val="24"/>
             </w:rPr>
           </w:pPr>
-          <w:hyperlink w:anchor="_Toc220194529" w:history="1">
+          <w:hyperlink w:anchor="_Toc220232040" w:history="1">
             <w:r>
               <w:rPr>
                 <w:rStyle w:val="Lienhypertexte"/>
@@ -788,7 +791,7 @@
                 <w:noProof/>
                 <w:webHidden/>
               </w:rPr>
-              <w:instrText xml:space="preserve"> PAGEREF _Toc220194529 \h </w:instrText>
+              <w:instrText xml:space="preserve"> PAGEREF _Toc220232040 \h </w:instrText>
             </w:r>
             <w:r>
               <w:rPr>
@@ -832,7 +835,7 @@
               <w:sz w:val="24"/>
             </w:rPr>
           </w:pPr>
-          <w:hyperlink w:anchor="_Toc220194530" w:history="1">
+          <w:hyperlink w:anchor="_Toc220232041" w:history="1">
             <w:r>
               <w:rPr>
                 <w:rStyle w:val="Lienhypertexte"/>
@@ -874,7 +877,7 @@
                 <w:noProof/>
                 <w:webHidden/>
               </w:rPr>
-              <w:instrText xml:space="preserve"> PAGEREF _Toc220194530 \h </w:instrText>
+              <w:instrText xml:space="preserve"> PAGEREF _Toc220232041 \h </w:instrText>
             </w:r>
             <w:r>
               <w:rPr>
@@ -918,7 +921,7 @@
               <w:sz w:val="24"/>
             </w:rPr>
           </w:pPr>
-          <w:hyperlink w:anchor="_Toc220194531" w:history="1">
+          <w:hyperlink w:anchor="_Toc220232042" w:history="1">
             <w:r>
               <w:rPr>
                 <w:rStyle w:val="Lienhypertexte"/>
@@ -960,7 +963,7 @@
                 <w:noProof/>
                 <w:webHidden/>
               </w:rPr>
-              <w:instrText xml:space="preserve"> PAGEREF _Toc220194531 \h </w:instrText>
+              <w:instrText xml:space="preserve"> PAGEREF _Toc220232042 \h </w:instrText>
             </w:r>
             <w:r>
               <w:rPr>
@@ -1004,7 +1007,7 @@
               <w:sz w:val="24"/>
             </w:rPr>
           </w:pPr>
-          <w:hyperlink w:anchor="_Toc220194532" w:history="1">
+          <w:hyperlink w:anchor="_Toc220232043" w:history="1">
             <w:r>
               <w:rPr>
                 <w:rStyle w:val="Lienhypertexte"/>
@@ -1046,7 +1049,7 @@
                 <w:noProof/>
                 <w:webHidden/>
               </w:rPr>
-              <w:instrText xml:space="preserve"> PAGEREF _Toc220194532 \h </w:instrText>
+              <w:instrText xml:space="preserve"> PAGEREF _Toc220232043 \h </w:instrText>
             </w:r>
             <w:r>
               <w:rPr>
@@ -1090,7 +1093,7 @@
               <w:sz w:val="24"/>
             </w:rPr>
           </w:pPr>
-          <w:hyperlink w:anchor="_Toc220194533" w:history="1">
+          <w:hyperlink w:anchor="_Toc220232044" w:history="1">
             <w:r>
               <w:rPr>
                 <w:rStyle w:val="Lienhypertexte"/>
@@ -1133,7 +1136,7 @@
                 <w:noProof/>
                 <w:webHidden/>
               </w:rPr>
-              <w:instrText xml:space="preserve"> PAGEREF _Toc220194533 \h </w:instrText>
+              <w:instrText xml:space="preserve"> PAGEREF _Toc220232044 \h </w:instrText>
             </w:r>
             <w:r>
               <w:rPr>
@@ -1177,7 +1180,7 @@
               <w:sz w:val="24"/>
             </w:rPr>
           </w:pPr>
-          <w:hyperlink w:anchor="_Toc220194534" w:history="1">
+          <w:hyperlink w:anchor="_Toc220232045" w:history="1">
             <w:r>
               <w:rPr>
                 <w:rStyle w:val="Lienhypertexte"/>
@@ -1219,7 +1222,7 @@
                 <w:noProof/>
                 <w:webHidden/>
               </w:rPr>
-              <w:instrText xml:space="preserve"> PAGEREF _Toc220194534 \h </w:instrText>
+              <w:instrText xml:space="preserve"> PAGEREF _Toc220232045 \h </w:instrText>
             </w:r>
             <w:r>
               <w:rPr>
@@ -1263,7 +1266,7 @@
               <w:sz w:val="24"/>
             </w:rPr>
           </w:pPr>
-          <w:hyperlink w:anchor="_Toc220194535" w:history="1">
+          <w:hyperlink w:anchor="_Toc220232046" w:history="1">
             <w:r>
               <w:rPr>
                 <w:rStyle w:val="Lienhypertexte"/>
@@ -1305,7 +1308,7 @@
                 <w:noProof/>
                 <w:webHidden/>
               </w:rPr>
-              <w:instrText xml:space="preserve"> PAGEREF _Toc220194535 \h </w:instrText>
+              <w:instrText xml:space="preserve"> PAGEREF _Toc220232046 \h </w:instrText>
             </w:r>
             <w:r>
               <w:rPr>
@@ -1349,7 +1352,7 @@
               <w:sz w:val="24"/>
             </w:rPr>
           </w:pPr>
-          <w:hyperlink w:anchor="_Toc220194536" w:history="1">
+          <w:hyperlink w:anchor="_Toc220232047" w:history="1">
             <w:r>
               <w:rPr>
                 <w:rStyle w:val="Lienhypertexte"/>
@@ -1391,7 +1394,7 @@
                 <w:noProof/>
                 <w:webHidden/>
               </w:rPr>
-              <w:instrText xml:space="preserve"> PAGEREF _Toc220194536 \h </w:instrText>
+              <w:instrText xml:space="preserve"> PAGEREF _Toc220232047 \h </w:instrText>
             </w:r>
             <w:r>
               <w:rPr>
@@ -1412,6 +1415,92 @@
                 <w:webHidden/>
               </w:rPr>
               <w:t>17</w:t>
+            </w:r>
+            <w:r>
+              <w:rPr>
+                <w:noProof/>
+                <w:webHidden/>
+              </w:rPr>
+              <w:fldChar w:fldCharType="end"/>
+            </w:r>
+          </w:hyperlink>
+        </w:p>
+        <w:p>
+          <w:pPr>
+            <w:pStyle w:val="TM1"/>
+            <w:tabs>
+              <w:tab w:val="left" w:pos="480"/>
+              <w:tab w:val="right" w:leader="dot" w:pos="9062"/>
+            </w:tabs>
+            <w:rPr>
+              <w:rFonts w:asciiTheme="minorHAnsi" w:eastAsiaTheme="minorEastAsia" w:hAnsiTheme="minorHAnsi"/>
+              <w:noProof/>
+              <w:sz w:val="24"/>
+            </w:rPr>
+          </w:pPr>
+          <w:hyperlink w:anchor="_Toc220232048" w:history="1">
+            <w:r>
+              <w:rPr>
+                <w:rStyle w:val="Lienhypertexte"/>
+                <w:noProof/>
+              </w:rPr>
+              <w:t>IV.</w:t>
+            </w:r>
+            <w:r>
+              <w:rPr>
+                <w:rFonts w:asciiTheme="minorHAnsi" w:eastAsiaTheme="minorEastAsia" w:hAnsiTheme="minorHAnsi"/>
+                <w:noProof/>
+                <w:sz w:val="24"/>
+              </w:rPr>
+              <w:tab/>
+            </w:r>
+            <w:r>
+              <w:rPr>
+                <w:rStyle w:val="Lienhypertexte"/>
+                <w:noProof/>
+              </w:rPr>
+              <w:t>Quartus prime</w:t>
+            </w:r>
+            <w:r>
+              <w:rPr>
+                <w:noProof/>
+                <w:webHidden/>
+              </w:rPr>
+              <w:tab/>
+            </w:r>
+            <w:r>
+              <w:rPr>
+                <w:noProof/>
+                <w:webHidden/>
+              </w:rPr>
+              <w:fldChar w:fldCharType="begin"/>
+            </w:r>
+            <w:r>
+              <w:rPr>
+                <w:noProof/>
+                <w:webHidden/>
+              </w:rPr>
+              <w:instrText xml:space="preserve"> PAGEREF _Toc220232048 \h </w:instrText>
+            </w:r>
+            <w:r>
+              <w:rPr>
+                <w:noProof/>
+                <w:webHidden/>
+              </w:rPr>
+            </w:r>
+            <w:r>
+              <w:rPr>
+                <w:noProof/>
+                <w:webHidden/>
+              </w:rPr>
+              <w:fldChar w:fldCharType="separate"/>
+            </w:r>
+            <w:r>
+              <w:rPr>
+                <w:noProof/>
+                <w:webHidden/>
+              </w:rPr>
+              <w:t>18</w:t>
             </w:r>
             <w:r>
               <w:rPr>
@@ -1434,7 +1523,7 @@
               <w:sz w:val="24"/>
             </w:rPr>
           </w:pPr>
-          <w:hyperlink w:anchor="_Toc220194537" w:history="1">
+          <w:hyperlink w:anchor="_Toc220232049" w:history="1">
             <w:r>
               <w:rPr>
                 <w:rStyle w:val="Lienhypertexte"/>
@@ -1462,7 +1551,7 @@
                 <w:noProof/>
                 <w:webHidden/>
               </w:rPr>
-              <w:instrText xml:space="preserve"> PAGEREF _Toc220194537 \h </w:instrText>
+              <w:instrText xml:space="preserve"> PAGEREF _Toc220232049 \h </w:instrText>
             </w:r>
             <w:r>
               <w:rPr>
@@ -1482,7 +1571,7 @@
                 <w:noProof/>
                 <w:webHidden/>
               </w:rPr>
-              <w:t>17</w:t>
+              <w:t>19</w:t>
             </w:r>
             <w:r>
               <w:rPr>
@@ -1505,7 +1594,7 @@
               <w:sz w:val="24"/>
             </w:rPr>
           </w:pPr>
-          <w:hyperlink w:anchor="_Toc220194538" w:history="1">
+          <w:hyperlink w:anchor="_Toc220232050" w:history="1">
             <w:r>
               <w:rPr>
                 <w:rStyle w:val="Lienhypertexte"/>
@@ -1533,7 +1622,7 @@
                 <w:noProof/>
                 <w:webHidden/>
               </w:rPr>
-              <w:instrText xml:space="preserve"> PAGEREF _Toc220194538 \h </w:instrText>
+              <w:instrText xml:space="preserve"> PAGEREF _Toc220232050 \h </w:instrText>
             </w:r>
             <w:r>
               <w:rPr>
@@ -1553,7 +1642,7 @@
                 <w:noProof/>
                 <w:webHidden/>
               </w:rPr>
-              <w:t>19</w:t>
+              <w:t>21</w:t>
             </w:r>
             <w:r>
               <w:rPr>
@@ -1608,7 +1697,7 @@
           <w:numId w:val="0"/>
         </w:numPr>
       </w:pPr>
-      <w:bookmarkStart w:id="0" w:name="_Toc220194523"/>
+      <w:bookmarkStart w:id="0" w:name="_Toc220232034"/>
       <w:r>
         <w:lastRenderedPageBreak/>
         <w:t>Remerciements</w:t>
@@ -1644,7 +1733,7 @@
           <w:numId w:val="0"/>
         </w:numPr>
       </w:pPr>
-      <w:bookmarkStart w:id="1" w:name="_Toc220194524"/>
+      <w:bookmarkStart w:id="1" w:name="_Toc220232035"/>
       <w:r>
         <w:lastRenderedPageBreak/>
         <w:t>Résumé</w:t>
@@ -1671,7 +1760,7 @@
       <w:pPr>
         <w:pStyle w:val="Titre1"/>
       </w:pPr>
-      <w:bookmarkStart w:id="2" w:name="_Toc220194525"/>
+      <w:bookmarkStart w:id="2" w:name="_Toc220232036"/>
       <w:r>
         <w:lastRenderedPageBreak/>
         <w:t>Présentation</w:t>
@@ -1777,7 +1866,7 @@
       <w:pPr>
         <w:pStyle w:val="Lgende"/>
       </w:pPr>
-      <w:bookmarkStart w:id="3" w:name="_Toc220194513"/>
+      <w:bookmarkStart w:id="3" w:name="_Toc220231405"/>
       <w:r>
         <w:t xml:space="preserve">Figure </w:t>
       </w:r>
@@ -1815,7 +1904,7 @@
       <w:pPr>
         <w:pStyle w:val="Titre1"/>
       </w:pPr>
-      <w:bookmarkStart w:id="4" w:name="_Toc220194526"/>
+      <w:bookmarkStart w:id="4" w:name="_Toc220232037"/>
       <w:r>
         <w:lastRenderedPageBreak/>
         <w:t>Conception et Architecture Fonctionnelle</w:t>
@@ -1985,7 +2074,7 @@
       <w:pPr>
         <w:pStyle w:val="Titre2"/>
       </w:pPr>
-      <w:bookmarkStart w:id="5" w:name="_Toc220194527"/>
+      <w:bookmarkStart w:id="5" w:name="_Toc220232038"/>
       <w:r>
         <w:t>Détecteur de front</w:t>
       </w:r>
@@ -2263,7 +2352,7 @@
       <w:pPr>
         <w:pStyle w:val="Lgende"/>
       </w:pPr>
-      <w:bookmarkStart w:id="6" w:name="_Toc220194514"/>
+      <w:bookmarkStart w:id="6" w:name="_Toc220231406"/>
       <w:r>
         <w:t xml:space="preserve">Figure </w:t>
       </w:r>
@@ -2312,7 +2401,7 @@
       <w:pPr>
         <w:pStyle w:val="Titre2"/>
       </w:pPr>
-      <w:bookmarkStart w:id="7" w:name="_Toc220194528"/>
+      <w:bookmarkStart w:id="7" w:name="_Toc220232039"/>
       <w:r>
         <w:lastRenderedPageBreak/>
         <w:t>Bascule D active sur front montant</w:t>
@@ -2451,7 +2540,7 @@
       <w:pPr>
         <w:pStyle w:val="Lgende"/>
       </w:pPr>
-      <w:bookmarkStart w:id="8" w:name="_Toc220194515"/>
+      <w:bookmarkStart w:id="8" w:name="_Toc220231407"/>
       <w:r>
         <w:t xml:space="preserve">Figure </w:t>
       </w:r>
@@ -2483,7 +2572,7 @@
       <w:pPr>
         <w:pStyle w:val="Titre2"/>
       </w:pPr>
-      <w:bookmarkStart w:id="9" w:name="_Toc220194529"/>
+      <w:bookmarkStart w:id="9" w:name="_Toc220232040"/>
       <w:r>
         <w:t>Registre à changement parallèle (4bits)</w:t>
       </w:r>
@@ -2873,7 +2962,7 @@
       <w:pPr>
         <w:pStyle w:val="Lgende"/>
       </w:pPr>
-      <w:bookmarkStart w:id="10" w:name="_Toc220194516"/>
+      <w:bookmarkStart w:id="10" w:name="_Toc220231408"/>
       <w:r>
         <w:t xml:space="preserve">Figure </w:t>
       </w:r>
@@ -2904,7 +2993,7 @@
       <w:pPr>
         <w:pStyle w:val="Titre2"/>
       </w:pPr>
-      <w:bookmarkStart w:id="11" w:name="_Toc220194530"/>
+      <w:bookmarkStart w:id="11" w:name="_Toc220232041"/>
       <w:r>
         <w:t>Stockage du code</w:t>
       </w:r>
@@ -3168,7 +3257,7 @@
       <w:pPr>
         <w:pStyle w:val="Lgende"/>
       </w:pPr>
-      <w:bookmarkStart w:id="12" w:name="_Toc220194517"/>
+      <w:bookmarkStart w:id="12" w:name="_Toc220231409"/>
       <w:r>
         <w:t xml:space="preserve">Figure </w:t>
       </w:r>
@@ -3253,7 +3342,7 @@
       <w:pPr>
         <w:pStyle w:val="Lgende"/>
       </w:pPr>
-      <w:bookmarkStart w:id="13" w:name="_Toc220194518"/>
+      <w:bookmarkStart w:id="13" w:name="_Toc220231410"/>
       <w:r>
         <w:t xml:space="preserve">Figure </w:t>
       </w:r>
@@ -3285,7 +3374,7 @@
       <w:pPr>
         <w:pStyle w:val="Titre2"/>
       </w:pPr>
-      <w:bookmarkStart w:id="14" w:name="_Toc220194531"/>
+      <w:bookmarkStart w:id="14" w:name="_Toc220232042"/>
       <w:r>
         <w:t>Affichage 7 segments</w:t>
       </w:r>
@@ -3418,6 +3507,11 @@
       </w:r>
       <w:r>
         <w:t>.</w:t>
+      </w:r>
+    </w:p>
+    <w:p>
+      <w:r>
+        <w:t>Concernant l’état initial, l’afficheur segment est par défaut éteint.</w:t>
       </w:r>
     </w:p>
     <w:p>
@@ -3489,7 +3583,7 @@
       <w:pPr>
         <w:pStyle w:val="Lgende"/>
       </w:pPr>
-      <w:bookmarkStart w:id="15" w:name="_Toc220194519"/>
+      <w:bookmarkStart w:id="15" w:name="_Toc220231411"/>
       <w:r>
         <w:t xml:space="preserve">Figure </w:t>
       </w:r>
@@ -3532,7 +3626,7 @@
           <w:noProof/>
         </w:rPr>
         <w:drawing>
-          <wp:inline distT="0" distB="0" distL="0" distR="0" wp14:anchorId="3B8AE4D5" wp14:editId="30C3234E">
+          <wp:inline distT="0" distB="0" distL="0" distR="0" wp14:anchorId="3B8AE4D5" wp14:editId="6716B640">
             <wp:extent cx="5760720" cy="3105150"/>
             <wp:effectExtent l="0" t="0" r="0" b="0"/>
             <wp:docPr id="12" name="Image 12"/>
@@ -3585,7 +3679,7 @@
       <w:pPr>
         <w:pStyle w:val="Lgende"/>
       </w:pPr>
-      <w:bookmarkStart w:id="16" w:name="_Toc220194520"/>
+      <w:bookmarkStart w:id="16" w:name="_Toc220231412"/>
       <w:r>
         <w:t xml:space="preserve">Figure </w:t>
       </w:r>
@@ -3616,7 +3710,7 @@
       <w:pPr>
         <w:pStyle w:val="Titre2"/>
       </w:pPr>
-      <w:bookmarkStart w:id="17" w:name="_Toc220194532"/>
+      <w:bookmarkStart w:id="17" w:name="_Toc220232043"/>
       <w:r>
         <w:t>Comparateur 4bits</w:t>
       </w:r>
@@ -3951,7 +4045,7 @@
       <w:pPr>
         <w:pStyle w:val="Lgende"/>
       </w:pPr>
-      <w:bookmarkStart w:id="18" w:name="_Toc220194521"/>
+      <w:bookmarkStart w:id="18" w:name="_Toc220231413"/>
       <w:r>
         <w:t xml:space="preserve">Figure </w:t>
       </w:r>
@@ -3986,7 +4080,7 @@
           <w:rFonts w:eastAsia="Times New Roman"/>
         </w:rPr>
       </w:pPr>
-      <w:bookmarkStart w:id="19" w:name="_Toc220194533"/>
+      <w:bookmarkStart w:id="19" w:name="_Toc220232044"/>
       <w:r>
         <w:t>Comparateur 16 bits</w:t>
       </w:r>
@@ -4311,7 +4405,7 @@
       <w:pPr>
         <w:pStyle w:val="Lgende"/>
       </w:pPr>
-      <w:bookmarkStart w:id="20" w:name="_Toc220194522"/>
+      <w:bookmarkStart w:id="20" w:name="_Toc220231414"/>
       <w:r>
         <w:t xml:space="preserve">Figure </w:t>
       </w:r>
@@ -4338,114 +4432,516 @@
       </w:r>
       <w:bookmarkEnd w:id="20"/>
     </w:p>
-    <w:p/>
+    <w:p>
+      <w:pPr>
+        <w:keepNext/>
+        <w:jc w:val="center"/>
+      </w:pPr>
+      <w:r>
+        <w:lastRenderedPageBreak/>
+        <w:drawing>
+          <wp:inline distT="0" distB="0" distL="0" distR="0" wp14:anchorId="132BEF4A" wp14:editId="6252E0C2">
+            <wp:extent cx="5760720" cy="3433445"/>
+            <wp:effectExtent l="0" t="0" r="0" b="0"/>
+            <wp:docPr id="19" name="Image 19"/>
+            <wp:cNvGraphicFramePr>
+              <a:graphicFrameLocks xmlns:a="http://schemas.openxmlformats.org/drawingml/2006/main" noChangeAspect="1"/>
+            </wp:cNvGraphicFramePr>
+            <a:graphic xmlns:a="http://schemas.openxmlformats.org/drawingml/2006/main">
+              <a:graphicData uri="http://schemas.openxmlformats.org/drawingml/2006/picture">
+                <pic:pic xmlns:pic="http://schemas.openxmlformats.org/drawingml/2006/picture">
+                  <pic:nvPicPr>
+                    <pic:cNvPr id="0" name="Picture 7"/>
+                    <pic:cNvPicPr>
+                      <a:picLocks noChangeAspect="1" noChangeArrowheads="1"/>
+                    </pic:cNvPicPr>
+                  </pic:nvPicPr>
+                  <pic:blipFill>
+                    <a:blip r:embed="rId19">
+                      <a:extLst>
+                        <a:ext uri="{28A0092B-C50C-407E-A947-70E740481C1C}">
+                          <a14:useLocalDpi xmlns:a14="http://schemas.microsoft.com/office/drawing/2010/main" val="0"/>
+                        </a:ext>
+                      </a:extLst>
+                    </a:blip>
+                    <a:srcRect/>
+                    <a:stretch>
+                      <a:fillRect/>
+                    </a:stretch>
+                  </pic:blipFill>
+                  <pic:spPr bwMode="auto">
+                    <a:xfrm>
+                      <a:off x="0" y="0"/>
+                      <a:ext cx="5760720" cy="3433445"/>
+                    </a:xfrm>
+                    <a:prstGeom prst="rect">
+                      <a:avLst/>
+                    </a:prstGeom>
+                    <a:noFill/>
+                    <a:ln>
+                      <a:noFill/>
+                    </a:ln>
+                  </pic:spPr>
+                </pic:pic>
+              </a:graphicData>
+            </a:graphic>
+          </wp:inline>
+        </w:drawing>
+      </w:r>
+    </w:p>
+    <w:p>
+      <w:pPr>
+        <w:pStyle w:val="Lgende"/>
+      </w:pPr>
+      <w:bookmarkStart w:id="21" w:name="_Toc220231415"/>
+      <w:r>
+        <w:t xml:space="preserve">Figure </w:t>
+      </w:r>
+      <w:r>
+        <w:fldChar w:fldCharType="begin"/>
+      </w:r>
+      <w:r>
+        <w:instrText xml:space="preserve"> SEQ Figure \* ARABIC </w:instrText>
+      </w:r>
+      <w:r>
+        <w:fldChar w:fldCharType="separate"/>
+      </w:r>
+      <w:r>
+        <w:rPr>
+          <w:noProof/>
+        </w:rPr>
+        <w:t>11</w:t>
+      </w:r>
+      <w:r>
+        <w:fldChar w:fldCharType="end"/>
+      </w:r>
+      <w:r>
+        <w:t xml:space="preserve"> : Schéma Comparateur 16 bits</w:t>
+      </w:r>
+      <w:bookmarkEnd w:id="21"/>
+    </w:p>
     <w:p>
       <w:pPr>
         <w:pStyle w:val="Titre1"/>
       </w:pPr>
-      <w:bookmarkStart w:id="21" w:name="_Toc220194534"/>
+      <w:bookmarkStart w:id="22" w:name="_Toc220232045"/>
+      <w:r>
+        <w:t>Assemblage : Serrure électronique complète</w:t>
+      </w:r>
+      <w:bookmarkEnd w:id="22"/>
+    </w:p>
+    <w:p>
+      <w:pPr>
+        <w:pStyle w:val="Titre2"/>
+      </w:pPr>
+      <w:bookmarkStart w:id="23" w:name="_Toc220232046"/>
+      <w:r>
+        <w:t>Fonctionnement top module</w:t>
+      </w:r>
+      <w:bookmarkEnd w:id="23"/>
+    </w:p>
+    <w:p>
+      <w:r>
+        <w:t xml:space="preserve">Le module principal </w:t>
+      </w:r>
+      <w:proofErr w:type="spellStart"/>
+      <w:r>
+        <w:t>top_module</w:t>
+      </w:r>
+      <w:proofErr w:type="spellEnd"/>
+      <w:r>
+        <w:t xml:space="preserve"> représente le fonctionnement global de la serrure numérique. Il est structuré de manière hiérarchique et relie plusieurs sous-blocs fonctionnels. Le signal KEY0 est d’abord traité par un détecteur de front, qui génère une impulsion (</w:t>
+      </w:r>
+      <w:proofErr w:type="spellStart"/>
+      <w:r>
+        <w:t>detect_front</w:t>
+      </w:r>
+      <w:proofErr w:type="spellEnd"/>
+      <w:r>
+        <w:t xml:space="preserve">) à chaque appui sur le bouton. Cette impulsion permet de valider la valeur présente sur </w:t>
+      </w:r>
+      <w:proofErr w:type="spellStart"/>
+      <w:r>
+        <w:t>Busint</w:t>
+      </w:r>
+      <w:proofErr w:type="spellEnd"/>
+      <w:r>
+        <w:t>, qui correspond au chiffre saisi par l’utilisateur. La valeur est ensuite mémorisée dans une chaîne de quatre registres fonctionnant en décalage : à chaque validation, le nouveau chiffre est stocké dans le premier registre et les précédents sont décalés vers les suivants. Les quatre registres forment ainsi un bus interne de 16 bits représentant le code complet saisi. Ce bus est comparé à un code de référence par le comparateur 16 bits, et si les quatre chiffres sont corrects, la sortie Ouverture est mise à '1'. En parallèle, chaque registre est connecté à un décodeur 7 segments afin d’afficher les chiffres saisis sur les afficheurs HEX0 à HEX3.</w:t>
+      </w:r>
+    </w:p>
+    <w:p>
+      <w:pPr>
+        <w:pStyle w:val="Titre2"/>
+      </w:pPr>
+      <w:bookmarkStart w:id="24" w:name="_Toc220232047"/>
+      <w:r>
+        <w:t xml:space="preserve">Fonctionnement test </w:t>
+      </w:r>
+      <w:proofErr w:type="spellStart"/>
+      <w:r>
+        <w:t>bench</w:t>
+      </w:r>
+      <w:bookmarkEnd w:id="24"/>
+      <w:proofErr w:type="spellEnd"/>
+      <w:r>
+        <w:t xml:space="preserve"> </w:t>
+      </w:r>
+    </w:p>
+    <w:p>
+      <w:r>
+        <w:t xml:space="preserve">Le banc de test </w:t>
+      </w:r>
+      <w:proofErr w:type="spellStart"/>
+      <w:r>
+        <w:t>top_module_tb</w:t>
+      </w:r>
+      <w:proofErr w:type="spellEnd"/>
+      <w:r>
+        <w:t xml:space="preserve"> permet de vérifier le comportement du système sans matériel réel. Il génère d’abord une horloge périodique et pilote le signal de reset afin d’initialiser correctement le système. Ensuite, le </w:t>
+      </w:r>
+      <w:proofErr w:type="spellStart"/>
+      <w:r>
+        <w:t>testbench</w:t>
+      </w:r>
+      <w:proofErr w:type="spellEnd"/>
+      <w:r>
+        <w:t xml:space="preserve"> simule la saisie d’un code en appliquant successivement différentes valeurs sur </w:t>
+      </w:r>
+      <w:proofErr w:type="spellStart"/>
+      <w:r>
+        <w:t>Busint</w:t>
+      </w:r>
+      <w:proofErr w:type="spellEnd"/>
+      <w:r>
+        <w:t xml:space="preserve"> et en générant des impulsions sur KEY0, ce qui </w:t>
+      </w:r>
       <w:r>
         <w:lastRenderedPageBreak/>
-        <w:t>Assemblage : Serrure électronique complète</w:t>
-      </w:r>
-      <w:bookmarkEnd w:id="21"/>
-    </w:p>
-    <w:p>
-      <w:pPr>
-        <w:pStyle w:val="Titre2"/>
-      </w:pPr>
-      <w:bookmarkStart w:id="22" w:name="_Toc220194535"/>
-      <w:r>
-        <w:t>Fonctionnement top module</w:t>
-      </w:r>
-      <w:bookmarkEnd w:id="22"/>
-    </w:p>
-    <w:p>
-      <w:r>
-        <w:t xml:space="preserve">Le module principal </w:t>
+        <w:t>reproduit l’action d’un utilisateur appuyant sur un bouton de validation. Deux scénarios sont testés : un premier avec un code correct (1-2-3-4), pour lequel la sortie Ouverture doit passer à '1', et un second avec un code incorrect, pour lequel la sortie reste à '0'. Les délais introduits entre chaque action permettent d’observer clairement l’évolution des signaux en simulation et de valider le fonctionnement global de la serrure numérique.</w:t>
+      </w:r>
+      <w:r>
+        <w:t xml:space="preserve"> Il a été découvert sur internet qu’il existait la possibilité de nommée ces process, c’est ce que j’ai fait pour des raisons de lecture de code.</w:t>
+      </w:r>
+    </w:p>
+    <w:p>
+      <w:r>
+        <w:t xml:space="preserve">Il y a également un fichier simu.do permettant d’automatiser les </w:t>
+      </w:r>
+      <w:r>
+        <w:t>tests.</w:t>
+      </w:r>
+    </w:p>
+    <w:p>
+      <w:pPr>
+        <w:pStyle w:val="Titre1"/>
+      </w:pPr>
+      <w:bookmarkStart w:id="25" w:name="_Toc220232048"/>
+      <w:r>
+        <w:t>Quartus prime</w:t>
+      </w:r>
+      <w:bookmarkEnd w:id="25"/>
+    </w:p>
+    <w:p>
+      <w:r>
+        <w:t xml:space="preserve">Pour la partie réalisée avec Quartus Prime, j’ai choisi de ne pas nommer le projet </w:t>
       </w:r>
       <w:proofErr w:type="spellStart"/>
       <w:r>
+        <w:rPr>
+          <w:i/>
+          <w:iCs/>
+        </w:rPr>
+        <w:t>serrure_electronique</w:t>
+      </w:r>
+      <w:proofErr w:type="spellEnd"/>
+      <w:r>
+        <w:t xml:space="preserve"> mais </w:t>
+      </w:r>
+      <w:proofErr w:type="spellStart"/>
+      <w:r>
+        <w:rPr>
+          <w:bCs/>
+        </w:rPr>
         <w:t>top_module</w:t>
       </w:r>
       <w:proofErr w:type="spellEnd"/>
       <w:r>
-        <w:t xml:space="preserve"> représente le fonctionnement global de la serrure numérique. Il est structuré de manière hiérarchique et relie plusieurs sous-blocs fonctionnels. Le signal KEY0 est d’abord traité par un détecteur de front, qui génère une impulsion (</w:t>
+        <w:t xml:space="preserve">. Ce choix a été fait afin de rester cohérent avec la base de travail déjà </w:t>
+      </w:r>
+      <w:r>
+        <w:t>effectué</w:t>
+      </w:r>
+      <w:r>
+        <w:t xml:space="preserve"> sous </w:t>
       </w:r>
       <w:proofErr w:type="spellStart"/>
       <w:r>
-        <w:t>detect_front</w:t>
+        <w:t>ModelSim</w:t>
       </w:r>
       <w:proofErr w:type="spellEnd"/>
       <w:r>
-        <w:t xml:space="preserve">) à chaque appui sur le bouton. Cette impulsion permet de valider la valeur présente sur </w:t>
+        <w:t xml:space="preserve">. </w:t>
+      </w:r>
+      <w:r>
+        <w:t>L</w:t>
+      </w:r>
+      <w:r>
+        <w:t xml:space="preserve">’ensemble des simulations fonctionnait correctement, et par précaution, j’ai préféré ne pas modifier le nom du fichier ni celui de l’entité VHDL, afin d’éviter tout risque de dysfonctionnement. Le projet Quartus porte donc le nom </w:t>
       </w:r>
       <w:proofErr w:type="spellStart"/>
       <w:r>
-        <w:t>Busint</w:t>
+        <w:rPr>
+          <w:i/>
+          <w:iCs/>
+        </w:rPr>
+        <w:t>top_module</w:t>
       </w:r>
       <w:proofErr w:type="spellEnd"/>
       <w:r>
-        <w:t>, qui correspond au chiffre saisi par l’utilisateur. La valeur est ensuite mémorisée dans une chaîne de quatre registres fonctionnant en décalage : à chaque validation, le nouveau chiffre est stocké dans le premier registre et les précédents sont décalés vers les suivants. Les quatre registres forment ainsi un bus interne de 16 bits représentant le code complet saisi. Ce bus est comparé à un code de référence par le comparateur 16 bits, et si les quatre chiffres sont corrects, la sortie Ouverture est mise à '1'. En parallèle, chaque registre est connecté à un décodeur 7 segments afin d’afficher les chiffres saisis sur les afficheurs HEX0 à HEX3.</w:t>
-      </w:r>
-    </w:p>
-    <w:p>
-      <w:pPr>
-        <w:pStyle w:val="Titre2"/>
-      </w:pPr>
-      <w:bookmarkStart w:id="23" w:name="_Toc220194536"/>
-      <w:r>
-        <w:t xml:space="preserve">Fonctionnement test </w:t>
+        <w:t xml:space="preserve"> et est organisé dans un dossier dédié nommé </w:t>
+      </w:r>
+      <w:r>
+        <w:rPr>
+          <w:i/>
+          <w:iCs/>
+        </w:rPr>
+        <w:t>Quartus</w:t>
+      </w:r>
+      <w:r>
+        <w:t>.</w:t>
+      </w:r>
+    </w:p>
+    <w:p>
+      <w:r>
+        <w:t xml:space="preserve">Dans cette </w:t>
+      </w:r>
+      <w:r>
+        <w:t>partie du projet</w:t>
+      </w:r>
+      <w:r>
+        <w:t xml:space="preserve">, je me suis appuyé sur la documentation et la CAO électronique de la carte </w:t>
+      </w:r>
+      <w:r>
+        <w:rPr>
+          <w:bCs/>
+        </w:rPr>
+        <w:t>DE10-Lite</w:t>
+      </w:r>
+      <w:r>
+        <w:t xml:space="preserve"> afin d’identifier le raccordement des broches (</w:t>
+      </w:r>
+      <w:r>
+        <w:rPr>
+          <w:i/>
+          <w:iCs/>
+        </w:rPr>
+        <w:t>pins</w:t>
+      </w:r>
+      <w:r>
+        <w:t>). Une difficulté rencontrée concernait l’apparition de broches non souhaitées dans Quartus Prime</w:t>
+      </w:r>
+      <w:r>
+        <w:t xml:space="preserve">, le </w:t>
       </w:r>
       <w:proofErr w:type="spellStart"/>
       <w:r>
-        <w:t>bench</w:t>
-      </w:r>
-      <w:bookmarkEnd w:id="23"/>
+        <w:rPr>
+          <w:i/>
+          <w:iCs/>
+        </w:rPr>
+        <w:t>buscode</w:t>
+      </w:r>
       <w:proofErr w:type="spellEnd"/>
       <w:r>
-        <w:t xml:space="preserve"> </w:t>
-      </w:r>
-    </w:p>
-    <w:p>
-      <w:r>
-        <w:t xml:space="preserve">Le banc de test </w:t>
+        <w:t>. Dans un premier temps, j’ai laissé Quartus affecter automatiquement les broches, en considérant que l’outil pouvait adapter les connexions en fonction d</w:t>
+      </w:r>
+      <w:r>
+        <w:t xml:space="preserve">e la carte </w:t>
       </w:r>
       <w:proofErr w:type="spellStart"/>
       <w:r>
-        <w:t>top_module_tb</w:t>
+        <w:t>électroniqeu</w:t>
       </w:r>
       <w:proofErr w:type="spellEnd"/>
       <w:r>
-        <w:t xml:space="preserve"> permet de vérifier le comportement du système sans matériel réel. Il génère d’abord une horloge périodique et pilote le signal de reset afin d’initialiser correctement le système. Ensuite, le </w:t>
+        <w:t>. Cependant, cette configuration automatique ne donnait pas le résultat attendu</w:t>
+      </w:r>
+      <w:r>
+        <w:t>, voir même ne fonctionnait pas</w:t>
+      </w:r>
+      <w:r>
+        <w:t>.</w:t>
+      </w:r>
+    </w:p>
+    <w:p>
+      <w:r>
+        <w:t xml:space="preserve">J’ai alors choisi de revenir sur mes fichiers VHDL dans l’environnement </w:t>
       </w:r>
       <w:proofErr w:type="spellStart"/>
       <w:r>
-        <w:t>testbench</w:t>
+        <w:t>ModelSim</w:t>
       </w:r>
       <w:proofErr w:type="spellEnd"/>
       <w:r>
-        <w:t xml:space="preserve"> simule la saisie d’un code en appliquant successivement différentes valeurs sur </w:t>
+        <w:t xml:space="preserve"> et </w:t>
       </w:r>
       <w:proofErr w:type="spellStart"/>
       <w:r>
-        <w:t>Busint</w:t>
+        <w:t>VScode</w:t>
       </w:r>
       <w:proofErr w:type="spellEnd"/>
       <w:r>
-        <w:t xml:space="preserve"> et en générant des impulsions sur KEY0, ce qui reproduit l’action d’un utilisateur appuyant sur un bouton de validation. Deux scénarios sont testés : un premier avec un code correct (1-2-3-4), pour lequel la sortie Ouverture doit passer à '1', et un second avec un code incorrect, pour lequel la sortie reste à '0'. Les délais introduits entre chaque action permettent d’observer clairement l’évolution des signaux en simulation et de valider le fonctionnement global de la serrure numérique.</w:t>
-      </w:r>
-      <w:r>
-        <w:t xml:space="preserve"> Il a été découvert sur internet qu’il existait la possibilité de nommée ces process, c’est ce que j’ai fait pour des raisons de lecture de code.</w:t>
-      </w:r>
-    </w:p>
-    <w:p>
-      <w:r>
-        <w:t xml:space="preserve">Il y a également un fichier simu.do permettant d’automatiser les </w:t>
-      </w:r>
-      <w:r>
-        <w:t>tests.</w:t>
-      </w:r>
+        <w:t xml:space="preserve"> afin d’analyser, corriger et valider le fonctionnement du code par simulation. Une fois le comportement confirmé</w:t>
+      </w:r>
+      <w:r>
+        <w:t xml:space="preserve"> à priori</w:t>
+      </w:r>
+      <w:r>
+        <w:t xml:space="preserve">, j’ai copié les fichiers VHDL validés dans le dossier du projet Quartus. Après cette mise à jour, les broches problématiques sont apparues comme </w:t>
+      </w:r>
+      <w:proofErr w:type="spellStart"/>
+      <w:r>
+        <w:rPr>
+          <w:i/>
+          <w:iCs/>
+        </w:rPr>
+        <w:t>Unknown</w:t>
+      </w:r>
+      <w:proofErr w:type="spellEnd"/>
+      <w:r>
+        <w:t xml:space="preserve">, ce qui indique </w:t>
+      </w:r>
+      <w:r>
+        <w:t xml:space="preserve">normalement </w:t>
+      </w:r>
+      <w:r>
+        <w:t xml:space="preserve">qu’elles sont désormais gérées en interne et qu’il n’est plus nécessaire de les affecter. </w:t>
+      </w:r>
+    </w:p>
+    <w:p>
+      <w:pPr>
+        <w:jc w:val="center"/>
+      </w:pPr>
+      <w:r>
+        <w:lastRenderedPageBreak/>
+        <w:drawing>
+          <wp:inline distT="0" distB="0" distL="0" distR="0" wp14:anchorId="02D06997" wp14:editId="1D6AE8B7">
+            <wp:extent cx="5760720" cy="3319780"/>
+            <wp:effectExtent l="0" t="0" r="0" b="0"/>
+            <wp:docPr id="10" name="Image 10"/>
+            <wp:cNvGraphicFramePr>
+              <a:graphicFrameLocks xmlns:a="http://schemas.openxmlformats.org/drawingml/2006/main" noChangeAspect="1"/>
+            </wp:cNvGraphicFramePr>
+            <a:graphic xmlns:a="http://schemas.openxmlformats.org/drawingml/2006/main">
+              <a:graphicData uri="http://schemas.openxmlformats.org/drawingml/2006/picture">
+                <pic:pic xmlns:pic="http://schemas.openxmlformats.org/drawingml/2006/picture">
+                  <pic:nvPicPr>
+                    <pic:cNvPr id="1" name=""/>
+                    <pic:cNvPicPr/>
+                  </pic:nvPicPr>
+                  <pic:blipFill>
+                    <a:blip r:embed="rId20"/>
+                    <a:stretch>
+                      <a:fillRect/>
+                    </a:stretch>
+                  </pic:blipFill>
+                  <pic:spPr>
+                    <a:xfrm>
+                      <a:off x="0" y="0"/>
+                      <a:ext cx="5760720" cy="3319780"/>
+                    </a:xfrm>
+                    <a:prstGeom prst="rect">
+                      <a:avLst/>
+                    </a:prstGeom>
+                  </pic:spPr>
+                </pic:pic>
+              </a:graphicData>
+            </a:graphic>
+          </wp:inline>
+        </w:drawing>
+      </w:r>
+    </w:p>
+    <w:p>
+      <w:pPr>
+        <w:keepNext/>
+        <w:jc w:val="center"/>
+      </w:pPr>
+      <w:r>
+        <w:drawing>
+          <wp:inline distT="0" distB="0" distL="0" distR="0" wp14:anchorId="5E922863" wp14:editId="656E86C0">
+            <wp:extent cx="5760720" cy="1753870"/>
+            <wp:effectExtent l="0" t="0" r="0" b="0"/>
+            <wp:docPr id="14" name="Image 14"/>
+            <wp:cNvGraphicFramePr>
+              <a:graphicFrameLocks xmlns:a="http://schemas.openxmlformats.org/drawingml/2006/main" noChangeAspect="1"/>
+            </wp:cNvGraphicFramePr>
+            <a:graphic xmlns:a="http://schemas.openxmlformats.org/drawingml/2006/main">
+              <a:graphicData uri="http://schemas.openxmlformats.org/drawingml/2006/picture">
+                <pic:pic xmlns:pic="http://schemas.openxmlformats.org/drawingml/2006/picture">
+                  <pic:nvPicPr>
+                    <pic:cNvPr id="1" name=""/>
+                    <pic:cNvPicPr/>
+                  </pic:nvPicPr>
+                  <pic:blipFill>
+                    <a:blip r:embed="rId21"/>
+                    <a:stretch>
+                      <a:fillRect/>
+                    </a:stretch>
+                  </pic:blipFill>
+                  <pic:spPr>
+                    <a:xfrm>
+                      <a:off x="0" y="0"/>
+                      <a:ext cx="5760720" cy="1753870"/>
+                    </a:xfrm>
+                    <a:prstGeom prst="rect">
+                      <a:avLst/>
+                    </a:prstGeom>
+                  </pic:spPr>
+                </pic:pic>
+              </a:graphicData>
+            </a:graphic>
+          </wp:inline>
+        </w:drawing>
+      </w:r>
+    </w:p>
+    <w:p>
+      <w:pPr>
+        <w:pStyle w:val="Lgende"/>
+      </w:pPr>
+      <w:bookmarkStart w:id="26" w:name="_Toc220231416"/>
+      <w:r>
+        <w:t xml:space="preserve">Figure </w:t>
+      </w:r>
+      <w:r>
+        <w:fldChar w:fldCharType="begin"/>
+      </w:r>
+      <w:r>
+        <w:instrText xml:space="preserve"> SEQ Figure \* ARABIC </w:instrText>
+      </w:r>
+      <w:r>
+        <w:fldChar w:fldCharType="separate"/>
+      </w:r>
+      <w:r>
+        <w:rPr>
+          <w:noProof/>
+        </w:rPr>
+        <w:t>12</w:t>
+      </w:r>
+      <w:r>
+        <w:fldChar w:fldCharType="end"/>
+      </w:r>
+      <w:r>
+        <w:t xml:space="preserve"> : </w:t>
+      </w:r>
+      <w:proofErr w:type="spellStart"/>
+      <w:r>
+        <w:t>Assignment</w:t>
+      </w:r>
+      <w:proofErr w:type="spellEnd"/>
+      <w:r>
+        <w:t xml:space="preserve"> pin</w:t>
+      </w:r>
+      <w:bookmarkEnd w:id="26"/>
     </w:p>
     <w:p>
       <w:pPr>
@@ -4458,14 +4954,14 @@
           <w:rFonts w:eastAsia="Times New Roman"/>
         </w:rPr>
       </w:pPr>
-      <w:bookmarkStart w:id="24" w:name="_Toc220194537"/>
+      <w:bookmarkStart w:id="27" w:name="_Toc220232049"/>
       <w:r>
         <w:rPr>
           <w:rFonts w:eastAsia="Times New Roman"/>
         </w:rPr>
         <w:t>Sources</w:t>
       </w:r>
-      <w:bookmarkEnd w:id="24"/>
+      <w:bookmarkEnd w:id="27"/>
     </w:p>
     <w:p>
       <w:r>
@@ -4473,7 +4969,7 @@
       </w:r>
     </w:p>
     <w:p>
-      <w:hyperlink r:id="rId19" w:history="1">
+      <w:hyperlink r:id="rId22" w:history="1">
         <w:r>
           <w:rPr>
             <w:rStyle w:val="Lienhypertexte"/>
@@ -4483,7 +4979,7 @@
       </w:hyperlink>
     </w:p>
     <w:p>
-      <w:hyperlink r:id="rId20" w:history="1">
+      <w:hyperlink r:id="rId23" w:anchor=":~:text=A%20test%20bench%20is%20a,ports%20of%20the%20UUT%20entity" w:history="1">
         <w:r>
           <w:rPr>
             <w:rStyle w:val="Lienhypertexte"/>
@@ -4496,7 +4992,7 @@
       </w:r>
     </w:p>
     <w:p>
-      <w:hyperlink r:id="rId21" w:history="1">
+      <w:hyperlink r:id="rId24" w:history="1">
         <w:r>
           <w:rPr>
             <w:rStyle w:val="Lienhypertexte"/>
@@ -4506,7 +5002,7 @@
       </w:hyperlink>
     </w:p>
     <w:p>
-      <w:hyperlink r:id="rId22" w:history="1">
+      <w:hyperlink r:id="rId25" w:history="1">
         <w:r>
           <w:rPr>
             <w:rStyle w:val="Lienhypertexte"/>
@@ -4516,7 +5012,12 @@
       </w:hyperlink>
     </w:p>
     <w:p>
-      <w:hyperlink r:id="rId23" w:history="1">
+      <w:pPr>
+        <w:rPr>
+          <w:rStyle w:val="Lienhypertexte"/>
+        </w:rPr>
+      </w:pPr>
+      <w:hyperlink r:id="rId26" w:history="1">
         <w:r>
           <w:rPr>
             <w:rStyle w:val="Lienhypertexte"/>
@@ -4525,13 +5026,27 @@
         </w:r>
       </w:hyperlink>
     </w:p>
-    <w:p/>
-    <w:p/>
-    <w:p/>
-    <w:p>
-      <w:pPr>
-        <w:rPr>
-          <w:rFonts w:asciiTheme="majorHAnsi" w:hAnsiTheme="majorHAnsi" w:cstheme="majorBidi"/>
+    <w:p>
+      <w:pPr>
+        <w:spacing w:line="278" w:lineRule="auto"/>
+        <w:jc w:val="left"/>
+        <w:rPr>
+          <w:rStyle w:val="Lienhypertexte"/>
+        </w:rPr>
+      </w:pPr>
+      <w:r>
+        <w:rPr>
+          <w:rStyle w:val="Lienhypertexte"/>
+        </w:rPr>
+        <w:br w:type="page"/>
+      </w:r>
+    </w:p>
+    <w:p>
+      <w:pPr>
+        <w:spacing w:line="278" w:lineRule="auto"/>
+        <w:jc w:val="left"/>
+        <w:rPr>
+          <w:rFonts w:asciiTheme="majorHAnsi" w:eastAsia="Times New Roman" w:hAnsiTheme="majorHAnsi" w:cstheme="majorBidi"/>
           <w:b/>
           <w:color w:val="000000" w:themeColor="text1"/>
           <w:sz w:val="28"/>
@@ -4540,6 +5055,10 @@
         </w:rPr>
       </w:pPr>
       <w:r>
+        <w:rPr>
+          <w:rFonts w:eastAsia="Times New Roman"/>
+        </w:rPr>
+        <w:lastRenderedPageBreak/>
         <w:br w:type="page"/>
       </w:r>
     </w:p>
@@ -4551,10 +5070,10 @@
           <w:numId w:val="0"/>
         </w:numPr>
         <w:rPr>
-          <w:rFonts w:eastAsia="Times New Roman"/>
-        </w:rPr>
-      </w:pPr>
-      <w:bookmarkStart w:id="25" w:name="_Toc220194538"/>
+          <w:rFonts w:eastAsiaTheme="minorHAnsi"/>
+        </w:rPr>
+      </w:pPr>
+      <w:bookmarkStart w:id="28" w:name="_Toc220232050"/>
       <w:r>
         <w:rPr>
           <w:rFonts w:eastAsia="Times New Roman"/>
@@ -4562,7 +5081,7 @@
         <w:lastRenderedPageBreak/>
         <w:t>Tables des figures</w:t>
       </w:r>
-      <w:bookmarkEnd w:id="25"/>
+      <w:bookmarkEnd w:id="28"/>
     </w:p>
     <w:p>
       <w:pPr>
@@ -4603,7 +5122,7 @@
         </w:rPr>
         <w:fldChar w:fldCharType="separate"/>
       </w:r>
-      <w:hyperlink w:anchor="_Toc220194513" w:history="1">
+      <w:hyperlink w:anchor="_Toc220231405" w:history="1">
         <w:r>
           <w:rPr>
             <w:rStyle w:val="Lienhypertexte"/>
@@ -4630,7 +5149,7 @@
             <w:noProof/>
             <w:webHidden/>
           </w:rPr>
-          <w:instrText xml:space="preserve"> PAGEREF _Toc220194513 \h </w:instrText>
+          <w:instrText xml:space="preserve"> PAGEREF _Toc220231405 \h </w:instrText>
         </w:r>
         <w:r>
           <w:rPr>
@@ -4673,7 +5192,7 @@
           <w:sz w:val="24"/>
         </w:rPr>
       </w:pPr>
-      <w:hyperlink w:anchor="_Toc220194514" w:history="1">
+      <w:hyperlink w:anchor="_Toc220231406" w:history="1">
         <w:r>
           <w:rPr>
             <w:rStyle w:val="Lienhypertexte"/>
@@ -4700,7 +5219,7 @@
             <w:noProof/>
             <w:webHidden/>
           </w:rPr>
-          <w:instrText xml:space="preserve"> PAGEREF _Toc220194514 \h </w:instrText>
+          <w:instrText xml:space="preserve"> PAGEREF _Toc220231406 \h </w:instrText>
         </w:r>
         <w:r>
           <w:rPr>
@@ -4743,7 +5262,7 @@
           <w:sz w:val="24"/>
         </w:rPr>
       </w:pPr>
-      <w:hyperlink w:anchor="_Toc220194515" w:history="1">
+      <w:hyperlink w:anchor="_Toc220231407" w:history="1">
         <w:r>
           <w:rPr>
             <w:rStyle w:val="Lienhypertexte"/>
@@ -4770,7 +5289,7 @@
             <w:noProof/>
             <w:webHidden/>
           </w:rPr>
-          <w:instrText xml:space="preserve"> PAGEREF _Toc220194515 \h </w:instrText>
+          <w:instrText xml:space="preserve"> PAGEREF _Toc220231407 \h </w:instrText>
         </w:r>
         <w:r>
           <w:rPr>
@@ -4813,7 +5332,7 @@
           <w:sz w:val="24"/>
         </w:rPr>
       </w:pPr>
-      <w:hyperlink w:anchor="_Toc220194516" w:history="1">
+      <w:hyperlink w:anchor="_Toc220231408" w:history="1">
         <w:r>
           <w:rPr>
             <w:rStyle w:val="Lienhypertexte"/>
@@ -4840,7 +5359,7 @@
             <w:noProof/>
             <w:webHidden/>
           </w:rPr>
-          <w:instrText xml:space="preserve"> PAGEREF _Toc220194516 \h </w:instrText>
+          <w:instrText xml:space="preserve"> PAGEREF _Toc220231408 \h </w:instrText>
         </w:r>
         <w:r>
           <w:rPr>
@@ -4883,7 +5402,7 @@
           <w:sz w:val="24"/>
         </w:rPr>
       </w:pPr>
-      <w:hyperlink w:anchor="_Toc220194517" w:history="1">
+      <w:hyperlink w:anchor="_Toc220231409" w:history="1">
         <w:r>
           <w:rPr>
             <w:rStyle w:val="Lienhypertexte"/>
@@ -4910,7 +5429,7 @@
             <w:noProof/>
             <w:webHidden/>
           </w:rPr>
-          <w:instrText xml:space="preserve"> PAGEREF _Toc220194517 \h </w:instrText>
+          <w:instrText xml:space="preserve"> PAGEREF _Toc220231409 \h </w:instrText>
         </w:r>
         <w:r>
           <w:rPr>
@@ -4953,7 +5472,7 @@
           <w:sz w:val="24"/>
         </w:rPr>
       </w:pPr>
-      <w:hyperlink w:anchor="_Toc220194518" w:history="1">
+      <w:hyperlink w:anchor="_Toc220231410" w:history="1">
         <w:r>
           <w:rPr>
             <w:rStyle w:val="Lienhypertexte"/>
@@ -4980,7 +5499,7 @@
             <w:noProof/>
             <w:webHidden/>
           </w:rPr>
-          <w:instrText xml:space="preserve"> PAGEREF _Toc220194518 \h </w:instrText>
+          <w:instrText xml:space="preserve"> PAGEREF _Toc220231410 \h </w:instrText>
         </w:r>
         <w:r>
           <w:rPr>
@@ -5023,7 +5542,7 @@
           <w:sz w:val="24"/>
         </w:rPr>
       </w:pPr>
-      <w:hyperlink w:anchor="_Toc220194519" w:history="1">
+      <w:hyperlink w:anchor="_Toc220231411" w:history="1">
         <w:r>
           <w:rPr>
             <w:rStyle w:val="Lienhypertexte"/>
@@ -5050,7 +5569,7 @@
             <w:noProof/>
             <w:webHidden/>
           </w:rPr>
-          <w:instrText xml:space="preserve"> PAGEREF _Toc220194519 \h </w:instrText>
+          <w:instrText xml:space="preserve"> PAGEREF _Toc220231411 \h </w:instrText>
         </w:r>
         <w:r>
           <w:rPr>
@@ -5093,7 +5612,7 @@
           <w:sz w:val="24"/>
         </w:rPr>
       </w:pPr>
-      <w:hyperlink w:anchor="_Toc220194520" w:history="1">
+      <w:hyperlink w:anchor="_Toc220231412" w:history="1">
         <w:r>
           <w:rPr>
             <w:rStyle w:val="Lienhypertexte"/>
@@ -5120,7 +5639,7 @@
             <w:noProof/>
             <w:webHidden/>
           </w:rPr>
-          <w:instrText xml:space="preserve"> PAGEREF _Toc220194520 \h </w:instrText>
+          <w:instrText xml:space="preserve"> PAGEREF _Toc220231412 \h </w:instrText>
         </w:r>
         <w:r>
           <w:rPr>
@@ -5163,7 +5682,7 @@
           <w:sz w:val="24"/>
         </w:rPr>
       </w:pPr>
-      <w:hyperlink w:anchor="_Toc220194521" w:history="1">
+      <w:hyperlink w:anchor="_Toc220231413" w:history="1">
         <w:r>
           <w:rPr>
             <w:rStyle w:val="Lienhypertexte"/>
@@ -5190,7 +5709,7 @@
             <w:noProof/>
             <w:webHidden/>
           </w:rPr>
-          <w:instrText xml:space="preserve"> PAGEREF _Toc220194521 \h </w:instrText>
+          <w:instrText xml:space="preserve"> PAGEREF _Toc220231413 \h </w:instrText>
         </w:r>
         <w:r>
           <w:rPr>
@@ -5233,7 +5752,7 @@
           <w:sz w:val="24"/>
         </w:rPr>
       </w:pPr>
-      <w:hyperlink w:anchor="_Toc220194522" w:history="1">
+      <w:hyperlink w:anchor="_Toc220231414" w:history="1">
         <w:r>
           <w:rPr>
             <w:rStyle w:val="Lienhypertexte"/>
@@ -5260,7 +5779,7 @@
             <w:noProof/>
             <w:webHidden/>
           </w:rPr>
-          <w:instrText xml:space="preserve"> PAGEREF _Toc220194522 \h </w:instrText>
+          <w:instrText xml:space="preserve"> PAGEREF _Toc220231414 \h </w:instrText>
         </w:r>
         <w:r>
           <w:rPr>
@@ -5281,6 +5800,146 @@
             <w:webHidden/>
           </w:rPr>
           <w:t>16</w:t>
+        </w:r>
+        <w:r>
+          <w:rPr>
+            <w:noProof/>
+            <w:webHidden/>
+          </w:rPr>
+          <w:fldChar w:fldCharType="end"/>
+        </w:r>
+      </w:hyperlink>
+    </w:p>
+    <w:p>
+      <w:pPr>
+        <w:pStyle w:val="Tabledesillustrations"/>
+        <w:tabs>
+          <w:tab w:val="right" w:leader="dot" w:pos="9062"/>
+        </w:tabs>
+        <w:rPr>
+          <w:rFonts w:asciiTheme="minorHAnsi" w:eastAsiaTheme="minorEastAsia" w:hAnsiTheme="minorHAnsi"/>
+          <w:noProof/>
+          <w:sz w:val="24"/>
+        </w:rPr>
+      </w:pPr>
+      <w:hyperlink w:anchor="_Toc220231415" w:history="1">
+        <w:r>
+          <w:rPr>
+            <w:rStyle w:val="Lienhypertexte"/>
+            <w:noProof/>
+          </w:rPr>
+          <w:t>Figure 11 : Schéma Comparateur 16 bits</w:t>
+        </w:r>
+        <w:r>
+          <w:rPr>
+            <w:noProof/>
+            <w:webHidden/>
+          </w:rPr>
+          <w:tab/>
+        </w:r>
+        <w:r>
+          <w:rPr>
+            <w:noProof/>
+            <w:webHidden/>
+          </w:rPr>
+          <w:fldChar w:fldCharType="begin"/>
+        </w:r>
+        <w:r>
+          <w:rPr>
+            <w:noProof/>
+            <w:webHidden/>
+          </w:rPr>
+          <w:instrText xml:space="preserve"> PAGEREF _Toc220231415 \h </w:instrText>
+        </w:r>
+        <w:r>
+          <w:rPr>
+            <w:noProof/>
+            <w:webHidden/>
+          </w:rPr>
+        </w:r>
+        <w:r>
+          <w:rPr>
+            <w:noProof/>
+            <w:webHidden/>
+          </w:rPr>
+          <w:fldChar w:fldCharType="separate"/>
+        </w:r>
+        <w:r>
+          <w:rPr>
+            <w:noProof/>
+            <w:webHidden/>
+          </w:rPr>
+          <w:t>17</w:t>
+        </w:r>
+        <w:r>
+          <w:rPr>
+            <w:noProof/>
+            <w:webHidden/>
+          </w:rPr>
+          <w:fldChar w:fldCharType="end"/>
+        </w:r>
+      </w:hyperlink>
+    </w:p>
+    <w:p>
+      <w:pPr>
+        <w:pStyle w:val="Tabledesillustrations"/>
+        <w:tabs>
+          <w:tab w:val="right" w:leader="dot" w:pos="9062"/>
+        </w:tabs>
+        <w:rPr>
+          <w:rFonts w:asciiTheme="minorHAnsi" w:eastAsiaTheme="minorEastAsia" w:hAnsiTheme="minorHAnsi"/>
+          <w:noProof/>
+          <w:sz w:val="24"/>
+        </w:rPr>
+      </w:pPr>
+      <w:hyperlink w:anchor="_Toc220231416" w:history="1">
+        <w:r>
+          <w:rPr>
+            <w:rStyle w:val="Lienhypertexte"/>
+            <w:noProof/>
+          </w:rPr>
+          <w:t>Figure 12 : Assignment pin</w:t>
+        </w:r>
+        <w:r>
+          <w:rPr>
+            <w:noProof/>
+            <w:webHidden/>
+          </w:rPr>
+          <w:tab/>
+        </w:r>
+        <w:r>
+          <w:rPr>
+            <w:noProof/>
+            <w:webHidden/>
+          </w:rPr>
+          <w:fldChar w:fldCharType="begin"/>
+        </w:r>
+        <w:r>
+          <w:rPr>
+            <w:noProof/>
+            <w:webHidden/>
+          </w:rPr>
+          <w:instrText xml:space="preserve"> PAGEREF _Toc220231416 \h </w:instrText>
+        </w:r>
+        <w:r>
+          <w:rPr>
+            <w:noProof/>
+            <w:webHidden/>
+          </w:rPr>
+        </w:r>
+        <w:r>
+          <w:rPr>
+            <w:noProof/>
+            <w:webHidden/>
+          </w:rPr>
+          <w:fldChar w:fldCharType="separate"/>
+        </w:r>
+        <w:r>
+          <w:rPr>
+            <w:noProof/>
+            <w:webHidden/>
+          </w:rPr>
+          <w:t>19</w:t>
         </w:r>
         <w:r>
           <w:rPr>
@@ -5316,9 +5975,9 @@
       </w:r>
     </w:p>
     <w:sectPr>
-      <w:headerReference w:type="default" r:id="rId24"/>
-      <w:footerReference w:type="default" r:id="rId25"/>
-      <w:headerReference w:type="first" r:id="rId26"/>
+      <w:headerReference w:type="default" r:id="rId27"/>
+      <w:footerReference w:type="default" r:id="rId28"/>
+      <w:headerReference w:type="first" r:id="rId29"/>
       <w:pgSz w:w="11906" w:h="16838"/>
       <w:pgMar w:top="1417" w:right="1417" w:bottom="1417" w:left="1417" w:header="708" w:footer="708" w:gutter="0"/>
       <w:cols w:space="708"/>
@@ -5448,6 +6107,146 @@
     <w:pPr>
       <w:pStyle w:val="En-tte"/>
     </w:pPr>
+    <w:r>
+      <w:rPr>
+        <w:noProof/>
+      </w:rPr>
+      <w:drawing>
+        <wp:anchor distT="0" distB="0" distL="114300" distR="114300" simplePos="0" relativeHeight="251665408" behindDoc="0" locked="0" layoutInCell="1" allowOverlap="1" wp14:anchorId="798934F1" wp14:editId="409F5680">
+          <wp:simplePos x="0" y="0"/>
+          <wp:positionH relativeFrom="column">
+            <wp:posOffset>4911725</wp:posOffset>
+          </wp:positionH>
+          <wp:positionV relativeFrom="paragraph">
+            <wp:posOffset>-424180</wp:posOffset>
+          </wp:positionV>
+          <wp:extent cx="1699260" cy="679450"/>
+          <wp:effectExtent l="0" t="0" r="0" b="6350"/>
+          <wp:wrapNone/>
+          <wp:docPr id="16" name="Image 16"/>
+          <wp:cNvGraphicFramePr>
+            <a:graphicFrameLocks xmlns:a="http://schemas.openxmlformats.org/drawingml/2006/main" noChangeAspect="1"/>
+          </wp:cNvGraphicFramePr>
+          <a:graphic xmlns:a="http://schemas.openxmlformats.org/drawingml/2006/main">
+            <a:graphicData uri="http://schemas.openxmlformats.org/drawingml/2006/picture">
+              <pic:pic xmlns:pic="http://schemas.openxmlformats.org/drawingml/2006/picture">
+                <pic:nvPicPr>
+                  <pic:cNvPr id="0" name="Picture 23"/>
+                  <pic:cNvPicPr>
+                    <a:picLocks noChangeAspect="1" noChangeArrowheads="1"/>
+                  </pic:cNvPicPr>
+                </pic:nvPicPr>
+                <pic:blipFill rotWithShape="1">
+                  <a:blip r:embed="rId1">
+                    <a:extLst>
+                      <a:ext uri="{28A0092B-C50C-407E-A947-70E740481C1C}">
+                        <a14:useLocalDpi xmlns:a14="http://schemas.microsoft.com/office/drawing/2010/main" val="0"/>
+                      </a:ext>
+                    </a:extLst>
+                  </a:blip>
+                  <a:srcRect l="56838"/>
+                  <a:stretch/>
+                </pic:blipFill>
+                <pic:spPr bwMode="auto">
+                  <a:xfrm>
+                    <a:off x="0" y="0"/>
+                    <a:ext cx="1699260" cy="679450"/>
+                  </a:xfrm>
+                  <a:prstGeom prst="rect">
+                    <a:avLst/>
+                  </a:prstGeom>
+                  <a:noFill/>
+                  <a:ln>
+                    <a:noFill/>
+                  </a:ln>
+                  <a:extLst>
+                    <a:ext uri="{53640926-AAD7-44D8-BBD7-CCE9431645EC}">
+                      <a14:shadowObscured xmlns:a14="http://schemas.microsoft.com/office/drawing/2010/main"/>
+                    </a:ext>
+                  </a:extLst>
+                </pic:spPr>
+              </pic:pic>
+            </a:graphicData>
+          </a:graphic>
+          <wp14:sizeRelH relativeFrom="margin">
+            <wp14:pctWidth>0</wp14:pctWidth>
+          </wp14:sizeRelH>
+          <wp14:sizeRelV relativeFrom="margin">
+            <wp14:pctHeight>0</wp14:pctHeight>
+          </wp14:sizeRelV>
+        </wp:anchor>
+      </w:drawing>
+    </w:r>
+    <w:r>
+      <w:rPr>
+        <w:noProof/>
+      </w:rPr>
+      <w:drawing>
+        <wp:anchor distT="0" distB="0" distL="114300" distR="114300" simplePos="0" relativeHeight="251666432" behindDoc="0" locked="0" layoutInCell="1" allowOverlap="1" wp14:anchorId="4A6D1ADC" wp14:editId="1542D984">
+          <wp:simplePos x="0" y="0"/>
+          <wp:positionH relativeFrom="column">
+            <wp:posOffset>-900752</wp:posOffset>
+          </wp:positionH>
+          <wp:positionV relativeFrom="paragraph">
+            <wp:posOffset>-423716</wp:posOffset>
+          </wp:positionV>
+          <wp:extent cx="2210938" cy="679450"/>
+          <wp:effectExtent l="0" t="0" r="0" b="6350"/>
+          <wp:wrapNone/>
+          <wp:docPr id="17" name="Image 17"/>
+          <wp:cNvGraphicFramePr>
+            <a:graphicFrameLocks xmlns:a="http://schemas.openxmlformats.org/drawingml/2006/main" noChangeAspect="1"/>
+          </wp:cNvGraphicFramePr>
+          <a:graphic xmlns:a="http://schemas.openxmlformats.org/drawingml/2006/main">
+            <a:graphicData uri="http://schemas.openxmlformats.org/drawingml/2006/picture">
+              <pic:pic xmlns:pic="http://schemas.openxmlformats.org/drawingml/2006/picture">
+                <pic:nvPicPr>
+                  <pic:cNvPr id="0" name="Picture 23"/>
+                  <pic:cNvPicPr>
+                    <a:picLocks noChangeAspect="1" noChangeArrowheads="1"/>
+                  </pic:cNvPicPr>
+                </pic:nvPicPr>
+                <pic:blipFill rotWithShape="1">
+                  <a:blip r:embed="rId1">
+                    <a:extLst>
+                      <a:ext uri="{28A0092B-C50C-407E-A947-70E740481C1C}">
+                        <a14:useLocalDpi xmlns:a14="http://schemas.microsoft.com/office/drawing/2010/main" val="0"/>
+                      </a:ext>
+                    </a:extLst>
+                  </a:blip>
+                  <a:srcRect r="43855"/>
+                  <a:stretch/>
+                </pic:blipFill>
+                <pic:spPr bwMode="auto">
+                  <a:xfrm>
+                    <a:off x="0" y="0"/>
+                    <a:ext cx="2210938" cy="679450"/>
+                  </a:xfrm>
+                  <a:prstGeom prst="rect">
+                    <a:avLst/>
+                  </a:prstGeom>
+                  <a:noFill/>
+                  <a:ln>
+                    <a:noFill/>
+                  </a:ln>
+                  <a:extLst>
+                    <a:ext uri="{53640926-AAD7-44D8-BBD7-CCE9431645EC}">
+                      <a14:shadowObscured xmlns:a14="http://schemas.microsoft.com/office/drawing/2010/main"/>
+                    </a:ext>
+                  </a:extLst>
+                </pic:spPr>
+              </pic:pic>
+            </a:graphicData>
+          </a:graphic>
+          <wp14:sizeRelH relativeFrom="margin">
+            <wp14:pctWidth>0</wp14:pctWidth>
+          </wp14:sizeRelH>
+          <wp14:sizeRelV relativeFrom="margin">
+            <wp14:pctHeight>0</wp14:pctHeight>
+          </wp14:sizeRelV>
+        </wp:anchor>
+      </w:drawing>
+    </w:r>
   </w:p>
   <w:p>
     <w:pPr>
@@ -5468,16 +6267,16 @@
         <w:noProof/>
       </w:rPr>
       <w:drawing>
-        <wp:anchor distT="0" distB="0" distL="114300" distR="114300" simplePos="0" relativeHeight="251661312" behindDoc="0" locked="0" layoutInCell="1" allowOverlap="1" wp14:anchorId="78F00A2B" wp14:editId="49AE5C57">
+        <wp:anchor distT="0" distB="0" distL="114300" distR="114300" simplePos="0" relativeHeight="251661312" behindDoc="0" locked="0" layoutInCell="1" allowOverlap="1" wp14:anchorId="78F00A2B" wp14:editId="0BCC6D82">
           <wp:simplePos x="0" y="0"/>
           <wp:positionH relativeFrom="column">
-            <wp:posOffset>2631977</wp:posOffset>
+            <wp:posOffset>4954270</wp:posOffset>
           </wp:positionH>
           <wp:positionV relativeFrom="paragraph">
-            <wp:posOffset>-391355</wp:posOffset>
+            <wp:posOffset>-462915</wp:posOffset>
           </wp:positionV>
-          <wp:extent cx="3938543" cy="679562"/>
-          <wp:effectExtent l="0" t="0" r="5080" b="6350"/>
+          <wp:extent cx="1699260" cy="679450"/>
+          <wp:effectExtent l="0" t="0" r="0" b="6350"/>
           <wp:wrapNone/>
           <wp:docPr id="8" name="Image 8"/>
           <wp:cNvGraphicFramePr>
@@ -5492,7 +6291,7 @@
                     <a:picLocks noChangeAspect="1" noChangeArrowheads="1"/>
                   </pic:cNvPicPr>
                 </pic:nvPicPr>
-                <pic:blipFill>
+                <pic:blipFill rotWithShape="1">
                   <a:blip r:embed="rId1">
                     <a:extLst>
                       <a:ext uri="{28A0092B-C50C-407E-A947-70E740481C1C}">
@@ -5500,15 +6299,13 @@
                       </a:ext>
                     </a:extLst>
                   </a:blip>
-                  <a:srcRect/>
-                  <a:stretch>
-                    <a:fillRect/>
-                  </a:stretch>
+                  <a:srcRect l="56838"/>
+                  <a:stretch/>
                 </pic:blipFill>
                 <pic:spPr bwMode="auto">
                   <a:xfrm>
                     <a:off x="0" y="0"/>
-                    <a:ext cx="3938543" cy="679562"/>
+                    <a:ext cx="1699260" cy="679450"/>
                   </a:xfrm>
                   <a:prstGeom prst="rect">
                     <a:avLst/>
@@ -5517,6 +6314,81 @@
                   <a:ln>
                     <a:noFill/>
                   </a:ln>
+                  <a:extLst>
+                    <a:ext uri="{53640926-AAD7-44D8-BBD7-CCE9431645EC}">
+                      <a14:shadowObscured xmlns:a14="http://schemas.microsoft.com/office/drawing/2010/main"/>
+                    </a:ext>
+                  </a:extLst>
+                </pic:spPr>
+              </pic:pic>
+            </a:graphicData>
+          </a:graphic>
+          <wp14:sizeRelH relativeFrom="margin">
+            <wp14:pctWidth>0</wp14:pctWidth>
+          </wp14:sizeRelH>
+          <wp14:sizeRelV relativeFrom="margin">
+            <wp14:pctHeight>0</wp14:pctHeight>
+          </wp14:sizeRelV>
+        </wp:anchor>
+      </w:drawing>
+    </w:r>
+    <w:r>
+      <w:rPr>
+        <w:noProof/>
+      </w:rPr>
+      <w:drawing>
+        <wp:anchor distT="0" distB="0" distL="114300" distR="114300" simplePos="0" relativeHeight="251663360" behindDoc="0" locked="0" layoutInCell="1" allowOverlap="1" wp14:anchorId="4E387ABC" wp14:editId="751D9AE6">
+          <wp:simplePos x="0" y="0"/>
+          <wp:positionH relativeFrom="column">
+            <wp:posOffset>-858520</wp:posOffset>
+          </wp:positionH>
+          <wp:positionV relativeFrom="paragraph">
+            <wp:posOffset>-463209</wp:posOffset>
+          </wp:positionV>
+          <wp:extent cx="2210938" cy="679450"/>
+          <wp:effectExtent l="0" t="0" r="0" b="6350"/>
+          <wp:wrapNone/>
+          <wp:docPr id="15" name="Image 15"/>
+          <wp:cNvGraphicFramePr>
+            <a:graphicFrameLocks xmlns:a="http://schemas.openxmlformats.org/drawingml/2006/main" noChangeAspect="1"/>
+          </wp:cNvGraphicFramePr>
+          <a:graphic xmlns:a="http://schemas.openxmlformats.org/drawingml/2006/main">
+            <a:graphicData uri="http://schemas.openxmlformats.org/drawingml/2006/picture">
+              <pic:pic xmlns:pic="http://schemas.openxmlformats.org/drawingml/2006/picture">
+                <pic:nvPicPr>
+                  <pic:cNvPr id="0" name="Picture 23"/>
+                  <pic:cNvPicPr>
+                    <a:picLocks noChangeAspect="1" noChangeArrowheads="1"/>
+                  </pic:cNvPicPr>
+                </pic:nvPicPr>
+                <pic:blipFill rotWithShape="1">
+                  <a:blip r:embed="rId1">
+                    <a:extLst>
+                      <a:ext uri="{28A0092B-C50C-407E-A947-70E740481C1C}">
+                        <a14:useLocalDpi xmlns:a14="http://schemas.microsoft.com/office/drawing/2010/main" val="0"/>
+                      </a:ext>
+                    </a:extLst>
+                  </a:blip>
+                  <a:srcRect r="43855"/>
+                  <a:stretch/>
+                </pic:blipFill>
+                <pic:spPr bwMode="auto">
+                  <a:xfrm>
+                    <a:off x="0" y="0"/>
+                    <a:ext cx="2210938" cy="679450"/>
+                  </a:xfrm>
+                  <a:prstGeom prst="rect">
+                    <a:avLst/>
+                  </a:prstGeom>
+                  <a:noFill/>
+                  <a:ln>
+                    <a:noFill/>
+                  </a:ln>
+                  <a:extLst>
+                    <a:ext uri="{53640926-AAD7-44D8-BBD7-CCE9431645EC}">
+                      <a14:shadowObscured xmlns:a14="http://schemas.microsoft.com/office/drawing/2010/main"/>
+                    </a:ext>
+                  </a:extLst>
                 </pic:spPr>
               </pic:pic>
             </a:graphicData>
@@ -5557,7 +6429,7 @@
         <v:path o:extrusionok="f" gradientshapeok="t" o:connecttype="rect"/>
         <o:lock v:ext="edit" aspectratio="t"/>
       </v:shapetype>
-      <v:shape id="_x0000_i1119" type="#_x0000_t75" style="width:11.25pt;height:11.25pt" o:bullet="t">
+      <v:shape id="_x0000_i1093" type="#_x0000_t75" style="width:11.25pt;height:11.25pt" o:bullet="t">
         <v:imagedata r:id="rId1" o:title="msoEA91"/>
       </v:shape>
     </w:pict>

</xml_diff>

<commit_message>
Fichier zipper a rendre normalement finaliser final + compte rendu mise au propre
</commit_message>
<xml_diff>
--- a/Mini_projet/CR_youssef/Rapport_FPGA.docx
+++ b/Mini_projet/CR_youssef/Rapport_FPGA.docx
@@ -264,7 +264,7 @@
           <w:r>
             <w:fldChar w:fldCharType="separate"/>
           </w:r>
-          <w:hyperlink w:anchor="_Toc220232034" w:history="1">
+          <w:hyperlink w:anchor="_Toc220235742" w:history="1">
             <w:r>
               <w:rPr>
                 <w:rStyle w:val="Lienhypertexte"/>
@@ -291,7 +291,7 @@
                 <w:noProof/>
                 <w:webHidden/>
               </w:rPr>
-              <w:instrText xml:space="preserve"> PAGEREF _Toc220232034 \h </w:instrText>
+              <w:instrText xml:space="preserve"> PAGEREF _Toc220235742 \h </w:instrText>
             </w:r>
             <w:r>
               <w:rPr>
@@ -334,7 +334,7 @@
               <w:sz w:val="24"/>
             </w:rPr>
           </w:pPr>
-          <w:hyperlink w:anchor="_Toc220232035" w:history="1">
+          <w:hyperlink w:anchor="_Toc220235743" w:history="1">
             <w:r>
               <w:rPr>
                 <w:rStyle w:val="Lienhypertexte"/>
@@ -361,7 +361,7 @@
                 <w:noProof/>
                 <w:webHidden/>
               </w:rPr>
-              <w:instrText xml:space="preserve"> PAGEREF _Toc220232035 \h </w:instrText>
+              <w:instrText xml:space="preserve"> PAGEREF _Toc220235743 \h </w:instrText>
             </w:r>
             <w:r>
               <w:rPr>
@@ -405,7 +405,7 @@
               <w:sz w:val="24"/>
             </w:rPr>
           </w:pPr>
-          <w:hyperlink w:anchor="_Toc220232036" w:history="1">
+          <w:hyperlink w:anchor="_Toc220235744" w:history="1">
             <w:r>
               <w:rPr>
                 <w:rStyle w:val="Lienhypertexte"/>
@@ -447,7 +447,7 @@
                 <w:noProof/>
                 <w:webHidden/>
               </w:rPr>
-              <w:instrText xml:space="preserve"> PAGEREF _Toc220232036 \h </w:instrText>
+              <w:instrText xml:space="preserve"> PAGEREF _Toc220235744 \h </w:instrText>
             </w:r>
             <w:r>
               <w:rPr>
@@ -491,7 +491,7 @@
               <w:sz w:val="24"/>
             </w:rPr>
           </w:pPr>
-          <w:hyperlink w:anchor="_Toc220232037" w:history="1">
+          <w:hyperlink w:anchor="_Toc220235745" w:history="1">
             <w:r>
               <w:rPr>
                 <w:rStyle w:val="Lienhypertexte"/>
@@ -533,7 +533,7 @@
                 <w:noProof/>
                 <w:webHidden/>
               </w:rPr>
-              <w:instrText xml:space="preserve"> PAGEREF _Toc220232037 \h </w:instrText>
+              <w:instrText xml:space="preserve"> PAGEREF _Toc220235745 \h </w:instrText>
             </w:r>
             <w:r>
               <w:rPr>
@@ -577,7 +577,7 @@
               <w:sz w:val="24"/>
             </w:rPr>
           </w:pPr>
-          <w:hyperlink w:anchor="_Toc220232038" w:history="1">
+          <w:hyperlink w:anchor="_Toc220235746" w:history="1">
             <w:r>
               <w:rPr>
                 <w:rStyle w:val="Lienhypertexte"/>
@@ -619,7 +619,7 @@
                 <w:noProof/>
                 <w:webHidden/>
               </w:rPr>
-              <w:instrText xml:space="preserve"> PAGEREF _Toc220232038 \h </w:instrText>
+              <w:instrText xml:space="preserve"> PAGEREF _Toc220235746 \h </w:instrText>
             </w:r>
             <w:r>
               <w:rPr>
@@ -663,7 +663,7 @@
               <w:sz w:val="24"/>
             </w:rPr>
           </w:pPr>
-          <w:hyperlink w:anchor="_Toc220232039" w:history="1">
+          <w:hyperlink w:anchor="_Toc220235747" w:history="1">
             <w:r>
               <w:rPr>
                 <w:rStyle w:val="Lienhypertexte"/>
@@ -705,7 +705,7 @@
                 <w:noProof/>
                 <w:webHidden/>
               </w:rPr>
-              <w:instrText xml:space="preserve"> PAGEREF _Toc220232039 \h </w:instrText>
+              <w:instrText xml:space="preserve"> PAGEREF _Toc220235747 \h </w:instrText>
             </w:r>
             <w:r>
               <w:rPr>
@@ -749,7 +749,7 @@
               <w:sz w:val="24"/>
             </w:rPr>
           </w:pPr>
-          <w:hyperlink w:anchor="_Toc220232040" w:history="1">
+          <w:hyperlink w:anchor="_Toc220235748" w:history="1">
             <w:r>
               <w:rPr>
                 <w:rStyle w:val="Lienhypertexte"/>
@@ -791,7 +791,7 @@
                 <w:noProof/>
                 <w:webHidden/>
               </w:rPr>
-              <w:instrText xml:space="preserve"> PAGEREF _Toc220232040 \h </w:instrText>
+              <w:instrText xml:space="preserve"> PAGEREF _Toc220235748 \h </w:instrText>
             </w:r>
             <w:r>
               <w:rPr>
@@ -835,7 +835,7 @@
               <w:sz w:val="24"/>
             </w:rPr>
           </w:pPr>
-          <w:hyperlink w:anchor="_Toc220232041" w:history="1">
+          <w:hyperlink w:anchor="_Toc220235749" w:history="1">
             <w:r>
               <w:rPr>
                 <w:rStyle w:val="Lienhypertexte"/>
@@ -877,7 +877,7 @@
                 <w:noProof/>
                 <w:webHidden/>
               </w:rPr>
-              <w:instrText xml:space="preserve"> PAGEREF _Toc220232041 \h </w:instrText>
+              <w:instrText xml:space="preserve"> PAGEREF _Toc220235749 \h </w:instrText>
             </w:r>
             <w:r>
               <w:rPr>
@@ -921,7 +921,7 @@
               <w:sz w:val="24"/>
             </w:rPr>
           </w:pPr>
-          <w:hyperlink w:anchor="_Toc220232042" w:history="1">
+          <w:hyperlink w:anchor="_Toc220235750" w:history="1">
             <w:r>
               <w:rPr>
                 <w:rStyle w:val="Lienhypertexte"/>
@@ -963,7 +963,7 @@
                 <w:noProof/>
                 <w:webHidden/>
               </w:rPr>
-              <w:instrText xml:space="preserve"> PAGEREF _Toc220232042 \h </w:instrText>
+              <w:instrText xml:space="preserve"> PAGEREF _Toc220235750 \h </w:instrText>
             </w:r>
             <w:r>
               <w:rPr>
@@ -1007,7 +1007,7 @@
               <w:sz w:val="24"/>
             </w:rPr>
           </w:pPr>
-          <w:hyperlink w:anchor="_Toc220232043" w:history="1">
+          <w:hyperlink w:anchor="_Toc220235751" w:history="1">
             <w:r>
               <w:rPr>
                 <w:rStyle w:val="Lienhypertexte"/>
@@ -1049,7 +1049,7 @@
                 <w:noProof/>
                 <w:webHidden/>
               </w:rPr>
-              <w:instrText xml:space="preserve"> PAGEREF _Toc220232043 \h </w:instrText>
+              <w:instrText xml:space="preserve"> PAGEREF _Toc220235751 \h </w:instrText>
             </w:r>
             <w:r>
               <w:rPr>
@@ -1093,7 +1093,7 @@
               <w:sz w:val="24"/>
             </w:rPr>
           </w:pPr>
-          <w:hyperlink w:anchor="_Toc220232044" w:history="1">
+          <w:hyperlink w:anchor="_Toc220235752" w:history="1">
             <w:r>
               <w:rPr>
                 <w:rStyle w:val="Lienhypertexte"/>
@@ -1136,7 +1136,7 @@
                 <w:noProof/>
                 <w:webHidden/>
               </w:rPr>
-              <w:instrText xml:space="preserve"> PAGEREF _Toc220232044 \h </w:instrText>
+              <w:instrText xml:space="preserve"> PAGEREF _Toc220235752 \h </w:instrText>
             </w:r>
             <w:r>
               <w:rPr>
@@ -1180,7 +1180,7 @@
               <w:sz w:val="24"/>
             </w:rPr>
           </w:pPr>
-          <w:hyperlink w:anchor="_Toc220232045" w:history="1">
+          <w:hyperlink w:anchor="_Toc220235753" w:history="1">
             <w:r>
               <w:rPr>
                 <w:rStyle w:val="Lienhypertexte"/>
@@ -1222,7 +1222,7 @@
                 <w:noProof/>
                 <w:webHidden/>
               </w:rPr>
-              <w:instrText xml:space="preserve"> PAGEREF _Toc220232045 \h </w:instrText>
+              <w:instrText xml:space="preserve"> PAGEREF _Toc220235753 \h </w:instrText>
             </w:r>
             <w:r>
               <w:rPr>
@@ -1266,7 +1266,7 @@
               <w:sz w:val="24"/>
             </w:rPr>
           </w:pPr>
-          <w:hyperlink w:anchor="_Toc220232046" w:history="1">
+          <w:hyperlink w:anchor="_Toc220235754" w:history="1">
             <w:r>
               <w:rPr>
                 <w:rStyle w:val="Lienhypertexte"/>
@@ -1308,7 +1308,7 @@
                 <w:noProof/>
                 <w:webHidden/>
               </w:rPr>
-              <w:instrText xml:space="preserve"> PAGEREF _Toc220232046 \h </w:instrText>
+              <w:instrText xml:space="preserve"> PAGEREF _Toc220235754 \h </w:instrText>
             </w:r>
             <w:r>
               <w:rPr>
@@ -1352,7 +1352,7 @@
               <w:sz w:val="24"/>
             </w:rPr>
           </w:pPr>
-          <w:hyperlink w:anchor="_Toc220232047" w:history="1">
+          <w:hyperlink w:anchor="_Toc220235755" w:history="1">
             <w:r>
               <w:rPr>
                 <w:rStyle w:val="Lienhypertexte"/>
@@ -1394,7 +1394,7 @@
                 <w:noProof/>
                 <w:webHidden/>
               </w:rPr>
-              <w:instrText xml:space="preserve"> PAGEREF _Toc220232047 \h </w:instrText>
+              <w:instrText xml:space="preserve"> PAGEREF _Toc220235755 \h </w:instrText>
             </w:r>
             <w:r>
               <w:rPr>
@@ -1438,7 +1438,7 @@
               <w:sz w:val="24"/>
             </w:rPr>
           </w:pPr>
-          <w:hyperlink w:anchor="_Toc220232048" w:history="1">
+          <w:hyperlink w:anchor="_Toc220235756" w:history="1">
             <w:r>
               <w:rPr>
                 <w:rStyle w:val="Lienhypertexte"/>
@@ -1480,7 +1480,7 @@
                 <w:noProof/>
                 <w:webHidden/>
               </w:rPr>
-              <w:instrText xml:space="preserve"> PAGEREF _Toc220232048 \h </w:instrText>
+              <w:instrText xml:space="preserve"> PAGEREF _Toc220235756 \h </w:instrText>
             </w:r>
             <w:r>
               <w:rPr>
@@ -1523,7 +1523,7 @@
               <w:sz w:val="24"/>
             </w:rPr>
           </w:pPr>
-          <w:hyperlink w:anchor="_Toc220232049" w:history="1">
+          <w:hyperlink w:anchor="_Toc220235757" w:history="1">
             <w:r>
               <w:rPr>
                 <w:rStyle w:val="Lienhypertexte"/>
@@ -1551,7 +1551,7 @@
                 <w:noProof/>
                 <w:webHidden/>
               </w:rPr>
-              <w:instrText xml:space="preserve"> PAGEREF _Toc220232049 \h </w:instrText>
+              <w:instrText xml:space="preserve"> PAGEREF _Toc220235757 \h </w:instrText>
             </w:r>
             <w:r>
               <w:rPr>
@@ -1594,7 +1594,7 @@
               <w:sz w:val="24"/>
             </w:rPr>
           </w:pPr>
-          <w:hyperlink w:anchor="_Toc220232050" w:history="1">
+          <w:hyperlink w:anchor="_Toc220235758" w:history="1">
             <w:r>
               <w:rPr>
                 <w:rStyle w:val="Lienhypertexte"/>
@@ -1622,7 +1622,7 @@
                 <w:noProof/>
                 <w:webHidden/>
               </w:rPr>
-              <w:instrText xml:space="preserve"> PAGEREF _Toc220232050 \h </w:instrText>
+              <w:instrText xml:space="preserve"> PAGEREF _Toc220235758 \h </w:instrText>
             </w:r>
             <w:r>
               <w:rPr>
@@ -1642,7 +1642,7 @@
                 <w:noProof/>
                 <w:webHidden/>
               </w:rPr>
-              <w:t>21</w:t>
+              <w:t>20</w:t>
             </w:r>
             <w:r>
               <w:rPr>
@@ -1697,7 +1697,7 @@
           <w:numId w:val="0"/>
         </w:numPr>
       </w:pPr>
-      <w:bookmarkStart w:id="0" w:name="_Toc220232034"/>
+      <w:bookmarkStart w:id="0" w:name="_Toc220235742"/>
       <w:r>
         <w:lastRenderedPageBreak/>
         <w:t>Remerciements</w:t>
@@ -1733,7 +1733,7 @@
           <w:numId w:val="0"/>
         </w:numPr>
       </w:pPr>
-      <w:bookmarkStart w:id="1" w:name="_Toc220232035"/>
+      <w:bookmarkStart w:id="1" w:name="_Toc220235743"/>
       <w:r>
         <w:lastRenderedPageBreak/>
         <w:t>Résumé</w:t>
@@ -1760,7 +1760,7 @@
       <w:pPr>
         <w:pStyle w:val="Titre1"/>
       </w:pPr>
-      <w:bookmarkStart w:id="2" w:name="_Toc220232036"/>
+      <w:bookmarkStart w:id="2" w:name="_Toc220235744"/>
       <w:r>
         <w:lastRenderedPageBreak/>
         <w:t>Présentation</w:t>
@@ -1904,7 +1904,7 @@
       <w:pPr>
         <w:pStyle w:val="Titre1"/>
       </w:pPr>
-      <w:bookmarkStart w:id="4" w:name="_Toc220232037"/>
+      <w:bookmarkStart w:id="4" w:name="_Toc220235745"/>
       <w:r>
         <w:lastRenderedPageBreak/>
         <w:t>Conception et Architecture Fonctionnelle</w:t>
@@ -2074,7 +2074,7 @@
       <w:pPr>
         <w:pStyle w:val="Titre2"/>
       </w:pPr>
-      <w:bookmarkStart w:id="5" w:name="_Toc220232038"/>
+      <w:bookmarkStart w:id="5" w:name="_Toc220235746"/>
       <w:r>
         <w:t>Détecteur de front</w:t>
       </w:r>
@@ -2401,7 +2401,7 @@
       <w:pPr>
         <w:pStyle w:val="Titre2"/>
       </w:pPr>
-      <w:bookmarkStart w:id="7" w:name="_Toc220232039"/>
+      <w:bookmarkStart w:id="7" w:name="_Toc220235747"/>
       <w:r>
         <w:lastRenderedPageBreak/>
         <w:t>Bascule D active sur front montant</w:t>
@@ -2572,7 +2572,7 @@
       <w:pPr>
         <w:pStyle w:val="Titre2"/>
       </w:pPr>
-      <w:bookmarkStart w:id="9" w:name="_Toc220232040"/>
+      <w:bookmarkStart w:id="9" w:name="_Toc220235748"/>
       <w:r>
         <w:t>Registre à changement parallèle (4bits)</w:t>
       </w:r>
@@ -2993,7 +2993,7 @@
       <w:pPr>
         <w:pStyle w:val="Titre2"/>
       </w:pPr>
-      <w:bookmarkStart w:id="11" w:name="_Toc220232041"/>
+      <w:bookmarkStart w:id="11" w:name="_Toc220235749"/>
       <w:r>
         <w:t>Stockage du code</w:t>
       </w:r>
@@ -3374,7 +3374,7 @@
       <w:pPr>
         <w:pStyle w:val="Titre2"/>
       </w:pPr>
-      <w:bookmarkStart w:id="14" w:name="_Toc220232042"/>
+      <w:bookmarkStart w:id="14" w:name="_Toc220235750"/>
       <w:r>
         <w:t>Affichage 7 segments</w:t>
       </w:r>
@@ -3626,7 +3626,7 @@
           <w:noProof/>
         </w:rPr>
         <w:drawing>
-          <wp:inline distT="0" distB="0" distL="0" distR="0" wp14:anchorId="3B8AE4D5" wp14:editId="6716B640">
+          <wp:inline distT="0" distB="0" distL="0" distR="0" wp14:anchorId="3B8AE4D5" wp14:editId="49C906E7">
             <wp:extent cx="5760720" cy="3105150"/>
             <wp:effectExtent l="0" t="0" r="0" b="0"/>
             <wp:docPr id="12" name="Image 12"/>
@@ -3710,7 +3710,7 @@
       <w:pPr>
         <w:pStyle w:val="Titre2"/>
       </w:pPr>
-      <w:bookmarkStart w:id="17" w:name="_Toc220232043"/>
+      <w:bookmarkStart w:id="17" w:name="_Toc220235751"/>
       <w:r>
         <w:t>Comparateur 4bits</w:t>
       </w:r>
@@ -4080,7 +4080,7 @@
           <w:rFonts w:eastAsia="Times New Roman"/>
         </w:rPr>
       </w:pPr>
-      <w:bookmarkStart w:id="19" w:name="_Toc220232044"/>
+      <w:bookmarkStart w:id="19" w:name="_Toc220235752"/>
       <w:r>
         <w:t>Comparateur 16 bits</w:t>
       </w:r>
@@ -4438,6 +4438,9 @@
         <w:jc w:val="center"/>
       </w:pPr>
       <w:r>
+        <w:rPr>
+          <w:noProof/>
+        </w:rPr>
         <w:lastRenderedPageBreak/>
         <w:drawing>
           <wp:inline distT="0" distB="0" distL="0" distR="0" wp14:anchorId="132BEF4A" wp14:editId="6252E0C2">
@@ -4524,7 +4527,7 @@
       <w:pPr>
         <w:pStyle w:val="Titre1"/>
       </w:pPr>
-      <w:bookmarkStart w:id="22" w:name="_Toc220232045"/>
+      <w:bookmarkStart w:id="22" w:name="_Toc220235753"/>
       <w:r>
         <w:t>Assemblage : Serrure électronique complète</w:t>
       </w:r>
@@ -4534,7 +4537,7 @@
       <w:pPr>
         <w:pStyle w:val="Titre2"/>
       </w:pPr>
-      <w:bookmarkStart w:id="23" w:name="_Toc220232046"/>
+      <w:bookmarkStart w:id="23" w:name="_Toc220235754"/>
       <w:r>
         <w:t>Fonctionnement top module</w:t>
       </w:r>
@@ -4573,7 +4576,7 @@
       <w:pPr>
         <w:pStyle w:val="Titre2"/>
       </w:pPr>
-      <w:bookmarkStart w:id="24" w:name="_Toc220232047"/>
+      <w:bookmarkStart w:id="24" w:name="_Toc220235755"/>
       <w:r>
         <w:t xml:space="preserve">Fonctionnement test </w:t>
       </w:r>
@@ -4635,7 +4638,7 @@
       <w:pPr>
         <w:pStyle w:val="Titre1"/>
       </w:pPr>
-      <w:bookmarkStart w:id="25" w:name="_Toc220232048"/>
+      <w:bookmarkStart w:id="25" w:name="_Toc220235756"/>
       <w:r>
         <w:t>Quartus prime</w:t>
       </w:r>
@@ -4823,6 +4826,9 @@
         <w:jc w:val="center"/>
       </w:pPr>
       <w:r>
+        <w:rPr>
+          <w:noProof/>
+        </w:rPr>
         <w:lastRenderedPageBreak/>
         <w:drawing>
           <wp:inline distT="0" distB="0" distL="0" distR="0" wp14:anchorId="02D06997" wp14:editId="1D6AE8B7">
@@ -4867,6 +4873,9 @@
         <w:jc w:val="center"/>
       </w:pPr>
       <w:r>
+        <w:rPr>
+          <w:noProof/>
+        </w:rPr>
         <w:drawing>
           <wp:inline distT="0" distB="0" distL="0" distR="0" wp14:anchorId="5E922863" wp14:editId="656E86C0">
             <wp:extent cx="5760720" cy="1753870"/>
@@ -4954,7 +4963,7 @@
           <w:rFonts w:eastAsia="Times New Roman"/>
         </w:rPr>
       </w:pPr>
-      <w:bookmarkStart w:id="27" w:name="_Toc220232049"/>
+      <w:bookmarkStart w:id="27" w:name="_Toc220235757"/>
       <w:r>
         <w:rPr>
           <w:rFonts w:eastAsia="Times New Roman"/>
@@ -5038,27 +5047,6 @@
         <w:rPr>
           <w:rStyle w:val="Lienhypertexte"/>
         </w:rPr>
-        <w:br w:type="page"/>
-      </w:r>
-    </w:p>
-    <w:p>
-      <w:pPr>
-        <w:spacing w:line="278" w:lineRule="auto"/>
-        <w:jc w:val="left"/>
-        <w:rPr>
-          <w:rFonts w:asciiTheme="majorHAnsi" w:eastAsia="Times New Roman" w:hAnsiTheme="majorHAnsi" w:cstheme="majorBidi"/>
-          <w:b/>
-          <w:color w:val="000000" w:themeColor="text1"/>
-          <w:sz w:val="28"/>
-          <w:szCs w:val="40"/>
-          <w:u w:val="single"/>
-        </w:rPr>
-      </w:pPr>
-      <w:r>
-        <w:rPr>
-          <w:rFonts w:eastAsia="Times New Roman"/>
-        </w:rPr>
-        <w:lastRenderedPageBreak/>
         <w:br w:type="page"/>
       </w:r>
     </w:p>
@@ -5073,7 +5061,7 @@
           <w:rFonts w:eastAsiaTheme="minorHAnsi"/>
         </w:rPr>
       </w:pPr>
-      <w:bookmarkStart w:id="28" w:name="_Toc220232050"/>
+      <w:bookmarkStart w:id="28" w:name="_Toc220235758"/>
       <w:r>
         <w:rPr>
           <w:rFonts w:eastAsia="Times New Roman"/>
@@ -6429,7 +6417,7 @@
         <v:path o:extrusionok="f" gradientshapeok="t" o:connecttype="rect"/>
         <o:lock v:ext="edit" aspectratio="t"/>
       </v:shapetype>
-      <v:shape id="_x0000_i1093" type="#_x0000_t75" style="width:11.25pt;height:11.25pt" o:bullet="t">
+      <v:shape id="_x0000_i1034" type="#_x0000_t75" style="width:14.4pt;height:14.4pt" o:bullet="t">
         <v:imagedata r:id="rId1" o:title="msoEA91"/>
       </v:shape>
     </w:pict>
@@ -7438,6 +7426,7 @@
   <w:style w:type="character" w:default="1" w:styleId="Policepardfaut">
     <w:name w:val="Default Paragraph Font"/>
     <w:uiPriority w:val="1"/>
+    <w:semiHidden/>
     <w:unhideWhenUsed/>
   </w:style>
   <w:style w:type="table" w:default="1" w:styleId="TableauNormal">

</xml_diff>